<commit_message>
Apresentação: mantém slides de fundamentos e do Capítulo 5 e o design original
Co-Authored-By: Claude Opus 5.5 <noreply@anthropic.com>
Claude-Session: https://claude.ai/code/session_01HxStpW4pQoDfJdTDYr6zEC
</commit_message>
<xml_diff>
--- a/apresentacao_qualificacao/ROTEIRO_DE_FALA_QUALIFICACAO.docx
+++ b/apresentacao_qualificacao/ROTEIRO_DE_FALA_QUALIFICACAO.docx
@@ -17,7 +17,7 @@
     </w:p>
     <w:p>
       <w:r>
-        <w:t>Como usar: o tempo de cada slide e o tempo acumulado ao lado servem de referência para o ensaio. O roteiro tem cerca de 1.900 palavras. Lido a 100 palavras por minuto, ritmo de quem fala com pausas, aponta para o slide e troca de tela, ocupa entre 19 e 20 minutos; lido depressa, cai para 15. Cronometre um ensaio completo. As frases são curtas para facilitar a leitura em voz alta; adapte livremente ao seu jeito de falar. Se o tempo apertar, os slides 2, 15 e 18 podem ser encurtados sem prejuízo do argumento.</w:t>
+        <w:t>Como usar: o tempo de cada slide e o tempo acumulado ao lado servem de referência para o ensaio. O tempo de cada slide foi estimado pela extensão do texto, em ritmo de fala pausado. Cronometre um ensaio completo e ajuste. As frases são curtas para facilitar a leitura em voz alta; adapte livremente ao seu jeito de falar. Os tempos foram calculados a 110 palavras por minuto, com 3 segundos por troca de slide. Se o tempo apertar, os slides 12, 13 e 18 podem ser passados rapidamente.</w:t>
       </w:r>
     </w:p>
     <w:tbl>
@@ -101,7 +101,7 @@
           </w:tcPr>
           <w:p>
             <w:r>
-              <w:t>0:30</w:t>
+              <w:t>0:34</w:t>
             </w:r>
           </w:p>
         </w:tc>
@@ -111,7 +111,7 @@
           </w:tcPr>
           <w:p>
             <w:r>
-              <w:t>00:30</w:t>
+              <w:t>0:34</w:t>
             </w:r>
           </w:p>
         </w:tc>
@@ -143,7 +143,7 @@
           </w:tcPr>
           <w:p>
             <w:r>
-              <w:t>0:20</w:t>
+              <w:t>0:19</w:t>
             </w:r>
           </w:p>
         </w:tc>
@@ -153,7 +153,7 @@
           </w:tcPr>
           <w:p>
             <w:r>
-              <w:t>00:50</w:t>
+              <w:t>0:53</w:t>
             </w:r>
           </w:p>
         </w:tc>
@@ -185,7 +185,7 @@
           </w:tcPr>
           <w:p>
             <w:r>
-              <w:t>1:15</w:t>
+              <w:t>1:18</w:t>
             </w:r>
           </w:p>
         </w:tc>
@@ -195,7 +195,7 @@
           </w:tcPr>
           <w:p>
             <w:r>
-              <w:t>02:05</w:t>
+              <w:t>2:11</w:t>
             </w:r>
           </w:p>
         </w:tc>
@@ -227,7 +227,7 @@
           </w:tcPr>
           <w:p>
             <w:r>
-              <w:t>1:00</w:t>
+              <w:t>0:58</w:t>
             </w:r>
           </w:p>
         </w:tc>
@@ -237,7 +237,7 @@
           </w:tcPr>
           <w:p>
             <w:r>
-              <w:t>03:05</w:t>
+              <w:t>3:09</w:t>
             </w:r>
           </w:p>
         </w:tc>
@@ -269,7 +269,7 @@
           </w:tcPr>
           <w:p>
             <w:r>
-              <w:t>1:00</w:t>
+              <w:t>0:45</w:t>
             </w:r>
           </w:p>
         </w:tc>
@@ -279,7 +279,7 @@
           </w:tcPr>
           <w:p>
             <w:r>
-              <w:t>04:05</w:t>
+              <w:t>3:54</w:t>
             </w:r>
           </w:p>
         </w:tc>
@@ -311,7 +311,7 @@
           </w:tcPr>
           <w:p>
             <w:r>
-              <w:t>1:00</w:t>
+              <w:t>0:46</w:t>
             </w:r>
           </w:p>
         </w:tc>
@@ -321,7 +321,7 @@
           </w:tcPr>
           <w:p>
             <w:r>
-              <w:t>05:05</w:t>
+              <w:t>4:40</w:t>
             </w:r>
           </w:p>
         </w:tc>
@@ -353,7 +353,7 @@
           </w:tcPr>
           <w:p>
             <w:r>
-              <w:t>1:00</w:t>
+              <w:t>0:46</w:t>
             </w:r>
           </w:p>
         </w:tc>
@@ -363,7 +363,7 @@
           </w:tcPr>
           <w:p>
             <w:r>
-              <w:t>06:05</w:t>
+              <w:t>5:26</w:t>
             </w:r>
           </w:p>
         </w:tc>
@@ -395,7 +395,7 @@
           </w:tcPr>
           <w:p>
             <w:r>
-              <w:t>1:15</w:t>
+              <w:t>0:50</w:t>
             </w:r>
           </w:p>
         </w:tc>
@@ -405,7 +405,7 @@
           </w:tcPr>
           <w:p>
             <w:r>
-              <w:t>07:20</w:t>
+              <w:t>6:16</w:t>
             </w:r>
           </w:p>
         </w:tc>
@@ -427,7 +427,7 @@
           </w:tcPr>
           <w:p>
             <w:r>
-              <w:t>O motor teórico: duas engrenagens e o fosso</w:t>
+              <w:t>Três componentes e os riscos a analisar</w:t>
             </w:r>
           </w:p>
         </w:tc>
@@ -437,7 +437,7 @@
           </w:tcPr>
           <w:p>
             <w:r>
-              <w:t>1:15</w:t>
+              <w:t>0:32</w:t>
             </w:r>
           </w:p>
         </w:tc>
@@ -447,7 +447,7 @@
           </w:tcPr>
           <w:p>
             <w:r>
-              <w:t>08:35</w:t>
+              <w:t>6:48</w:t>
             </w:r>
           </w:p>
         </w:tc>
@@ -469,7 +469,7 @@
           </w:tcPr>
           <w:p>
             <w:r>
-              <w:t>A revisão sistemática: questão e resposta</w:t>
+              <w:t>Três formulações, dois estatutos</w:t>
             </w:r>
           </w:p>
         </w:tc>
@@ -479,7 +479,7 @@
           </w:tcPr>
           <w:p>
             <w:r>
-              <w:t>1:15</w:t>
+              <w:t>0:21</w:t>
             </w:r>
           </w:p>
         </w:tc>
@@ -489,7 +489,7 @@
           </w:tcPr>
           <w:p>
             <w:r>
-              <w:t>09:50</w:t>
+              <w:t>7:09</w:t>
             </w:r>
           </w:p>
         </w:tc>
@@ -511,7 +511,7 @@
           </w:tcPr>
           <w:p>
             <w:r>
-              <w:t>Desenho: estudo de caso único, qualitativo</w:t>
+              <w:t>O motor teórico: duas engrenagens e o fosso</w:t>
             </w:r>
           </w:p>
         </w:tc>
@@ -521,7 +521,7 @@
           </w:tcPr>
           <w:p>
             <w:r>
-              <w:t>1:00</w:t>
+              <w:t>0:56</w:t>
             </w:r>
           </w:p>
         </w:tc>
@@ -531,7 +531,7 @@
           </w:tcPr>
           <w:p>
             <w:r>
-              <w:t>10:50</w:t>
+              <w:t>8:05</w:t>
             </w:r>
           </w:p>
         </w:tc>
@@ -553,7 +553,7 @@
           </w:tcPr>
           <w:p>
             <w:r>
-              <w:t>Como a categoria pode falhar</w:t>
+              <w:t>A tessitura: os fios que sustentam a tese</w:t>
             </w:r>
           </w:p>
         </w:tc>
@@ -563,7 +563,7 @@
           </w:tcPr>
           <w:p>
             <w:r>
-              <w:t>1:15</w:t>
+              <w:t>0:27</w:t>
             </w:r>
           </w:p>
         </w:tc>
@@ -573,7 +573,7 @@
           </w:tcPr>
           <w:p>
             <w:r>
-              <w:t>12:05</w:t>
+              <w:t>8:32</w:t>
             </w:r>
           </w:p>
         </w:tc>
@@ -595,7 +595,7 @@
           </w:tcPr>
           <w:p>
             <w:r>
-              <w:t>Mapa das políticas de educação digital</w:t>
+              <w:t>Onde os referenciais deixam de cobrir o caso</w:t>
             </w:r>
           </w:p>
         </w:tc>
@@ -605,7 +605,7 @@
           </w:tcPr>
           <w:p>
             <w:r>
-              <w:t>1:00</w:t>
+              <w:t>0:22</w:t>
             </w:r>
           </w:p>
         </w:tc>
@@ -615,7 +615,7 @@
           </w:tcPr>
           <w:p>
             <w:r>
-              <w:t>13:05</w:t>
+              <w:t>8:54</w:t>
             </w:r>
           </w:p>
         </w:tc>
@@ -637,7 +637,7 @@
           </w:tcPr>
           <w:p>
             <w:r>
-              <w:t>A promessa e o desenho</w:t>
+              <w:t>A revisão sistemática: questão e resposta</w:t>
             </w:r>
           </w:p>
         </w:tc>
@@ -647,7 +647,7 @@
           </w:tcPr>
           <w:p>
             <w:r>
-              <w:t>1:15</w:t>
+              <w:t>0:58</w:t>
             </w:r>
           </w:p>
         </w:tc>
@@ -657,7 +657,7 @@
           </w:tcPr>
           <w:p>
             <w:r>
-              <w:t>14:20</w:t>
+              <w:t>9:52</w:t>
             </w:r>
           </w:p>
         </w:tc>
@@ -679,7 +679,7 @@
           </w:tcPr>
           <w:p>
             <w:r>
-              <w:t>A antiga Pipa: trabalho, moradia e mar</w:t>
+              <w:t>Desenho: estudo de caso único, qualitativo</w:t>
             </w:r>
           </w:p>
         </w:tc>
@@ -689,7 +689,7 @@
           </w:tcPr>
           <w:p>
             <w:r>
-              <w:t>0:50</w:t>
+              <w:t>0:37</w:t>
             </w:r>
           </w:p>
         </w:tc>
@@ -699,7 +699,7 @@
           </w:tcPr>
           <w:p>
             <w:r>
-              <w:t>15:10</w:t>
+              <w:t>10:29</w:t>
             </w:r>
           </w:p>
         </w:tc>
@@ -721,7 +721,7 @@
           </w:tcPr>
           <w:p>
             <w:r>
-              <w:t>O antigo e o atual no mesmo mar</w:t>
+              <w:t>Como a categoria pode falhar</w:t>
             </w:r>
           </w:p>
         </w:tc>
@@ -731,7 +731,7 @@
           </w:tcPr>
           <w:p>
             <w:r>
-              <w:t>1:15</w:t>
+              <w:t>0:41</w:t>
             </w:r>
           </w:p>
         </w:tc>
@@ -741,7 +741,7 @@
           </w:tcPr>
           <w:p>
             <w:r>
-              <w:t>16:25</w:t>
+              <w:t>11:10</w:t>
             </w:r>
           </w:p>
         </w:tc>
@@ -763,7 +763,7 @@
           </w:tcPr>
           <w:p>
             <w:r>
-              <w:t>Na escola: o que existe e onde está</w:t>
+              <w:t>A agenda internacional: das presenças às condições</w:t>
             </w:r>
           </w:p>
         </w:tc>
@@ -773,7 +773,7 @@
           </w:tcPr>
           <w:p>
             <w:r>
-              <w:t>1:00</w:t>
+              <w:t>0:49</w:t>
             </w:r>
           </w:p>
         </w:tc>
@@ -783,7 +783,7 @@
           </w:tcPr>
           <w:p>
             <w:r>
-              <w:t>17:25</w:t>
+              <w:t>11:59</w:t>
             </w:r>
           </w:p>
         </w:tc>
@@ -805,7 +805,7 @@
           </w:tcPr>
           <w:p>
             <w:r>
-              <w:t>Onde estamos e o que falta</w:t>
+              <w:t>Mapa das políticas de educação digital</w:t>
             </w:r>
           </w:p>
         </w:tc>
@@ -815,7 +815,7 @@
           </w:tcPr>
           <w:p>
             <w:r>
-              <w:t>0:50</w:t>
+              <w:t>0:16</w:t>
             </w:r>
           </w:p>
         </w:tc>
@@ -825,7 +825,7 @@
           </w:tcPr>
           <w:p>
             <w:r>
-              <w:t>18:15</w:t>
+              <w:t>12:15</w:t>
             </w:r>
           </w:p>
         </w:tc>
@@ -847,7 +847,7 @@
           </w:tcPr>
           <w:p>
             <w:r>
-              <w:t>O que submeto à banca</w:t>
+              <w:t>O que essas experiências trazem para a tese</w:t>
             </w:r>
           </w:p>
         </w:tc>
@@ -857,7 +857,7 @@
           </w:tcPr>
           <w:p>
             <w:r>
-              <w:t>1:00</w:t>
+              <w:t>0:39</w:t>
             </w:r>
           </w:p>
         </w:tc>
@@ -867,7 +867,7 @@
           </w:tcPr>
           <w:p>
             <w:r>
-              <w:t>19:15</w:t>
+              <w:t>12:54</w:t>
             </w:r>
           </w:p>
         </w:tc>
@@ -889,7 +889,7 @@
           </w:tcPr>
           <w:p>
             <w:r>
-              <w:t>A questão aberta / Agradecimento</w:t>
+              <w:t>Quatro décadas até a PNED</w:t>
             </w:r>
           </w:p>
         </w:tc>
@@ -899,7 +899,7 @@
           </w:tcPr>
           <w:p>
             <w:r>
-              <w:t>0:45</w:t>
+              <w:t>0:32</w:t>
             </w:r>
           </w:p>
         </w:tc>
@@ -909,7 +909,7 @@
           </w:tcPr>
           <w:p>
             <w:r>
-              <w:t>20:00</w:t>
+              <w:t>13:26</w:t>
             </w:r>
           </w:p>
         </w:tc>
@@ -922,6 +922,384 @@
           <w:p>
             <w:r>
               <w:t>21</w:t>
+            </w:r>
+          </w:p>
+        </w:tc>
+        <w:tc>
+          <w:tcPr>
+            <w:tcW w:type="dxa" w:w="2351"/>
+          </w:tcPr>
+          <w:p>
+            <w:r>
+              <w:t>Por que a PNED importa</w:t>
+            </w:r>
+          </w:p>
+        </w:tc>
+        <w:tc>
+          <w:tcPr>
+            <w:tcW w:type="dxa" w:w="2351"/>
+          </w:tcPr>
+          <w:p>
+            <w:r>
+              <w:t>0:27</w:t>
+            </w:r>
+          </w:p>
+        </w:tc>
+        <w:tc>
+          <w:tcPr>
+            <w:tcW w:type="dxa" w:w="2351"/>
+          </w:tcPr>
+          <w:p>
+            <w:r>
+              <w:t>13:53</w:t>
+            </w:r>
+          </w:p>
+        </w:tc>
+      </w:tr>
+      <w:tr>
+        <w:tc>
+          <w:tcPr>
+            <w:tcW w:type="dxa" w:w="2351"/>
+          </w:tcPr>
+          <w:p>
+            <w:r>
+              <w:t>22</w:t>
+            </w:r>
+          </w:p>
+        </w:tc>
+        <w:tc>
+          <w:tcPr>
+            <w:tcW w:type="dxa" w:w="2351"/>
+          </w:tcPr>
+          <w:p>
+            <w:r>
+              <w:t>A PNED e o calendário da exigência</w:t>
+            </w:r>
+          </w:p>
+        </w:tc>
+        <w:tc>
+          <w:tcPr>
+            <w:tcW w:type="dxa" w:w="2351"/>
+          </w:tcPr>
+          <w:p>
+            <w:r>
+              <w:t>0:19</w:t>
+            </w:r>
+          </w:p>
+        </w:tc>
+        <w:tc>
+          <w:tcPr>
+            <w:tcW w:type="dxa" w:w="2351"/>
+          </w:tcPr>
+          <w:p>
+            <w:r>
+              <w:t>14:12</w:t>
+            </w:r>
+          </w:p>
+        </w:tc>
+      </w:tr>
+      <w:tr>
+        <w:tc>
+          <w:tcPr>
+            <w:tcW w:type="dxa" w:w="2351"/>
+          </w:tcPr>
+          <w:p>
+            <w:r>
+              <w:t>23</w:t>
+            </w:r>
+          </w:p>
+        </w:tc>
+        <w:tc>
+          <w:tcPr>
+            <w:tcW w:type="dxa" w:w="2351"/>
+          </w:tcPr>
+          <w:p>
+            <w:r>
+              <w:t>A promessa e o desenho</w:t>
+            </w:r>
+          </w:p>
+        </w:tc>
+        <w:tc>
+          <w:tcPr>
+            <w:tcW w:type="dxa" w:w="2351"/>
+          </w:tcPr>
+          <w:p>
+            <w:r>
+              <w:t>0:53</w:t>
+            </w:r>
+          </w:p>
+        </w:tc>
+        <w:tc>
+          <w:tcPr>
+            <w:tcW w:type="dxa" w:w="2351"/>
+          </w:tcPr>
+          <w:p>
+            <w:r>
+              <w:t>15:05</w:t>
+            </w:r>
+          </w:p>
+        </w:tc>
+      </w:tr>
+      <w:tr>
+        <w:tc>
+          <w:tcPr>
+            <w:tcW w:type="dxa" w:w="2351"/>
+          </w:tcPr>
+          <w:p>
+            <w:r>
+              <w:t>24</w:t>
+            </w:r>
+          </w:p>
+        </w:tc>
+        <w:tc>
+          <w:tcPr>
+            <w:tcW w:type="dxa" w:w="2351"/>
+          </w:tcPr>
+          <w:p>
+            <w:r>
+              <w:t>A antiga Pipa: trabalho, moradia e mar</w:t>
+            </w:r>
+          </w:p>
+        </w:tc>
+        <w:tc>
+          <w:tcPr>
+            <w:tcW w:type="dxa" w:w="2351"/>
+          </w:tcPr>
+          <w:p>
+            <w:r>
+              <w:t>0:31</w:t>
+            </w:r>
+          </w:p>
+        </w:tc>
+        <w:tc>
+          <w:tcPr>
+            <w:tcW w:type="dxa" w:w="2351"/>
+          </w:tcPr>
+          <w:p>
+            <w:r>
+              <w:t>15:36</w:t>
+            </w:r>
+          </w:p>
+        </w:tc>
+      </w:tr>
+      <w:tr>
+        <w:tc>
+          <w:tcPr>
+            <w:tcW w:type="dxa" w:w="2351"/>
+          </w:tcPr>
+          <w:p>
+            <w:r>
+              <w:t>25</w:t>
+            </w:r>
+          </w:p>
+        </w:tc>
+        <w:tc>
+          <w:tcPr>
+            <w:tcW w:type="dxa" w:w="2351"/>
+          </w:tcPr>
+          <w:p>
+            <w:r>
+              <w:t>A Pipa de hoje: um território conectado</w:t>
+            </w:r>
+          </w:p>
+        </w:tc>
+        <w:tc>
+          <w:tcPr>
+            <w:tcW w:type="dxa" w:w="2351"/>
+          </w:tcPr>
+          <w:p>
+            <w:r>
+              <w:t>0:50</w:t>
+            </w:r>
+          </w:p>
+        </w:tc>
+        <w:tc>
+          <w:tcPr>
+            <w:tcW w:type="dxa" w:w="2351"/>
+          </w:tcPr>
+          <w:p>
+            <w:r>
+              <w:t>16:26</w:t>
+            </w:r>
+          </w:p>
+        </w:tc>
+      </w:tr>
+      <w:tr>
+        <w:tc>
+          <w:tcPr>
+            <w:tcW w:type="dxa" w:w="2351"/>
+          </w:tcPr>
+          <w:p>
+            <w:r>
+              <w:t>26</w:t>
+            </w:r>
+          </w:p>
+        </w:tc>
+        <w:tc>
+          <w:tcPr>
+            <w:tcW w:type="dxa" w:w="2351"/>
+          </w:tcPr>
+          <w:p>
+            <w:r>
+              <w:t>Na escola: o que existe e onde está</w:t>
+            </w:r>
+          </w:p>
+        </w:tc>
+        <w:tc>
+          <w:tcPr>
+            <w:tcW w:type="dxa" w:w="2351"/>
+          </w:tcPr>
+          <w:p>
+            <w:r>
+              <w:t>0:46</w:t>
+            </w:r>
+          </w:p>
+        </w:tc>
+        <w:tc>
+          <w:tcPr>
+            <w:tcW w:type="dxa" w:w="2351"/>
+          </w:tcPr>
+          <w:p>
+            <w:r>
+              <w:t>17:12</w:t>
+            </w:r>
+          </w:p>
+        </w:tc>
+      </w:tr>
+      <w:tr>
+        <w:tc>
+          <w:tcPr>
+            <w:tcW w:type="dxa" w:w="2351"/>
+          </w:tcPr>
+          <w:p>
+            <w:r>
+              <w:t>27</w:t>
+            </w:r>
+          </w:p>
+        </w:tc>
+        <w:tc>
+          <w:tcPr>
+            <w:tcW w:type="dxa" w:w="2351"/>
+          </w:tcPr>
+          <w:p>
+            <w:r>
+              <w:t>Onde estamos e o que falta</w:t>
+            </w:r>
+          </w:p>
+        </w:tc>
+        <w:tc>
+          <w:tcPr>
+            <w:tcW w:type="dxa" w:w="2351"/>
+          </w:tcPr>
+          <w:p>
+            <w:r>
+              <w:t>0:22</w:t>
+            </w:r>
+          </w:p>
+        </w:tc>
+        <w:tc>
+          <w:tcPr>
+            <w:tcW w:type="dxa" w:w="2351"/>
+          </w:tcPr>
+          <w:p>
+            <w:r>
+              <w:t>17:34</w:t>
+            </w:r>
+          </w:p>
+        </w:tc>
+      </w:tr>
+      <w:tr>
+        <w:tc>
+          <w:tcPr>
+            <w:tcW w:type="dxa" w:w="2351"/>
+          </w:tcPr>
+          <w:p>
+            <w:r>
+              <w:t>28</w:t>
+            </w:r>
+          </w:p>
+        </w:tc>
+        <w:tc>
+          <w:tcPr>
+            <w:tcW w:type="dxa" w:w="2351"/>
+          </w:tcPr>
+          <w:p>
+            <w:r>
+              <w:t>O que submeto à banca</w:t>
+            </w:r>
+          </w:p>
+        </w:tc>
+        <w:tc>
+          <w:tcPr>
+            <w:tcW w:type="dxa" w:w="2351"/>
+          </w:tcPr>
+          <w:p>
+            <w:r>
+              <w:t>0:29</w:t>
+            </w:r>
+          </w:p>
+        </w:tc>
+        <w:tc>
+          <w:tcPr>
+            <w:tcW w:type="dxa" w:w="2351"/>
+          </w:tcPr>
+          <w:p>
+            <w:r>
+              <w:t>18:03</w:t>
+            </w:r>
+          </w:p>
+        </w:tc>
+      </w:tr>
+      <w:tr>
+        <w:tc>
+          <w:tcPr>
+            <w:tcW w:type="dxa" w:w="2351"/>
+          </w:tcPr>
+          <w:p>
+            <w:r>
+              <w:t>29</w:t>
+            </w:r>
+          </w:p>
+        </w:tc>
+        <w:tc>
+          <w:tcPr>
+            <w:tcW w:type="dxa" w:w="2351"/>
+          </w:tcPr>
+          <w:p>
+            <w:r>
+              <w:t>A questão aberta / Agradecimento</w:t>
+            </w:r>
+          </w:p>
+        </w:tc>
+        <w:tc>
+          <w:tcPr>
+            <w:tcW w:type="dxa" w:w="2351"/>
+          </w:tcPr>
+          <w:p>
+            <w:r>
+              <w:t>0:25</w:t>
+            </w:r>
+          </w:p>
+        </w:tc>
+        <w:tc>
+          <w:tcPr>
+            <w:tcW w:type="dxa" w:w="2351"/>
+          </w:tcPr>
+          <w:p>
+            <w:r>
+              <w:t>18:28</w:t>
+            </w:r>
+          </w:p>
+        </w:tc>
+      </w:tr>
+      <w:tr>
+        <w:tc>
+          <w:tcPr>
+            <w:tcW w:type="dxa" w:w="2351"/>
+          </w:tcPr>
+          <w:p>
+            <w:r>
+              <w:t>30</w:t>
             </w:r>
           </w:p>
         </w:tc>
@@ -962,12 +1340,12 @@
         <w:pStyle w:val="Heading2"/>
       </w:pPr>
       <w:r>
-        <w:t>Slide 1 – Título  (0:30; acumulado 00:30)</w:t>
+        <w:t>Slide 1 – Título  (0:34; acumulado 0:34)</w:t>
       </w:r>
     </w:p>
     <w:p>
       <w:r>
-        <w:t>Bom dia a todas e a todos. Agradeço à banca pela leitura cuidadosa e à minha orientadora, professora Maria Cristina Leandro de Paiva. Apresento hoje a qualificação da tese “A política no canteiro da prática”, que investiga como o eixo Educação Digital Escolar da Política Nacional de Educação Digital chega aos anos iniciais de uma escola pública de Pipa, em Tibau do Sul.</w:t>
+        <w:t>Bom dia a todas e a todos. Agradeço à banca pela leitura cuidadosa e à minha orientadora, professora Maria Cristina Leandro de Paiva. Apresento a qualificação da tese “A política no canteiro da prática”, sobre a chegada do eixo Educação Digital Escolar da PNED aos anos iniciais de uma escola pública de Pipa, em Tibau do Sul.</w:t>
       </w:r>
     </w:p>
     <w:p>
@@ -975,12 +1353,12 @@
         <w:pStyle w:val="Heading2"/>
       </w:pPr>
       <w:r>
-        <w:t>Slide 2 – Percurso da apresentação  (0:20; acumulado 00:50)</w:t>
+        <w:t>Slide 2 – Percurso da apresentação  (0:19; acumulado 0:53)</w:t>
       </w:r>
     </w:p>
     <w:p>
       <w:r>
-        <w:t>Organizei a fala em seis partes: a proposta da tese, a revisão sistemática, a metodologia, a análise da agenda internacional e da PNED, o território e a escola, e, por fim, o que ainda falta e as questões que trago para a banca.</w:t>
+        <w:t>A fala tem seis partes: a proposta da tese, a revisão sistemática, a metodologia, a agenda internacional e a PNED, o território e a escola, e o que ainda falta.</w:t>
       </w:r>
     </w:p>
     <w:p>
@@ -988,12 +1366,12 @@
         <w:pStyle w:val="Heading2"/>
       </w:pPr>
       <w:r>
-        <w:t>Slide 3 – A tese em uma imagem: o vazio material  (1:15; acumulado 02:05)</w:t>
+        <w:t>Slide 3 – A tese em uma imagem: o vazio material  (1:18; acumulado 2:11)</w:t>
       </w:r>
     </w:p>
     <w:p>
       <w:r>
-        <w:t>Começo pela síntese. O objeto é a implementação do eixo Educação Digital Escolar nas turmas de 1º e 2º anos da Escola Municipal Domitila Castelo. A Lei nº 14.533, de 2023, fez da educação digital um direito, um dever do Estado e, depois da derrubada do veto, um componente curricular. O problema está na distância entre esse direito declarado e os meios garantidos: formação específica, infraestrutura de rede e tempo de planejamento não estão assegurados pela norma e acabam sendo construídos no dia a dia da escola. Daí a questão norteadora, que está no slide: como ocorre a implementação desse eixo, considerando os processos de interpretação, tradução e recontextualização feitos pelos profissionais da educação no contexto da prática. A imagem é ilustrativa e foi gerada por inteligência artificial, como indica a fonte; não é registro de campo.</w:t>
+        <w:t>Começo pela síntese. O objeto é a implementação do eixo Educação Digital Escolar nas turmas de 1º e 2º anos da Escola Municipal Domitila Castelo. A Lei nº 14.533, de 2023, fez da educação digital um direito, um dever do Estado e um componente curricular. O problema está na distância entre esse direito e os meios garantidos: formação, rede e tempo de planejamento não estão assegurados pela norma e acabam sendo construídos no dia a dia da escola. Daí a questão norteadora: como ocorre essa implementação, considerando a interpretação, a tradução e a recontextualização feitas pelos profissionais no contexto da prática. A imagem é ilustrativa e foi gerada por inteligência artificial. Dito de outro modo, a tese pergunta o que acontece com uma política quando o direito chega antes dos meios, e quem, na escola, ocupa esse intervalo.</w:t>
       </w:r>
     </w:p>
     <w:p>
@@ -1001,12 +1379,12 @@
         <w:pStyle w:val="Heading2"/>
       </w:pPr>
       <w:r>
-        <w:t>Slide 4 – Trajetória: de onde parto  (1:00; acumulado 03:05)</w:t>
+        <w:t>Slide 4 – Trajetória: de onde parto  (0:58; acumulado 3:09)</w:t>
       </w:r>
     </w:p>
     <w:p>
       <w:r>
-        <w:t>Preciso dizer de onde falo. Convivo com Pipa há quase duas décadas e trabalhei dezoito anos na rede municipal de Tibau do Sul. No mestrado, fiz uma pesquisa-ação na mesma escola, durante o ensino remoto, e 70% das crianças da turma dividiam o celular com os pais. A tese continua esse percurso, agora diante da PNED. Essa proximidade traz conhecimento do lugar, mas também riscos. Por isso fixei uma regra de método: a memória não é dado. A trajetória orienta o olhar; as evidências virão dos instrumentos, e o diário de campo registra o percurso sem se tornar uma quinta fonte.</w:t>
+        <w:t>Falo de dentro. Convivo com Pipa há quase duas décadas, trabalhei dezoito anos na rede municipal e fiz o mestrado na mesma escola, no ensino remoto, quando 70% das crianças dividiam o celular com os pais. Por isso fixei uma regra: a memória não é dado. A trajetória orienta o olhar; as evidências vêm dos instrumentos. O diário de campo registra o percurso, mas não é uma quinta fonte. Como o município é um dos entes a quem a lei distribui a provisão dos meios, preciso também cuidar para que minha posição não limite a liberdade dos participantes nas entrevistas.</w:t>
       </w:r>
     </w:p>
     <w:p>
@@ -1014,12 +1392,12 @@
         <w:pStyle w:val="Heading2"/>
       </w:pPr>
       <w:r>
-        <w:t>Slide 5 – O objeto e o recorte  (1:00; acumulado 04:05)</w:t>
+        <w:t>Slide 5 – O objeto e o recorte  (0:45; acumulado 3:54)</w:t>
       </w:r>
     </w:p>
     <w:p>
       <w:r>
-        <w:t>Escolhi o 1º e o 2º anos porque, nessas turmas, a mesma professora acompanha as crianças durante toda a jornada. Se a educação digital acontece ou não, a decisão tem autoria identificável, o que torna a categoria que proponho mais fácil de confirmar ou de recusar. É também a entrada no Ensino Fundamental, quando as crianças trazem experiências digitais muito desiguais e familiaridade com o aparelho ainda não significa compreensão crítica. O território e as condições da escola entram como dimensões do contexto da prática, e as narrativas dos profissionais são o caminho principal. Ficam de fora a avaliação da aprendizagem e a observação de aulas; plataformização e governança de dados entram apenas como contexto.</w:t>
+        <w:t>Escolhi o 1º e o 2º anos porque a mesma professora acompanha a turma o dia todo, e a decisão sobre a educação digital tem autoria identificável. É também a entrada no Ensino Fundamental, com crianças de experiências digitais muito desiguais. Ficam de fora a avaliação da aprendizagem e a observação de aulas; plataformização e dados entram só como contexto. As crianças não participam da produção de dados; suas experiências chegam pelas condições que os profissionais encontram.</w:t>
       </w:r>
     </w:p>
     <w:p>
@@ -1027,12 +1405,12 @@
         <w:pStyle w:val="Heading2"/>
       </w:pPr>
       <w:r>
-        <w:t>Slide 6 – Do portão para fora, do portão para dentro  (1:00; acumulado 05:05)</w:t>
+        <w:t>Slide 6 – Do portão para fora, do portão para dentro  (0:46; acumulado 4:40)</w:t>
       </w:r>
     </w:p>
     <w:p>
       <w:r>
-        <w:t>Este slide resume a problematização. Do portão para fora, Pipa é um polo turístico conectado: pousadas, restaurantes e passeios são vendidos pela internet. Do portão para dentro, o laboratório da escola aparece com os computadores desligados no momento do registro, e nas salas de 1º e 2º anos não fotografei nenhum dispositivo digital. O mesmo território abriga circuitos econômicos de alta conectividade e uma escola pública que não dispõe desses recursos nas mesmas condições. Os dados nacionais apontam na mesma direção: a conexão chegou à maioria das escolas, mas os computadores para os alunos não cresceram na mesma medida.</w:t>
+        <w:t>Do portão para fora, Pipa vende hospedagem e passeios pela internet. Do portão para dentro, o laboratório aparece com os computadores desligados e as salas de 1º e 2º anos não têm nenhum dispositivo. O mesmo território reúne alta conectividade e uma escola sem esses recursos nas mesmas condições. Os dados nacionais apontam na mesma direção: a conexão chegou à maioria das escolas brasileiras, mas os computadores para os alunos não cresceram na mesma medida, sobretudo nas escolas rurais.</w:t>
       </w:r>
     </w:p>
     <w:p>
@@ -1040,12 +1418,12 @@
         <w:pStyle w:val="Heading2"/>
       </w:pPr>
       <w:r>
-        <w:t>Slide 7 – Questão norteadora e objetivos  (1:00; acumulado 06:05)</w:t>
+        <w:t>Slide 7 – Questão norteadora e objetivos  (0:46; acumulado 5:26)</w:t>
       </w:r>
     </w:p>
     <w:p>
       <w:r>
-        <w:t>O objetivo geral é analisar a implementação do eixo considerando a norma, as condições institucionais e territoriais e o trabalho de interpretação dos profissionais. Ele se desdobra em três objetivos específicos, que seguem a ordem da análise. O primeiro pergunta o que a política promete e com que meios, e corresponde ao Capítulo 5. O segundo pergunta que condições recebem a política em Pipa, e corresponde ao Capítulo 6. O terceiro pergunta o que os profissionais fazem com a distância entre a norma e as condições, e será respondido no Capítulo 7, depois do campo.</w:t>
+        <w:t>Os três objetivos específicos seguem a ordem da análise: o que a política promete e com que meios, no Capítulo 5; que condições recebem a política em Pipa, no Capítulo 6; e o que os profissionais fazem com a distância entre a norma e as condições, no Capítulo 7, depois do campo. O objetivo geral reúne os três: analisar a implementação do eixo considerando a norma, as condições institucionais e territoriais e o trabalho de interpretação dos profissionais.</w:t>
       </w:r>
     </w:p>
     <w:p>
@@ -1053,12 +1431,12 @@
         <w:pStyle w:val="Heading2"/>
       </w:pPr>
       <w:r>
-        <w:t>Slide 8 – Contribuição inédita: discricionariedade substitutiva  (1:15; acumulado 07:20)</w:t>
+        <w:t>Slide 8 – Contribuição inédita: discricionariedade substitutiva  (0:50; acumulado 6:16)</w:t>
       </w:r>
     </w:p>
     <w:p>
       <w:r>
-        <w:t>Chego à contribuição que proponho. Lipsky descreve a discricionariedade de quem atende o público diante de recursos escassos: há uma fila, um revezamento, um racionamento, e a decisão é sobre quem recebe. Em Pipa, a situação pode ser outra. Quando a política declara o direito e não faz chegar os meios, a decisão pode recair sobre aquilo que não existe. A profissional supre com aparelho, internet, material, conhecimento ou tempo próprios uma condição que a política anunciou. Mudam o objeto da decisão e quem arca com o custo. Chamo isso de discricionariedade substitutiva. Trata-se, por enquanto, de uma proposição, e não de um achado: ela será examinada nas narrativas, com critérios fixados antes do campo.</w:t>
+        <w:t>Lipsky descreve a discricionariedade diante de recursos escassos: fila, revezamento, racionamento; decide-se quem recebe. Em Pipa pode ser diferente. Quando o direito é declarado e os meios não chegam, a decisão pode recair sobre o que não existe, e a profissional supre a falta com aparelho, internet, material, conhecimento ou tempo próprios. Mudam o objeto da decisão e quem paga por ela. É uma proposição, e não um achado. Por isso fixei, antes de qualquer entrevista, as condições em que terei de confirmá-la, delimitá-la, renomeá-la ou abandoná-la.</w:t>
       </w:r>
     </w:p>
     <w:p>
@@ -1066,12 +1444,12 @@
         <w:pStyle w:val="Heading2"/>
       </w:pPr>
       <w:r>
-        <w:t>Slide 9 – O motor teórico: duas engrenagens e o fosso  (1:15; acumulado 08:35)</w:t>
+        <w:t>Slide 9 – Três componentes e os riscos a analisar  (0:32; acumulado 6:48)</w:t>
       </w:r>
     </w:p>
     <w:p>
       <w:r>
-        <w:t>O quadro teórico tem duas engrenagens. A Abordagem do Ciclo de Políticas, de Bowe, Ball e Gold e de Mainardes, mostra que a política é recriada no contexto da prática. A teoria da burocracia de nível de rua, de Lipsky, mostra que a decisão de quem está na ponta acaba sendo a política praticada. O encaixe entre elas é a recontextualização, categoria integradora da tese. O fosso aparece porque as duas supõem que os meios existem: a ACP pensa a recriação em relação aos meios disponíveis, e Lipsky pensa o racionamento de um serviço que existe. Nenhuma das duas dá nome à decisão sobre o que não existe, e é nesse fosso que situo a contribuição.</w:t>
+        <w:t>A categoria tem três componentes: não há recurso a distribuir; há substituição com meios próprios; e há custo pessoal, assumido diante de crianças e famílias que a professora reencontra no território. Os riscos, como a variação do eixo entre turmas e o uso de aparelhos pessoais com crianças, serão analisados, e não presumidos.</w:t>
       </w:r>
     </w:p>
     <w:p>
@@ -1079,12 +1457,12 @@
         <w:pStyle w:val="Heading2"/>
       </w:pPr>
       <w:r>
-        <w:t>Slide 10 – A revisão sistemática: questão e resposta  (1:15; acumulado 09:50)</w:t>
+        <w:t>Slide 10 – Três formulações, dois estatutos  (0:21; acumulado 7:09)</w:t>
       </w:r>
     </w:p>
     <w:p>
       <w:r>
-        <w:t>A revisão sistemática seguiu a declaração PRISMA 2020 em sete bases e chegou a nove estudos, entre 176 registros identificados. A resposta é que a atuação dessas políticas nos anos iniciais depende da articulação entre recursos, condições institucionais e trabalho dos profissionais, que interpretam a política no cotidiano. A evidência é convergente sobre as condições e o papel dos profissionais, e frágil sobre cultura digital e cidadania. O mais importante para a tese está no que o corpus não examina: nenhum estudo trata da PNED, apenas um delimita o ciclo de alfabetização, nenhum trata de rede municipal de pequeno porte, e nenhum acompanha o que os profissionais fazem quando a formação não chega.</w:t>
+        <w:t>A tese trabalha com três formulações, mas com estatutos diferentes. Habitar digital e rugosidade tecnológica são condições documentadas no Capítulo 6. A discricionariedade substitutiva é uma hipótese, a única em jogo nas entrevistas.</w:t>
       </w:r>
     </w:p>
     <w:p>
@@ -1092,12 +1470,12 @@
         <w:pStyle w:val="Heading2"/>
       </w:pPr>
       <w:r>
-        <w:t>Slide 11 – Desenho: estudo de caso único, qualitativo  (1:00; acumulado 10:50)</w:t>
+        <w:t>Slide 11 – O motor teórico: duas engrenagens e o fosso  (0:56; acumulado 8:05)</w:t>
       </w:r>
     </w:p>
     <w:p>
       <w:r>
-        <w:t>O desenho é um estudo de caso único, qualitativo e interpretativo, com Yin e André, analisado pela análise temática reflexiva de Braun e Clarke. São quatro fontes. O registro iconográfico já foi feito: são 38 figuras, contando a fotografia atual do pescador incluída nesta revisão. Os documentos administrativos e de aquisição ainda serão analisados. O questionário de perfil e as entrevistas semiestruturadas, em cinco eixos, serão aplicados depois da aprovação da emenda pelo Comitê de Ética. Os documentos pedagógicos e os registros de formação serão solicitados à escola e à Secretaria.</w:t>
+        <w:t>O quadro teórico tem duas engrenagens. O Ciclo de Políticas mostra que a política é recriada no contexto da prática; Lipsky mostra que a decisão na ponta vira a política praticada. O encaixe é a recontextualização. O fosso aparece porque as duas supõem que os meios existem, e nenhuma nomeia a decisão sobre o que não existe. É aí que situo a contribuição. A ACP pensa a recriação da política em relação aos meios disponíveis; Lipsky, o racionamento de um serviço que existe. Quando o meio simplesmente não chega, falta nome para a decisão que se toma.</w:t>
       </w:r>
     </w:p>
     <w:p>
@@ -1105,12 +1483,12 @@
         <w:pStyle w:val="Heading2"/>
       </w:pPr>
       <w:r>
-        <w:t>Slide 12 – Como a categoria pode falhar  (1:15; acumulado 12:05)</w:t>
+        <w:t>Slide 12 – A tessitura: os fios que sustentam a tese  (0:27; acumulado 8:32)</w:t>
       </w:r>
     </w:p>
     <w:p>
       <w:r>
-        <w:t>Como a categoria é nova, ela precisa poder falhar. Registrei os critérios antes da primeira entrevista. Ela se confirma se os três componentes aparecerem juntos, de forma recorrente e sem indução, numa parte expressiva dos doze participantes. Fica delimitada se aparecer apenas na regência. Muda de nome se houver substituição sem alternativa, porque aí se trata de transferência de custo, e não de margem de decisão. E será recusada se as narrativas descreverem fila ou revezamento pelo kit multimídia, se descreverem a lei apenas como ambígua ou se não houver relato recorrente de meios próprios. No Capítulo 7, direi qual dessas situações se verificou. Recusar a categoria também será um resultado.</w:t>
+        <w:t>Este slide mostra onde cada frente teórica sustenta os capítulos: política como processo, decisão na ponta, território e lugar, com Santos e Massey, cultura e tempo, condições de trabalho e posição de método. Zuboff e Morozov entram como contexto, e não como objeto empírico.</w:t>
       </w:r>
     </w:p>
     <w:p>
@@ -1118,12 +1496,12 @@
         <w:pStyle w:val="Heading2"/>
       </w:pPr>
       <w:r>
-        <w:t>Slide 13 – Mapa das políticas de educação digital  (1:00; acumulado 13:05)</w:t>
+        <w:t>Slide 13 – Onde os referenciais deixam de cobrir o caso  (0:22; acumulado 8:54)</w:t>
       </w:r>
     </w:p>
     <w:p>
       <w:r>
-        <w:t>No Capítulo 5, li dezenove experiências na Europa e nas Américas, sem buscar modelos para importar. O objetivo foi construir cinco categorias sensibilizadoras: governança, formação, infraestrutura, continuidade institucional e cultura digital. As lições se repetem. Equalizar equipamentos não equalizou os usos, como na Itália e nos Países Baixos. Distribuir laptops não resolveu a aprendizagem nem a conexão rural, como no Peru e na Colômbia. A continuidade separa trajetórias: o Ceibal atravessou governos, e a Argentina teve três reversões em quinze anos. Essas categorias funcionam como lentes para o campo, e não como padrões.</w:t>
+        <w:t>Em resumo: o Ciclo de Políticas supõe que os meios existam; Lipsky pensou em serviços de atendimento em massa. Em Pipa, não há dispositivos para racionar, e a decisão acontece diante de famílias conhecidas.</w:t>
       </w:r>
     </w:p>
     <w:p>
@@ -1131,12 +1509,12 @@
         <w:pStyle w:val="Heading2"/>
       </w:pPr>
       <w:r>
-        <w:t>Slide 14 – A promessa e o desenho  (1:15; acumulado 14:20)</w:t>
+        <w:t>Slide 14 – A revisão sistemática: questão e resposta  (0:58; acumulado 9:52)</w:t>
       </w:r>
     </w:p>
     <w:p>
       <w:r>
-        <w:t>Chego ao achado central da análise da lei. A PNED se define como instância de articulação, que não substitui outras políticas. O eixo de inclusão digital, no qual está a conectividade das escolas, deve ser desenvolvido dentro dos limites orçamentários de cada órgão. As fontes de recursos são dotações dos entes, doações, FUST e Funttel, sem fundo próprio nem transferência obrigatória aos municípios. A formação de professores aparece como ação de promoção, sem responsáveis, prazos ou custeio. A esse desenho dou o nome de vazio material: a exigência curricular tem data marcada, 2026, e os meios não têm. Reconheço também os méritos da lei, que deu à educação digital o estatuto de política nacional.</w:t>
+        <w:t>A revisão seguiu a PRISMA 2020 em sete bases e chegou a nove estudos. A atuação dessas políticas depende da articulação entre recursos, condições institucionais e trabalho dos profissionais. A evidência é forte sobre as condições e os profissionais, e frágil sobre cultura digital e cidadania. Nenhum estudo trata da PNED nem de rede municipal de pequeno porte, e nenhum acompanha o que os profissionais fazem quando a formação não chega. Esses vazios são esperados, porque a norma é recente e a implementação curricular só se tornou obrigatória em 2026, mas são eles que dão lugar ao objeto desta tese.</w:t>
       </w:r>
     </w:p>
     <w:p>
@@ -1144,12 +1522,12 @@
         <w:pStyle w:val="Heading2"/>
       </w:pPr>
       <w:r>
-        <w:t>Slide 15 – A antiga Pipa: trabalho, moradia e mar  (0:50; acumulado 15:10)</w:t>
+        <w:t>Slide 15 – Desenho: estudo de caso único, qualitativo  (0:37; acumulado 10:29)</w:t>
       </w:r>
     </w:p>
     <w:p>
       <w:r>
-        <w:t>O Capítulo 6 começa pelo território. As imagens do Museu Digital de Pipa mostram uma organização em que trabalho, moradia e mar estavam próximos: o barco construído junto às casas, as embarcações na maré baixa, o mutirão do curral e o cruzeiro na falésia. Com Santos, leio o território usado e as rugosidades, isto é, as formas que permanecem do passado. Com Massey, evito a nostalgia que congelaria a vila de pescadores num passado idealizado.</w:t>
+        <w:t>É um estudo de caso único e qualitativo, com análise temática reflexiva. O registro iconográfico, com 38 figuras, já foi feito; os documentos, o questionário e as entrevistas vêm depois da emenda aprovada pelo Comitê de Ética. Serão doze participantes: seis professoras em regência, quatro da coordenação, uma pessoa da direção e uma da Secretaria, posições postas em relação, sem hierarquia prévia.</w:t>
       </w:r>
     </w:p>
     <w:p>
@@ -1157,12 +1535,12 @@
         <w:pStyle w:val="Heading2"/>
       </w:pPr>
       <w:r>
-        <w:t>Slide 16 – O antigo e o atual no mesmo mar  (1:15; acumulado 16:25)</w:t>
+        <w:t>Slide 16 – Como a categoria pode falhar  (0:41; acumulado 11:10)</w:t>
       </w:r>
     </w:p>
     <w:p>
       <w:r>
-        <w:t>Esta é a novidade da revisão. As imagens históricas e os passeios turísticos da baía poderiam sugerir que o turismo ocupou o lugar da pesca. Para verificar isso no presente, incluí um registro atual: um pescador descarregando o pescado na enseada, de costas para a câmera, com lanchas e escunas de passeio ao fundo. A pesca não foi substituída; ela divide o mesmo mar com o turismo. O próprio barco mostra a sobreposição: a embarcação de madeira recebeu um motor de popa. A foto prova presença, e não escala; não diz quantas famílias vivem da pesca. Para a escola, isso significa crianças com relações muito diferentes com o mar, com o trabalho e com as tecnologias, diante de uma política que prevê um único eixo para todas.</w:t>
+        <w:t>Os critérios foram registrados antes do campo. A categoria se confirma com recorrência e sem indução; fica delimitada se aparecer só na regência; muda de nome se não houver alternativa, porque aí é transferência de custo; e é recusada se houver fila pelo kit multimídia, leitura da lei apenas como ambígua ou ausência de meios próprios. Recusar também é resultado. No Capítulo 7, direi qual dessas situações se verificou.</w:t>
       </w:r>
     </w:p>
     <w:p>
@@ -1170,12 +1548,12 @@
         <w:pStyle w:val="Heading2"/>
       </w:pPr>
       <w:r>
-        <w:t>Slide 17 – Na escola: o que existe e onde está  (1:00; acumulado 17:25)</w:t>
+        <w:t>Slide 17 – A agenda internacional: das presenças às condições  (0:49; acumulado 11:59)</w:t>
       </w:r>
     </w:p>
     <w:p>
       <w:r>
-        <w:t>Dentro da escola, o que existe está distribuído de forma desigual. O laboratório, que segundo informações preliminares foi montado pela Prefeitura em 2022, aparecia com os computadores desligados no registro. Também como informação preliminar, a escola teria duas conexões, uma administrativa e outra educacional, paga com a verba da PIEC, e um único kit multimídia para todas as turmas. Nas salas de 1º e 2º anos não havia nenhum dispositivo digital; predominam recursos impressos e feitos à mão. Chamo isso de rugosidade tecnológica e de habitar digital, e todas essas informações preliminares serão verificadas na análise documental.</w:t>
+        <w:t>No Capítulo 5, começo pelos organismos internacionais. A UNESCO lembra que uma em cada quatro escolas primárias do mundo não tem eletricidade; a OCDE considera misto o impacto dos computadores sobre o desempenho; o Banco Mundial pergunta qual é o problema educacional antes da tecnologia. Os três tiram o foco da presença dos recursos e o colocam nas condições de uso. Esses documentos não chegam ao Brasil como aplicação automática; entre o que formulam e o que cada país incorpora há disputa e reinterpretação.</w:t>
       </w:r>
     </w:p>
     <w:p>
@@ -1183,12 +1561,12 @@
         <w:pStyle w:val="Heading2"/>
       </w:pPr>
       <w:r>
-        <w:t>Slide 18 – Onde estamos e o que falta  (0:50; acumulado 18:15)</w:t>
+        <w:t>Slide 18 – Mapa das políticas de educação digital  (0:16; acumulado 12:15)</w:t>
       </w:r>
     </w:p>
     <w:p>
       <w:r>
-        <w:t>Os Capítulos 2, 4 e 5 estão construídos; o 6 está em boa parte escrito; o 3 está em construção. Antes do campo, faltam a aprovação da emenda pelo Comitê de Ética, a assinatura datada dos critérios da categoria e a análise documental: aquisição do laboratório, conectividade, cadernos de uso, prestação de contas da PIEC, Censo Escolar e testes de velocidade nas salas. O campo está planejado para dez semanas, e o Capítulo 7 já está estruturado.</w:t>
+        <w:t>Li dezenove experiências na Europa e nas Américas, sem buscar modelos para importar. A cor indica a categoria que cada experiência mais informa.</w:t>
       </w:r>
     </w:p>
     <w:p>
@@ -1196,12 +1574,12 @@
         <w:pStyle w:val="Heading2"/>
       </w:pPr>
       <w:r>
-        <w:t>Slide 19 – O que submeto à banca  (1:00; acumulado 19:15)</w:t>
+        <w:t>Slide 19 – O que essas experiências trazem para a tese  (0:39; acumulado 12:54)</w:t>
       </w:r>
     </w:p>
     <w:p>
       <w:r>
-        <w:t>Trago quatro questões para a banca. Primeira: o critério de confirmação fala em uma parte expressiva dos doze participantes; ele precisa de um limiar numérico explícito? Segunda: o custo sob visibilidade direta pode ser sustentado apenas por narrativas, sem observação? Terceira: como direção e Secretaria têm um participante cada, descrever essas posições sem generalizar basta para examinar a delimitação? E quarta: os critérios para tratar a formação como condição ausente estão adequados?</w:t>
+        <w:t>Delas saem cinco categorias sensibilizadoras: governança, formação, infraestrutura, continuidade institucional e cultura digital. Equalizar equipamentos não equalizou usos; laptops não resolveram a conexão rural; a continuidade separou o Ceibal das reversões argentinas. Cada categoria vira uma pergunta para o campo em Pipa. Que formação chegou à escola? Com que equipamentos se trabalha? Que continuidade a rede teve? Nenhuma dessas lições descreve Pipa; elas servem de lente.</w:t>
       </w:r>
     </w:p>
     <w:p>
@@ -1209,12 +1587,12 @@
         <w:pStyle w:val="Heading2"/>
       </w:pPr>
       <w:r>
-        <w:t>Slide 20 – A questão aberta / Agradecimento  (0:45; acumulado 20:00)</w:t>
+        <w:t>Slide 20 – Quatro décadas até a PNED  (0:32; acumulado 13:26)</w:t>
       </w:r>
     </w:p>
     <w:p>
       <w:r>
-        <w:t>Encerro com a pergunta que move a tese. A política fez da educação digital um direito e deixou os meios na dependência de cada ente. Quando o equipamento e a formação não chegam, quem paga, no silêncio do cotidiano escolar, o preço dessa ausência? E o que isso significa para os direitos que a lei prometeu às crianças? Muito obrigada. Fico à disposição para as contribuições da banca.</w:t>
+        <w:t>No Brasil, do EDUCOM à PNED, as ênfases mudaram, mas as tensões se repetem: manutenção, suporte, reposição, conectividade desigual e cultura digital sem componente próprio. Cada programa deixou equipamentos nas escolas. Parte deles continua lá depois do fim das ações, o que liga essa trajetória à noção de rugosidade que discuto no Capítulo 6.</w:t>
       </w:r>
     </w:p>
     <w:p>
@@ -1222,7 +1600,124 @@
         <w:pStyle w:val="Heading2"/>
       </w:pPr>
       <w:r>
-        <w:t>Slide 21 – Referências  (—; acumulado —)</w:t>
+        <w:t>Slide 21 – Por que a PNED importa  (0:27; acumulado 13:53)</w:t>
+      </w:r>
+    </w:p>
+    <w:p>
+      <w:r>
+        <w:t>A lei tem méritos: deu à educação digital estatuto de política nacional, tornou-a componente curricular e dever do Estado e ligou-a aos direitos das crianças. Uma de suas melhores passagens pede que a tecnologia fortaleça o papel de quem ensina e de quem aprende.</w:t>
+      </w:r>
+    </w:p>
+    <w:p>
+      <w:pPr>
+        <w:pStyle w:val="Heading2"/>
+      </w:pPr>
+      <w:r>
+        <w:t>Slide 22 – A PNED e o calendário da exigência  (0:19; acumulado 14:12)</w:t>
+      </w:r>
+    </w:p>
+    <w:p>
+      <w:r>
+        <w:t>O calendário mostra a pressa da exigência: veto em janeiro de 2023, derrubada em dezembro, resolução do CNE em 2025 e implementação obrigatória em 2026, justamente quando a pesquisa acontece.</w:t>
+      </w:r>
+    </w:p>
+    <w:p>
+      <w:pPr>
+        <w:pStyle w:val="Heading2"/>
+      </w:pPr>
+      <w:r>
+        <w:t>Slide 23 – A promessa e o desenho  (0:53; acumulado 15:05)</w:t>
+      </w:r>
+    </w:p>
+    <w:p>
+      <w:r>
+        <w:t>Este é o achado central do capítulo. A PNED é instância de articulação; a inclusão digital depende dos limites orçamentários de cada órgão; não há fundo próprio nem transferência obrigatória aos municípios; e a formação aparece como promoção, sem responsáveis nem custeio. Chamo isso de vazio material: a exigência tem data marcada, e os meios não. Numa rede pequena, a falta não para na Secretaria; chega à sala de aula, onde a professora continua responsável pelo componente, com ou sem os meios. É aí que o financiamento se liga à discricionariedade substitutiva.</w:t>
+      </w:r>
+    </w:p>
+    <w:p>
+      <w:pPr>
+        <w:pStyle w:val="Heading2"/>
+      </w:pPr>
+      <w:r>
+        <w:t>Slide 24 – A antiga Pipa: trabalho, moradia e mar  (0:31; acumulado 15:36)</w:t>
+      </w:r>
+    </w:p>
+    <w:p>
+      <w:r>
+        <w:t>No Capítulo 6, as imagens do Museu Digital de Pipa mostram um território em que trabalho, moradia e mar estavam próximos. Com Santos e Massey, leio essas formas sem nostalgia. O barco construído junto às casas, as embarcações na maré baixa e o mutirão do curral mostram saberes aprendidos no próprio fazer.</w:t>
+      </w:r>
+    </w:p>
+    <w:p>
+      <w:pPr>
+        <w:pStyle w:val="Heading2"/>
+      </w:pPr>
+      <w:r>
+        <w:t>Slide 25 – A Pipa de hoje: um território conectado  (0:50; acumulado 16:26)</w:t>
+      </w:r>
+    </w:p>
+    <w:p>
+      <w:r>
+        <w:t>A Pipa de hoje é atravessada pelos circuitos do turismo, de reservas a pagamentos, distribuídos de modo desigual. Incluí nesta revisão uma fotografia atual: um pescador descarregando o pescado, com lanchas e escunas ao fundo. A pesca não foi substituída pelo turismo; divide com ele o mesmo mar, e o barco de madeira recebeu motor de popa. A foto prova presença, e não escala, mas mostra que as crianças da escola vêm de famílias com relações muito diferentes com o mar, o trabalho e as tecnologias.</w:t>
+      </w:r>
+    </w:p>
+    <w:p>
+      <w:pPr>
+        <w:pStyle w:val="Heading2"/>
+      </w:pPr>
+      <w:r>
+        <w:t>Slide 26 – Na escola: o que existe e onde está  (0:46; acumulado 17:12)</w:t>
+      </w:r>
+    </w:p>
+    <w:p>
+      <w:r>
+        <w:t>Na escola, o laboratório tinha os computadores desligados; segundo informações preliminares, há duas conexões e um único kit multimídia; nas salas de 1º e 2º anos, nenhum dispositivo, só recursos impressos e feitos à mão. Tudo isso será verificado na análise documental. Chamo de rugosidade tecnológica essa permanência de equipamentos de uma iniciativa anterior, aos quais a PNED atribui nova função, e a pergunta é se o laboratório perdeu sua função ou se ela nunca chegou a se constituir.</w:t>
+      </w:r>
+    </w:p>
+    <w:p>
+      <w:pPr>
+        <w:pStyle w:val="Heading2"/>
+      </w:pPr>
+      <w:r>
+        <w:t>Slide 27 – Onde estamos e o que falta  (0:22; acumulado 17:34)</w:t>
+      </w:r>
+    </w:p>
+    <w:p>
+      <w:r>
+        <w:t>Os Capítulos 2, 4 e 5 estão construídos, o 6 em boa parte, e o 3 em construção. Faltam a emenda ao Comitê de Ética, a análise documental e o campo, planejado para dez semanas.</w:t>
+      </w:r>
+    </w:p>
+    <w:p>
+      <w:pPr>
+        <w:pStyle w:val="Heading2"/>
+      </w:pPr>
+      <w:r>
+        <w:t>Slide 28 – O que submeto à banca  (0:29; acumulado 18:03)</w:t>
+      </w:r>
+    </w:p>
+    <w:p>
+      <w:r>
+        <w:t>Trago quatro questões: se a confirmação precisa de um limiar numérico; se o custo sob visibilidade direta se sustenta só com narrativas; se descrever direção e Secretaria, com um participante cada, basta para a delimitação; e se os critérios sobre a formação como condição ausente estão adequados.</w:t>
+      </w:r>
+    </w:p>
+    <w:p>
+      <w:pPr>
+        <w:pStyle w:val="Heading2"/>
+      </w:pPr>
+      <w:r>
+        <w:t>Slide 29 – A questão aberta / Agradecimento  (0:25; acumulado 18:28)</w:t>
+      </w:r>
+    </w:p>
+    <w:p>
+      <w:r>
+        <w:t>A política fez da educação digital um direito e deixou os meios a cargo de cada ente. Quando o equipamento e a formação não chegam, quem paga esse preço no cotidiano da escola? Muito obrigada. Fico à disposição da banca.</w:t>
+      </w:r>
+    </w:p>
+    <w:p>
+      <w:pPr>
+        <w:pStyle w:val="Heading2"/>
+      </w:pPr>
+      <w:r>
+        <w:t>Slide 30 – Referências  (—; acumulado —)</w:t>
       </w:r>
     </w:p>
     <w:p>

</xml_diff>

<commit_message>
Roteiro de fala em tom oral para a versão final da apresentação (44 slides)
Co-Authored-By: Claude Opus 5.5 <noreply@anthropic.com>
Claude-Session: https://claude.ai/code/session_01HxStpW4pQoDfJdTDYr6zEC
</commit_message>
<xml_diff>
--- a/apresentacao_qualificacao/ROTEIRO_DE_FALA_QUALIFICACAO.docx
+++ b/apresentacao_qualificacao/ROTEIRO_DE_FALA_QUALIFICACAO.docx
@@ -7,17 +7,17 @@
         <w:pStyle w:val="Heading1"/>
       </w:pPr>
       <w:r>
-        <w:t>Roteiro de fala – Qualificação de doutorado (20 minutos)</w:t>
+        <w:t>Roteiro de fala – Qualificação de doutorado</w:t>
       </w:r>
     </w:p>
     <w:p>
       <w:r>
-        <w:t>Tese: A política no canteiro da prática: norma, território e atuação profissional na implementação da educação digital escolar nos anos iniciais. Pesquisadora: Yzynya Silva Rezende Machado. Orientadora: Dra. Maria Cristina Leandro de Paiva.</w:t>
+        <w:t>Tese: A política no canteiro da prática. Pesquisadora: Yzynya Silva Rezende Machado. Orientadora: Dra. Maria Cristina Leandro de Paiva.</w:t>
       </w:r>
     </w:p>
     <w:p>
       <w:r>
-        <w:t>Como usar: o tempo de cada slide e o tempo acumulado ao lado servem de referência para o ensaio. O tempo de cada slide foi estimado pela extensão do texto, em ritmo de fala pausado. Cronometre um ensaio completo e ajuste. As frases são curtas para facilitar a leitura em voz alta; adapte livremente ao seu jeito de falar. Os tempos foram calculados a 110 palavras por minuto, com 3 segundos por troca de slide. Se o tempo apertar, os slides 12, 13 e 18 podem ser passados rapidamente.</w:t>
+        <w:t>Como usar: o texto está em linguagem de fala, para ser dito com naturalidade, e não lido palavra por palavra. Os tempos foram calculados a 120 palavras por minuto, mais 2 segundos por troca de slide; o total previsto é de cerca de 20 minutos. Os slides de abertura de parte (5, 20, 22, 25, 33 e 41) são de passagem rápida. Se precisar de mais folga, os slides 17, 18 e 29 podem ser encurtados.</w:t>
       </w:r>
     </w:p>
     <w:tbl>
@@ -143,7 +143,7 @@
           </w:tcPr>
           <w:p>
             <w:r>
-              <w:t>0:19</w:t>
+              <w:t>0:24</w:t>
             </w:r>
           </w:p>
         </w:tc>
@@ -153,7 +153,7 @@
           </w:tcPr>
           <w:p>
             <w:r>
-              <w:t>0:53</w:t>
+              <w:t>0:58</w:t>
             </w:r>
           </w:p>
         </w:tc>
@@ -166,48 +166,6 @@
           <w:p>
             <w:r>
               <w:t>3</w:t>
-            </w:r>
-          </w:p>
-        </w:tc>
-        <w:tc>
-          <w:tcPr>
-            <w:tcW w:type="dxa" w:w="2351"/>
-          </w:tcPr>
-          <w:p>
-            <w:r>
-              <w:t>A tese em uma imagem: o vazio material</w:t>
-            </w:r>
-          </w:p>
-        </w:tc>
-        <w:tc>
-          <w:tcPr>
-            <w:tcW w:type="dxa" w:w="2351"/>
-          </w:tcPr>
-          <w:p>
-            <w:r>
-              <w:t>1:18</w:t>
-            </w:r>
-          </w:p>
-        </w:tc>
-        <w:tc>
-          <w:tcPr>
-            <w:tcW w:type="dxa" w:w="2351"/>
-          </w:tcPr>
-          <w:p>
-            <w:r>
-              <w:t>2:11</w:t>
-            </w:r>
-          </w:p>
-        </w:tc>
-      </w:tr>
-      <w:tr>
-        <w:tc>
-          <w:tcPr>
-            <w:tcW w:type="dxa" w:w="2351"/>
-          </w:tcPr>
-          <w:p>
-            <w:r>
-              <w:t>4</w:t>
             </w:r>
           </w:p>
         </w:tc>
@@ -237,7 +195,49 @@
           </w:tcPr>
           <w:p>
             <w:r>
-              <w:t>3:09</w:t>
+              <w:t>1:56</w:t>
+            </w:r>
+          </w:p>
+        </w:tc>
+      </w:tr>
+      <w:tr>
+        <w:tc>
+          <w:tcPr>
+            <w:tcW w:type="dxa" w:w="2351"/>
+          </w:tcPr>
+          <w:p>
+            <w:r>
+              <w:t>4</w:t>
+            </w:r>
+          </w:p>
+        </w:tc>
+        <w:tc>
+          <w:tcPr>
+            <w:tcW w:type="dxa" w:w="2351"/>
+          </w:tcPr>
+          <w:p>
+            <w:r>
+              <w:t>Relevâncias da pesquisa</w:t>
+            </w:r>
+          </w:p>
+        </w:tc>
+        <w:tc>
+          <w:tcPr>
+            <w:tcW w:type="dxa" w:w="2351"/>
+          </w:tcPr>
+          <w:p>
+            <w:r>
+              <w:t>0:19</w:t>
+            </w:r>
+          </w:p>
+        </w:tc>
+        <w:tc>
+          <w:tcPr>
+            <w:tcW w:type="dxa" w:w="2351"/>
+          </w:tcPr>
+          <w:p>
+            <w:r>
+              <w:t>2:15</w:t>
             </w:r>
           </w:p>
         </w:tc>
@@ -259,7 +259,7 @@
           </w:tcPr>
           <w:p>
             <w:r>
-              <w:t>O objeto e o recorte</w:t>
+              <w:t>Parte I – A proposta da tese</w:t>
             </w:r>
           </w:p>
         </w:tc>
@@ -269,7 +269,7 @@
           </w:tcPr>
           <w:p>
             <w:r>
-              <w:t>0:45</w:t>
+              <w:t>0:06</w:t>
             </w:r>
           </w:p>
         </w:tc>
@@ -279,7 +279,7 @@
           </w:tcPr>
           <w:p>
             <w:r>
-              <w:t>3:54</w:t>
+              <w:t>2:21</w:t>
             </w:r>
           </w:p>
         </w:tc>
@@ -301,7 +301,7 @@
           </w:tcPr>
           <w:p>
             <w:r>
-              <w:t>Do portão para fora, do portão para dentro</w:t>
+              <w:t>Estrutura da tese</w:t>
             </w:r>
           </w:p>
         </w:tc>
@@ -311,7 +311,7 @@
           </w:tcPr>
           <w:p>
             <w:r>
-              <w:t>0:46</w:t>
+              <w:t>0:25</w:t>
             </w:r>
           </w:p>
         </w:tc>
@@ -321,7 +321,7 @@
           </w:tcPr>
           <w:p>
             <w:r>
-              <w:t>4:40</w:t>
+              <w:t>2:46</w:t>
             </w:r>
           </w:p>
         </w:tc>
@@ -343,7 +343,7 @@
           </w:tcPr>
           <w:p>
             <w:r>
-              <w:t>Questão norteadora e objetivos</w:t>
+              <w:t>A tese em uma imagem: o vazio material</w:t>
             </w:r>
           </w:p>
         </w:tc>
@@ -353,7 +353,7 @@
           </w:tcPr>
           <w:p>
             <w:r>
-              <w:t>0:46</w:t>
+              <w:t>1:02</w:t>
             </w:r>
           </w:p>
         </w:tc>
@@ -363,7 +363,7 @@
           </w:tcPr>
           <w:p>
             <w:r>
-              <w:t>5:26</w:t>
+              <w:t>3:48</w:t>
             </w:r>
           </w:p>
         </w:tc>
@@ -385,7 +385,7 @@
           </w:tcPr>
           <w:p>
             <w:r>
-              <w:t>Contribuição inédita: discricionariedade substitutiva</w:t>
+              <w:t>O objeto e o recorte</w:t>
             </w:r>
           </w:p>
         </w:tc>
@@ -395,7 +395,7 @@
           </w:tcPr>
           <w:p>
             <w:r>
-              <w:t>0:50</w:t>
+              <w:t>0:54</w:t>
             </w:r>
           </w:p>
         </w:tc>
@@ -405,7 +405,7 @@
           </w:tcPr>
           <w:p>
             <w:r>
-              <w:t>6:16</w:t>
+              <w:t>4:42</w:t>
             </w:r>
           </w:p>
         </w:tc>
@@ -427,7 +427,7 @@
           </w:tcPr>
           <w:p>
             <w:r>
-              <w:t>Três componentes e os riscos a analisar</w:t>
+              <w:t>Justificativa</w:t>
             </w:r>
           </w:p>
         </w:tc>
@@ -437,7 +437,7 @@
           </w:tcPr>
           <w:p>
             <w:r>
-              <w:t>0:32</w:t>
+              <w:t>0:35</w:t>
             </w:r>
           </w:p>
         </w:tc>
@@ -447,7 +447,7 @@
           </w:tcPr>
           <w:p>
             <w:r>
-              <w:t>6:48</w:t>
+              <w:t>5:17</w:t>
             </w:r>
           </w:p>
         </w:tc>
@@ -469,7 +469,7 @@
           </w:tcPr>
           <w:p>
             <w:r>
-              <w:t>Três formulações, dois estatutos</w:t>
+              <w:t>Problematização: do portão para fora, do portão para dentro</w:t>
             </w:r>
           </w:p>
         </w:tc>
@@ -479,7 +479,7 @@
           </w:tcPr>
           <w:p>
             <w:r>
-              <w:t>0:21</w:t>
+              <w:t>0:32</w:t>
             </w:r>
           </w:p>
         </w:tc>
@@ -489,7 +489,7 @@
           </w:tcPr>
           <w:p>
             <w:r>
-              <w:t>7:09</w:t>
+              <w:t>5:49</w:t>
             </w:r>
           </w:p>
         </w:tc>
@@ -511,7 +511,7 @@
           </w:tcPr>
           <w:p>
             <w:r>
-              <w:t>O motor teórico: duas engrenagens e o fosso</w:t>
+              <w:t>Questão norteadora e objetivos</w:t>
             </w:r>
           </w:p>
         </w:tc>
@@ -521,7 +521,7 @@
           </w:tcPr>
           <w:p>
             <w:r>
-              <w:t>0:56</w:t>
+              <w:t>0:36</w:t>
             </w:r>
           </w:p>
         </w:tc>
@@ -531,7 +531,7 @@
           </w:tcPr>
           <w:p>
             <w:r>
-              <w:t>8:05</w:t>
+              <w:t>6:25</w:t>
             </w:r>
           </w:p>
         </w:tc>
@@ -553,7 +553,7 @@
           </w:tcPr>
           <w:p>
             <w:r>
-              <w:t>A tessitura: os fios que sustentam a tese</w:t>
+              <w:t>Contribuição inédita: discricionariedade substitutiva</w:t>
             </w:r>
           </w:p>
         </w:tc>
@@ -563,7 +563,7 @@
           </w:tcPr>
           <w:p>
             <w:r>
-              <w:t>0:27</w:t>
+              <w:t>1:02</w:t>
             </w:r>
           </w:p>
         </w:tc>
@@ -573,7 +573,7 @@
           </w:tcPr>
           <w:p>
             <w:r>
-              <w:t>8:32</w:t>
+              <w:t>7:27</w:t>
             </w:r>
           </w:p>
         </w:tc>
@@ -595,7 +595,7 @@
           </w:tcPr>
           <w:p>
             <w:r>
-              <w:t>Onde os referenciais deixam de cobrir o caso</w:t>
+              <w:t>Três componentes e os riscos a analisar</w:t>
             </w:r>
           </w:p>
         </w:tc>
@@ -605,7 +605,7 @@
           </w:tcPr>
           <w:p>
             <w:r>
-              <w:t>0:22</w:t>
+              <w:t>0:30</w:t>
             </w:r>
           </w:p>
         </w:tc>
@@ -615,7 +615,7 @@
           </w:tcPr>
           <w:p>
             <w:r>
-              <w:t>8:54</w:t>
+              <w:t>7:57</w:t>
             </w:r>
           </w:p>
         </w:tc>
@@ -637,7 +637,7 @@
           </w:tcPr>
           <w:p>
             <w:r>
-              <w:t>A revisão sistemática: questão e resposta</w:t>
+              <w:t>Três formulações, dois estatutos</w:t>
             </w:r>
           </w:p>
         </w:tc>
@@ -647,7 +647,7 @@
           </w:tcPr>
           <w:p>
             <w:r>
-              <w:t>0:58</w:t>
+              <w:t>0:14</w:t>
             </w:r>
           </w:p>
         </w:tc>
@@ -657,7 +657,7 @@
           </w:tcPr>
           <w:p>
             <w:r>
-              <w:t>9:52</w:t>
+              <w:t>8:11</w:t>
             </w:r>
           </w:p>
         </w:tc>
@@ -679,7 +679,7 @@
           </w:tcPr>
           <w:p>
             <w:r>
-              <w:t>Desenho: estudo de caso único, qualitativo</w:t>
+              <w:t>Onde os referenciais deixam de cobrir o caso</w:t>
             </w:r>
           </w:p>
         </w:tc>
@@ -689,7 +689,7 @@
           </w:tcPr>
           <w:p>
             <w:r>
-              <w:t>0:37</w:t>
+              <w:t>0:25</w:t>
             </w:r>
           </w:p>
         </w:tc>
@@ -699,7 +699,7 @@
           </w:tcPr>
           <w:p>
             <w:r>
-              <w:t>10:29</w:t>
+              <w:t>8:36</w:t>
             </w:r>
           </w:p>
         </w:tc>
@@ -721,7 +721,7 @@
           </w:tcPr>
           <w:p>
             <w:r>
-              <w:t>Como a categoria pode falhar</w:t>
+              <w:t>O motor teórico: duas engrenagens e o fosso entre elas</w:t>
             </w:r>
           </w:p>
         </w:tc>
@@ -731,7 +731,7 @@
           </w:tcPr>
           <w:p>
             <w:r>
-              <w:t>0:41</w:t>
+              <w:t>0:58</w:t>
             </w:r>
           </w:p>
         </w:tc>
@@ -741,7 +741,7 @@
           </w:tcPr>
           <w:p>
             <w:r>
-              <w:t>11:10</w:t>
+              <w:t>9:34</w:t>
             </w:r>
           </w:p>
         </w:tc>
@@ -763,7 +763,7 @@
           </w:tcPr>
           <w:p>
             <w:r>
-              <w:t>A agenda internacional: das presenças às condições</w:t>
+              <w:t>Como a categoria pode falhar</w:t>
             </w:r>
           </w:p>
         </w:tc>
@@ -773,7 +773,7 @@
           </w:tcPr>
           <w:p>
             <w:r>
-              <w:t>0:49</w:t>
+              <w:t>0:30</w:t>
             </w:r>
           </w:p>
         </w:tc>
@@ -783,7 +783,7 @@
           </w:tcPr>
           <w:p>
             <w:r>
-              <w:t>11:59</w:t>
+              <w:t>10:04</w:t>
             </w:r>
           </w:p>
         </w:tc>
@@ -805,7 +805,7 @@
           </w:tcPr>
           <w:p>
             <w:r>
-              <w:t>Mapa das políticas de educação digital</w:t>
+              <w:t>Ética, posição e reflexividade</w:t>
             </w:r>
           </w:p>
         </w:tc>
@@ -815,7 +815,7 @@
           </w:tcPr>
           <w:p>
             <w:r>
-              <w:t>0:16</w:t>
+              <w:t>0:18</w:t>
             </w:r>
           </w:p>
         </w:tc>
@@ -825,7 +825,7 @@
           </w:tcPr>
           <w:p>
             <w:r>
-              <w:t>12:15</w:t>
+              <w:t>10:22</w:t>
             </w:r>
           </w:p>
         </w:tc>
@@ -847,7 +847,7 @@
           </w:tcPr>
           <w:p>
             <w:r>
-              <w:t>O que essas experiências trazem para a tese</w:t>
+              <w:t>A tessitura: os fios que sustentam a tese</w:t>
             </w:r>
           </w:p>
         </w:tc>
@@ -857,7 +857,7 @@
           </w:tcPr>
           <w:p>
             <w:r>
-              <w:t>0:39</w:t>
+              <w:t>0:10</w:t>
             </w:r>
           </w:p>
         </w:tc>
@@ -867,7 +867,7 @@
           </w:tcPr>
           <w:p>
             <w:r>
-              <w:t>12:54</w:t>
+              <w:t>10:32</w:t>
             </w:r>
           </w:p>
         </w:tc>
@@ -889,7 +889,7 @@
           </w:tcPr>
           <w:p>
             <w:r>
-              <w:t>Quatro décadas até a PNED</w:t>
+              <w:t>Parte II – Revisão sistemática</w:t>
             </w:r>
           </w:p>
         </w:tc>
@@ -899,7 +899,7 @@
           </w:tcPr>
           <w:p>
             <w:r>
-              <w:t>0:32</w:t>
+              <w:t>0:10</w:t>
             </w:r>
           </w:p>
         </w:tc>
@@ -909,7 +909,7 @@
           </w:tcPr>
           <w:p>
             <w:r>
-              <w:t>13:26</w:t>
+              <w:t>10:42</w:t>
             </w:r>
           </w:p>
         </w:tc>
@@ -931,7 +931,7 @@
           </w:tcPr>
           <w:p>
             <w:r>
-              <w:t>Por que a PNED importa</w:t>
+              <w:t>A RSL: questão norteadora e resposta</w:t>
             </w:r>
           </w:p>
         </w:tc>
@@ -941,7 +941,7 @@
           </w:tcPr>
           <w:p>
             <w:r>
-              <w:t>0:27</w:t>
+              <w:t>0:50</w:t>
             </w:r>
           </w:p>
         </w:tc>
@@ -951,7 +951,7 @@
           </w:tcPr>
           <w:p>
             <w:r>
-              <w:t>13:53</w:t>
+              <w:t>11:32</w:t>
             </w:r>
           </w:p>
         </w:tc>
@@ -973,7 +973,7 @@
           </w:tcPr>
           <w:p>
             <w:r>
-              <w:t>A PNED e o calendário da exigência</w:t>
+              <w:t>Parte III – Metodologia</w:t>
             </w:r>
           </w:p>
         </w:tc>
@@ -983,7 +983,7 @@
           </w:tcPr>
           <w:p>
             <w:r>
-              <w:t>0:19</w:t>
+              <w:t>0:06</w:t>
             </w:r>
           </w:p>
         </w:tc>
@@ -993,7 +993,7 @@
           </w:tcPr>
           <w:p>
             <w:r>
-              <w:t>14:12</w:t>
+              <w:t>11:38</w:t>
             </w:r>
           </w:p>
         </w:tc>
@@ -1015,7 +1015,7 @@
           </w:tcPr>
           <w:p>
             <w:r>
-              <w:t>A promessa e o desenho</w:t>
+              <w:t>Desenho: estudo de caso único, qualitativo</w:t>
             </w:r>
           </w:p>
         </w:tc>
@@ -1025,7 +1025,7 @@
           </w:tcPr>
           <w:p>
             <w:r>
-              <w:t>0:53</w:t>
+              <w:t>0:32</w:t>
             </w:r>
           </w:p>
         </w:tc>
@@ -1035,7 +1035,7 @@
           </w:tcPr>
           <w:p>
             <w:r>
-              <w:t>15:05</w:t>
+              <w:t>12:10</w:t>
             </w:r>
           </w:p>
         </w:tc>
@@ -1057,7 +1057,7 @@
           </w:tcPr>
           <w:p>
             <w:r>
-              <w:t>A antiga Pipa: trabalho, moradia e mar</w:t>
+              <w:t>Quem será ouvido</w:t>
             </w:r>
           </w:p>
         </w:tc>
@@ -1067,7 +1067,7 @@
           </w:tcPr>
           <w:p>
             <w:r>
-              <w:t>0:31</w:t>
+              <w:t>0:24</w:t>
             </w:r>
           </w:p>
         </w:tc>
@@ -1077,7 +1077,7 @@
           </w:tcPr>
           <w:p>
             <w:r>
-              <w:t>15:36</w:t>
+              <w:t>12:34</w:t>
             </w:r>
           </w:p>
         </w:tc>
@@ -1099,7 +1099,7 @@
           </w:tcPr>
           <w:p>
             <w:r>
-              <w:t>A Pipa de hoje: um território conectado</w:t>
+              <w:t>Parte IV – Agenda internacional e PNED</w:t>
             </w:r>
           </w:p>
         </w:tc>
@@ -1109,7 +1109,7 @@
           </w:tcPr>
           <w:p>
             <w:r>
-              <w:t>0:50</w:t>
+              <w:t>0:09</w:t>
             </w:r>
           </w:p>
         </w:tc>
@@ -1119,7 +1119,7 @@
           </w:tcPr>
           <w:p>
             <w:r>
-              <w:t>16:26</w:t>
+              <w:t>12:43</w:t>
             </w:r>
           </w:p>
         </w:tc>
@@ -1141,7 +1141,7 @@
           </w:tcPr>
           <w:p>
             <w:r>
-              <w:t>Na escola: o que existe e onde está</w:t>
+              <w:t>A agenda internacional: das presenças às condições</w:t>
             </w:r>
           </w:p>
         </w:tc>
@@ -1151,7 +1151,7 @@
           </w:tcPr>
           <w:p>
             <w:r>
-              <w:t>0:46</w:t>
+              <w:t>0:40</w:t>
             </w:r>
           </w:p>
         </w:tc>
@@ -1161,7 +1161,7 @@
           </w:tcPr>
           <w:p>
             <w:r>
-              <w:t>17:12</w:t>
+              <w:t>13:23</w:t>
             </w:r>
           </w:p>
         </w:tc>
@@ -1183,7 +1183,7 @@
           </w:tcPr>
           <w:p>
             <w:r>
-              <w:t>Onde estamos e o que falta</w:t>
+              <w:t>Mapa das políticas de educação digital</w:t>
             </w:r>
           </w:p>
         </w:tc>
@@ -1203,7 +1203,7 @@
           </w:tcPr>
           <w:p>
             <w:r>
-              <w:t>17:34</w:t>
+              <w:t>13:45</w:t>
             </w:r>
           </w:p>
         </w:tc>
@@ -1225,7 +1225,7 @@
           </w:tcPr>
           <w:p>
             <w:r>
-              <w:t>O que submeto à banca</w:t>
+              <w:t>O que essas experiências trazem para a tese</w:t>
             </w:r>
           </w:p>
         </w:tc>
@@ -1235,7 +1235,7 @@
           </w:tcPr>
           <w:p>
             <w:r>
-              <w:t>0:29</w:t>
+              <w:t>0:18</w:t>
             </w:r>
           </w:p>
         </w:tc>
@@ -1245,7 +1245,7 @@
           </w:tcPr>
           <w:p>
             <w:r>
-              <w:t>18:03</w:t>
+              <w:t>14:03</w:t>
             </w:r>
           </w:p>
         </w:tc>
@@ -1267,7 +1267,7 @@
           </w:tcPr>
           <w:p>
             <w:r>
-              <w:t>A questão aberta / Agradecimento</w:t>
+              <w:t>Quatro décadas até a PNED</w:t>
             </w:r>
           </w:p>
         </w:tc>
@@ -1277,7 +1277,7 @@
           </w:tcPr>
           <w:p>
             <w:r>
-              <w:t>0:25</w:t>
+              <w:t>0:18</w:t>
             </w:r>
           </w:p>
         </w:tc>
@@ -1287,7 +1287,7 @@
           </w:tcPr>
           <w:p>
             <w:r>
-              <w:t>18:28</w:t>
+              <w:t>14:21</w:t>
             </w:r>
           </w:p>
         </w:tc>
@@ -1300,6 +1300,594 @@
           <w:p>
             <w:r>
               <w:t>30</w:t>
+            </w:r>
+          </w:p>
+        </w:tc>
+        <w:tc>
+          <w:tcPr>
+            <w:tcW w:type="dxa" w:w="2351"/>
+          </w:tcPr>
+          <w:p>
+            <w:r>
+              <w:t>Por que a PNED importa</w:t>
+            </w:r>
+          </w:p>
+        </w:tc>
+        <w:tc>
+          <w:tcPr>
+            <w:tcW w:type="dxa" w:w="2351"/>
+          </w:tcPr>
+          <w:p>
+            <w:r>
+              <w:t>0:26</w:t>
+            </w:r>
+          </w:p>
+        </w:tc>
+        <w:tc>
+          <w:tcPr>
+            <w:tcW w:type="dxa" w:w="2351"/>
+          </w:tcPr>
+          <w:p>
+            <w:r>
+              <w:t>14:47</w:t>
+            </w:r>
+          </w:p>
+        </w:tc>
+      </w:tr>
+      <w:tr>
+        <w:tc>
+          <w:tcPr>
+            <w:tcW w:type="dxa" w:w="2351"/>
+          </w:tcPr>
+          <w:p>
+            <w:r>
+              <w:t>31</w:t>
+            </w:r>
+          </w:p>
+        </w:tc>
+        <w:tc>
+          <w:tcPr>
+            <w:tcW w:type="dxa" w:w="2351"/>
+          </w:tcPr>
+          <w:p>
+            <w:r>
+              <w:t>A PNED e o calendário da exigência</w:t>
+            </w:r>
+          </w:p>
+        </w:tc>
+        <w:tc>
+          <w:tcPr>
+            <w:tcW w:type="dxa" w:w="2351"/>
+          </w:tcPr>
+          <w:p>
+            <w:r>
+              <w:t>0:30</w:t>
+            </w:r>
+          </w:p>
+        </w:tc>
+        <w:tc>
+          <w:tcPr>
+            <w:tcW w:type="dxa" w:w="2351"/>
+          </w:tcPr>
+          <w:p>
+            <w:r>
+              <w:t>15:17</w:t>
+            </w:r>
+          </w:p>
+        </w:tc>
+      </w:tr>
+      <w:tr>
+        <w:tc>
+          <w:tcPr>
+            <w:tcW w:type="dxa" w:w="2351"/>
+          </w:tcPr>
+          <w:p>
+            <w:r>
+              <w:t>32</w:t>
+            </w:r>
+          </w:p>
+        </w:tc>
+        <w:tc>
+          <w:tcPr>
+            <w:tcW w:type="dxa" w:w="2351"/>
+          </w:tcPr>
+          <w:p>
+            <w:r>
+              <w:t>A promessa e o desenho</w:t>
+            </w:r>
+          </w:p>
+        </w:tc>
+        <w:tc>
+          <w:tcPr>
+            <w:tcW w:type="dxa" w:w="2351"/>
+          </w:tcPr>
+          <w:p>
+            <w:r>
+              <w:t>0:40</w:t>
+            </w:r>
+          </w:p>
+        </w:tc>
+        <w:tc>
+          <w:tcPr>
+            <w:tcW w:type="dxa" w:w="2351"/>
+          </w:tcPr>
+          <w:p>
+            <w:r>
+              <w:t>15:57</w:t>
+            </w:r>
+          </w:p>
+        </w:tc>
+      </w:tr>
+      <w:tr>
+        <w:tc>
+          <w:tcPr>
+            <w:tcW w:type="dxa" w:w="2351"/>
+          </w:tcPr>
+          <w:p>
+            <w:r>
+              <w:t>33</w:t>
+            </w:r>
+          </w:p>
+        </w:tc>
+        <w:tc>
+          <w:tcPr>
+            <w:tcW w:type="dxa" w:w="2351"/>
+          </w:tcPr>
+          <w:p>
+            <w:r>
+              <w:t>Parte V – O território e a escola</w:t>
+            </w:r>
+          </w:p>
+        </w:tc>
+        <w:tc>
+          <w:tcPr>
+            <w:tcW w:type="dxa" w:w="2351"/>
+          </w:tcPr>
+          <w:p>
+            <w:r>
+              <w:t>0:05</w:t>
+            </w:r>
+          </w:p>
+        </w:tc>
+        <w:tc>
+          <w:tcPr>
+            <w:tcW w:type="dxa" w:w="2351"/>
+          </w:tcPr>
+          <w:p>
+            <w:r>
+              <w:t>16:02</w:t>
+            </w:r>
+          </w:p>
+        </w:tc>
+      </w:tr>
+      <w:tr>
+        <w:tc>
+          <w:tcPr>
+            <w:tcW w:type="dxa" w:w="2351"/>
+          </w:tcPr>
+          <w:p>
+            <w:r>
+              <w:t>34</w:t>
+            </w:r>
+          </w:p>
+        </w:tc>
+        <w:tc>
+          <w:tcPr>
+            <w:tcW w:type="dxa" w:w="2351"/>
+          </w:tcPr>
+          <w:p>
+            <w:r>
+              <w:t>A antiga Pipa: trabalho, moradia e mar</w:t>
+            </w:r>
+          </w:p>
+        </w:tc>
+        <w:tc>
+          <w:tcPr>
+            <w:tcW w:type="dxa" w:w="2351"/>
+          </w:tcPr>
+          <w:p>
+            <w:r>
+              <w:t>0:32</w:t>
+            </w:r>
+          </w:p>
+        </w:tc>
+        <w:tc>
+          <w:tcPr>
+            <w:tcW w:type="dxa" w:w="2351"/>
+          </w:tcPr>
+          <w:p>
+            <w:r>
+              <w:t>16:34</w:t>
+            </w:r>
+          </w:p>
+        </w:tc>
+      </w:tr>
+      <w:tr>
+        <w:tc>
+          <w:tcPr>
+            <w:tcW w:type="dxa" w:w="2351"/>
+          </w:tcPr>
+          <w:p>
+            <w:r>
+              <w:t>35</w:t>
+            </w:r>
+          </w:p>
+        </w:tc>
+        <w:tc>
+          <w:tcPr>
+            <w:tcW w:type="dxa" w:w="2351"/>
+          </w:tcPr>
+          <w:p>
+            <w:r>
+              <w:t>As transformações: de vila a polo turístico</w:t>
+            </w:r>
+          </w:p>
+        </w:tc>
+        <w:tc>
+          <w:tcPr>
+            <w:tcW w:type="dxa" w:w="2351"/>
+          </w:tcPr>
+          <w:p>
+            <w:r>
+              <w:t>0:21</w:t>
+            </w:r>
+          </w:p>
+        </w:tc>
+        <w:tc>
+          <w:tcPr>
+            <w:tcW w:type="dxa" w:w="2351"/>
+          </w:tcPr>
+          <w:p>
+            <w:r>
+              <w:t>16:55</w:t>
+            </w:r>
+          </w:p>
+        </w:tc>
+      </w:tr>
+      <w:tr>
+        <w:tc>
+          <w:tcPr>
+            <w:tcW w:type="dxa" w:w="2351"/>
+          </w:tcPr>
+          <w:p>
+            <w:r>
+              <w:t>36</w:t>
+            </w:r>
+          </w:p>
+        </w:tc>
+        <w:tc>
+          <w:tcPr>
+            <w:tcW w:type="dxa" w:w="2351"/>
+          </w:tcPr>
+          <w:p>
+            <w:r>
+              <w:t>A Pipa de hoje: um território conectado</w:t>
+            </w:r>
+          </w:p>
+        </w:tc>
+        <w:tc>
+          <w:tcPr>
+            <w:tcW w:type="dxa" w:w="2351"/>
+          </w:tcPr>
+          <w:p>
+            <w:r>
+              <w:t>0:52</w:t>
+            </w:r>
+          </w:p>
+        </w:tc>
+        <w:tc>
+          <w:tcPr>
+            <w:tcW w:type="dxa" w:w="2351"/>
+          </w:tcPr>
+          <w:p>
+            <w:r>
+              <w:t>17:47</w:t>
+            </w:r>
+          </w:p>
+        </w:tc>
+      </w:tr>
+      <w:tr>
+        <w:tc>
+          <w:tcPr>
+            <w:tcW w:type="dxa" w:w="2351"/>
+          </w:tcPr>
+          <w:p>
+            <w:r>
+              <w:t>37</w:t>
+            </w:r>
+          </w:p>
+        </w:tc>
+        <w:tc>
+          <w:tcPr>
+            <w:tcW w:type="dxa" w:w="2351"/>
+          </w:tcPr>
+          <w:p>
+            <w:r>
+              <w:t>A escola não se resume ao que falta</w:t>
+            </w:r>
+          </w:p>
+        </w:tc>
+        <w:tc>
+          <w:tcPr>
+            <w:tcW w:type="dxa" w:w="2351"/>
+          </w:tcPr>
+          <w:p>
+            <w:r>
+              <w:t>0:10</w:t>
+            </w:r>
+          </w:p>
+        </w:tc>
+        <w:tc>
+          <w:tcPr>
+            <w:tcW w:type="dxa" w:w="2351"/>
+          </w:tcPr>
+          <w:p>
+            <w:r>
+              <w:t>17:57</w:t>
+            </w:r>
+          </w:p>
+        </w:tc>
+      </w:tr>
+      <w:tr>
+        <w:tc>
+          <w:tcPr>
+            <w:tcW w:type="dxa" w:w="2351"/>
+          </w:tcPr>
+          <w:p>
+            <w:r>
+              <w:t>38</w:t>
+            </w:r>
+          </w:p>
+        </w:tc>
+        <w:tc>
+          <w:tcPr>
+            <w:tcW w:type="dxa" w:w="2351"/>
+          </w:tcPr>
+          <w:p>
+            <w:r>
+              <w:t>Na escola: o que existe e onde está</w:t>
+            </w:r>
+          </w:p>
+        </w:tc>
+        <w:tc>
+          <w:tcPr>
+            <w:tcW w:type="dxa" w:w="2351"/>
+          </w:tcPr>
+          <w:p>
+            <w:r>
+              <w:t>0:34</w:t>
+            </w:r>
+          </w:p>
+        </w:tc>
+        <w:tc>
+          <w:tcPr>
+            <w:tcW w:type="dxa" w:w="2351"/>
+          </w:tcPr>
+          <w:p>
+            <w:r>
+              <w:t>18:31</w:t>
+            </w:r>
+          </w:p>
+        </w:tc>
+      </w:tr>
+      <w:tr>
+        <w:tc>
+          <w:tcPr>
+            <w:tcW w:type="dxa" w:w="2351"/>
+          </w:tcPr>
+          <w:p>
+            <w:r>
+              <w:t>39</w:t>
+            </w:r>
+          </w:p>
+        </w:tc>
+        <w:tc>
+          <w:tcPr>
+            <w:tcW w:type="dxa" w:w="2351"/>
+          </w:tcPr>
+          <w:p>
+            <w:r>
+              <w:t>Rugosidade tecnológica: perda ou ausência?</w:t>
+            </w:r>
+          </w:p>
+        </w:tc>
+        <w:tc>
+          <w:tcPr>
+            <w:tcW w:type="dxa" w:w="2351"/>
+          </w:tcPr>
+          <w:p>
+            <w:r>
+              <w:t>0:30</w:t>
+            </w:r>
+          </w:p>
+        </w:tc>
+        <w:tc>
+          <w:tcPr>
+            <w:tcW w:type="dxa" w:w="2351"/>
+          </w:tcPr>
+          <w:p>
+            <w:r>
+              <w:t>19:01</w:t>
+            </w:r>
+          </w:p>
+        </w:tc>
+      </w:tr>
+      <w:tr>
+        <w:tc>
+          <w:tcPr>
+            <w:tcW w:type="dxa" w:w="2351"/>
+          </w:tcPr>
+          <w:p>
+            <w:r>
+              <w:t>40</w:t>
+            </w:r>
+          </w:p>
+        </w:tc>
+        <w:tc>
+          <w:tcPr>
+            <w:tcW w:type="dxa" w:w="2351"/>
+          </w:tcPr>
+          <w:p>
+            <w:r>
+              <w:t>Contribuições analíticas do capítulo</w:t>
+            </w:r>
+          </w:p>
+        </w:tc>
+        <w:tc>
+          <w:tcPr>
+            <w:tcW w:type="dxa" w:w="2351"/>
+          </w:tcPr>
+          <w:p>
+            <w:r>
+              <w:t>0:14</w:t>
+            </w:r>
+          </w:p>
+        </w:tc>
+        <w:tc>
+          <w:tcPr>
+            <w:tcW w:type="dxa" w:w="2351"/>
+          </w:tcPr>
+          <w:p>
+            <w:r>
+              <w:t>19:15</w:t>
+            </w:r>
+          </w:p>
+        </w:tc>
+      </w:tr>
+      <w:tr>
+        <w:tc>
+          <w:tcPr>
+            <w:tcW w:type="dxa" w:w="2351"/>
+          </w:tcPr>
+          <w:p>
+            <w:r>
+              <w:t>41</w:t>
+            </w:r>
+          </w:p>
+        </w:tc>
+        <w:tc>
+          <w:tcPr>
+            <w:tcW w:type="dxa" w:w="2351"/>
+          </w:tcPr>
+          <w:p>
+            <w:r>
+              <w:t>Parte VI – O que ainda falta</w:t>
+            </w:r>
+          </w:p>
+        </w:tc>
+        <w:tc>
+          <w:tcPr>
+            <w:tcW w:type="dxa" w:w="2351"/>
+          </w:tcPr>
+          <w:p>
+            <w:r>
+              <w:t>0:05</w:t>
+            </w:r>
+          </w:p>
+        </w:tc>
+        <w:tc>
+          <w:tcPr>
+            <w:tcW w:type="dxa" w:w="2351"/>
+          </w:tcPr>
+          <w:p>
+            <w:r>
+              <w:t>19:20</w:t>
+            </w:r>
+          </w:p>
+        </w:tc>
+      </w:tr>
+      <w:tr>
+        <w:tc>
+          <w:tcPr>
+            <w:tcW w:type="dxa" w:w="2351"/>
+          </w:tcPr>
+          <w:p>
+            <w:r>
+              <w:t>42</w:t>
+            </w:r>
+          </w:p>
+        </w:tc>
+        <w:tc>
+          <w:tcPr>
+            <w:tcW w:type="dxa" w:w="2351"/>
+          </w:tcPr>
+          <w:p>
+            <w:r>
+              <w:t>Onde estamos e o que falta</w:t>
+            </w:r>
+          </w:p>
+        </w:tc>
+        <w:tc>
+          <w:tcPr>
+            <w:tcW w:type="dxa" w:w="2351"/>
+          </w:tcPr>
+          <w:p>
+            <w:r>
+              <w:t>0:26</w:t>
+            </w:r>
+          </w:p>
+        </w:tc>
+        <w:tc>
+          <w:tcPr>
+            <w:tcW w:type="dxa" w:w="2351"/>
+          </w:tcPr>
+          <w:p>
+            <w:r>
+              <w:t>19:46</w:t>
+            </w:r>
+          </w:p>
+        </w:tc>
+      </w:tr>
+      <w:tr>
+        <w:tc>
+          <w:tcPr>
+            <w:tcW w:type="dxa" w:w="2351"/>
+          </w:tcPr>
+          <w:p>
+            <w:r>
+              <w:t>43</w:t>
+            </w:r>
+          </w:p>
+        </w:tc>
+        <w:tc>
+          <w:tcPr>
+            <w:tcW w:type="dxa" w:w="2351"/>
+          </w:tcPr>
+          <w:p>
+            <w:r>
+              <w:t>A questão aberta / Agradecimento</w:t>
+            </w:r>
+          </w:p>
+        </w:tc>
+        <w:tc>
+          <w:tcPr>
+            <w:tcW w:type="dxa" w:w="2351"/>
+          </w:tcPr>
+          <w:p>
+            <w:r>
+              <w:t>0:35</w:t>
+            </w:r>
+          </w:p>
+        </w:tc>
+        <w:tc>
+          <w:tcPr>
+            <w:tcW w:type="dxa" w:w="2351"/>
+          </w:tcPr>
+          <w:p>
+            <w:r>
+              <w:t>20:21</w:t>
+            </w:r>
+          </w:p>
+        </w:tc>
+      </w:tr>
+      <w:tr>
+        <w:tc>
+          <w:tcPr>
+            <w:tcW w:type="dxa" w:w="2351"/>
+          </w:tcPr>
+          <w:p>
+            <w:r>
+              <w:t>44</w:t>
             </w:r>
           </w:p>
         </w:tc>
@@ -1345,7 +1933,7 @@
     </w:p>
     <w:p>
       <w:r>
-        <w:t>Bom dia a todas e a todos. Agradeço à banca pela leitura cuidadosa e à minha orientadora, professora Maria Cristina Leandro de Paiva. Apresento a qualificação da tese “A política no canteiro da prática”, sobre a chegada do eixo Educação Digital Escolar da PNED aos anos iniciais de uma escola pública de Pipa, em Tibau do Sul.</w:t>
+        <w:t>Bom dia a todas e a todos. Quero começar agradecendo à banca pela leitura atenta e à minha orientadora, a professora Maria Cristina. A pesquisa que vou apresentar se chama “A política no canteiro da prática”. Em poucas palavras, ela quer entender o que acontece quando uma lei nacional sobre educação digital chega numa escola pública de verdade, com as condições que essa escola tem.</w:t>
       </w:r>
     </w:p>
     <w:p>
@@ -1353,12 +1941,12 @@
         <w:pStyle w:val="Heading2"/>
       </w:pPr>
       <w:r>
-        <w:t>Slide 2 – Percurso da apresentação  (0:19; acumulado 0:53)</w:t>
+        <w:t>Slide 2 – Percurso da apresentação  (0:24; acumulado 0:58)</w:t>
       </w:r>
     </w:p>
     <w:p>
       <w:r>
-        <w:t>A fala tem seis partes: a proposta da tese, a revisão sistemática, a metodologia, a agenda internacional e a PNED, o território e a escola, e o que ainda falta.</w:t>
+        <w:t>Para vocês se localizarem, a fala está dividida em seis partes: primeiro a proposta da tese; depois a revisão sistemática; a metodologia; a agenda internacional e a lei brasileira; o território de Pipa e a escola; e, no fim, o que ainda falta fazer.</w:t>
       </w:r>
     </w:p>
     <w:p>
@@ -1366,12 +1954,12 @@
         <w:pStyle w:val="Heading2"/>
       </w:pPr>
       <w:r>
-        <w:t>Slide 3 – A tese em uma imagem: o vazio material  (1:18; acumulado 2:11)</w:t>
+        <w:t>Slide 3 – Trajetória: de onde parto  (0:58; acumulado 1:56)</w:t>
       </w:r>
     </w:p>
     <w:p>
       <w:r>
-        <w:t>Começo pela síntese. O objeto é a implementação do eixo Educação Digital Escolar nas turmas de 1º e 2º anos da Escola Municipal Domitila Castelo. A Lei nº 14.533, de 2023, fez da educação digital um direito, um dever do Estado e um componente curricular. O problema está na distância entre esse direito e os meios garantidos: formação, rede e tempo de planejamento não estão assegurados pela norma e acabam sendo construídos no dia a dia da escola. Daí a questão norteadora: como ocorre essa implementação, considerando a interpretação, a tradução e a recontextualização feitas pelos profissionais no contexto da prática. A imagem é ilustrativa e foi gerada por inteligência artificial. Dito de outro modo, a tese pergunta o que acontece com uma política quando o direito chega antes dos meios, e quem, na escola, ocupa esse intervalo.</w:t>
+        <w:t>Antes de falar da pesquisa, preciso dizer de onde eu falo, porque isso pesa. Eu convivo com Pipa há quase vinte anos e trabalhei dezoito anos na rede municipal de Tibau do Sul. No mestrado, pesquisei essa mesma escola durante o ensino remoto, e um dado me marcou: setenta por cento das crianças da turma dividiam o celular com os pais. O doutorado continua essa história, agora diante de uma lei nova. Como conheço muito o lugar, criei uma regra para mim mesma: memória não é dado. O que eu sei por ter vivido orienta o meu olhar, mas o que entra como prova na tese vem dos instrumentos de pesquisa.</w:t>
       </w:r>
     </w:p>
     <w:p>
@@ -1379,12 +1967,12 @@
         <w:pStyle w:val="Heading2"/>
       </w:pPr>
       <w:r>
-        <w:t>Slide 4 – Trajetória: de onde parto  (0:58; acumulado 3:09)</w:t>
+        <w:t>Slide 4 – Relevâncias da pesquisa  (0:19; acumulado 2:15)</w:t>
       </w:r>
     </w:p>
     <w:p>
       <w:r>
-        <w:t>Falo de dentro. Convivo com Pipa há quase duas décadas, trabalhei dezoito anos na rede municipal e fiz o mestrado na mesma escola, no ensino remoto, quando 70% das crianças dividiam o celular com os pais. Por isso fixei uma regra: a memória não é dado. A trajetória orienta o olhar; as evidências vêm dos instrumentos. O diário de campo registra o percurso, mas não é uma quinta fonte. Como o município é um dos entes a quem a lei distribui a provisão dos meios, preciso também cuidar para que minha posição não limite a liberdade dos participantes nas entrevistas.</w:t>
+        <w:t>Além da relevância pessoal, há a científica, porque a lei ainda não foi estudada na prática nos anos iniciais, e a social, porque falamos de cidadania e de proteção das crianças no mundo digital.</w:t>
       </w:r>
     </w:p>
     <w:p>
@@ -1392,12 +1980,12 @@
         <w:pStyle w:val="Heading2"/>
       </w:pPr>
       <w:r>
-        <w:t>Slide 5 – O objeto e o recorte  (0:45; acumulado 3:54)</w:t>
+        <w:t>Slide 5 – Parte I – A proposta da tese  (0:06; acumulado 2:21)</w:t>
       </w:r>
     </w:p>
     <w:p>
       <w:r>
-        <w:t>Escolhi o 1º e o 2º anos porque a mesma professora acompanha a turma o dia todo, e a decisão sobre a educação digital tem autoria identificável. É também a entrada no Ensino Fundamental, com crianças de experiências digitais muito desiguais. Ficam de fora a avaliação da aprendizagem e a observação de aulas; plataformização e dados entram só como contexto. As crianças não participam da produção de dados; suas experiências chegam pelas condições que os profissionais encontram.</w:t>
+        <w:t>Entro agora na primeira parte, a proposta da tese.</w:t>
       </w:r>
     </w:p>
     <w:p>
@@ -1405,12 +1993,12 @@
         <w:pStyle w:val="Heading2"/>
       </w:pPr>
       <w:r>
-        <w:t>Slide 6 – Do portão para fora, do portão para dentro  (0:46; acumulado 4:40)</w:t>
+        <w:t>Slide 6 – Estrutura da tese  (0:25; acumulado 2:46)</w:t>
       </w:r>
     </w:p>
     <w:p>
       <w:r>
-        <w:t>Do portão para fora, Pipa vende hospedagem e passeios pela internet. Do portão para dentro, o laboratório aparece com os computadores desligados e as salas de 1º e 2º anos não têm nenhum dispositivo. O mesmo território reúne alta conectividade e uma escola sem esses recursos nas mesmas condições. Os dados nacionais apontam na mesma direção: a conexão chegou à maioria das escolas brasileiras, mas os computadores para os alunos não cresceram na mesma medida, sobretudo nas escolas rurais.</w:t>
+        <w:t>A tese tem oito capítulos. Já estão escritos a introdução, a revisão, a metodologia, o capítulo da lei e o do território. O capítulo três, sobre cultura digital, está em construção, e o sete e o oito dependem do trabalho de campo, que ainda vai acontecer.</w:t>
       </w:r>
     </w:p>
     <w:p>
@@ -1418,12 +2006,12 @@
         <w:pStyle w:val="Heading2"/>
       </w:pPr>
       <w:r>
-        <w:t>Slide 7 – Questão norteadora e objetivos  (0:46; acumulado 5:26)</w:t>
+        <w:t>Slide 7 – A tese em uma imagem: o vazio material  (1:02; acumulado 3:48)</w:t>
       </w:r>
     </w:p>
     <w:p>
       <w:r>
-        <w:t>Os três objetivos específicos seguem a ordem da análise: o que a política promete e com que meios, no Capítulo 5; que condições recebem a política em Pipa, no Capítulo 6; e o que os profissionais fazem com a distância entre a norma e as condições, no Capítulo 7, depois do campo. O objetivo geral reúne os três: analisar a implementação do eixo considerando a norma, as condições institucionais e territoriais e o trabalho de interpretação dos profissionais.</w:t>
+        <w:t>Se eu tivesse que resumir a tese numa frase, seria esta: a lei promete muito e garante pouco. Explico. A Lei 14.533, de 2023, criou a Política Nacional de Educação Digital, que vou chamar de PNED. Ela transformou a educação digital num direito, num dever do Estado e numa disciplina obrigatória do ensino fundamental. Só que ela não garante o que é preciso para isso acontecer: formação para as professoras, internet que funcione na sala e tempo para planejar. Essas coisas acabam sendo resolvidas, ou não, no dia a dia da escola. Por isso a minha pergunta é: como essa política acontece de fato nos anos iniciais, a partir do jeito como os profissionais a entendem e a adaptam?</w:t>
       </w:r>
     </w:p>
     <w:p>
@@ -1431,12 +2019,12 @@
         <w:pStyle w:val="Heading2"/>
       </w:pPr>
       <w:r>
-        <w:t>Slide 8 – Contribuição inédita: discricionariedade substitutiva  (0:50; acumulado 6:16)</w:t>
+        <w:t>Slide 8 – O objeto e o recorte  (0:54; acumulado 4:42)</w:t>
       </w:r>
     </w:p>
     <w:p>
       <w:r>
-        <w:t>Lipsky descreve a discricionariedade diante de recursos escassos: fila, revezamento, racionamento; decide-se quem recebe. Em Pipa pode ser diferente. Quando o direito é declarado e os meios não chegam, a decisão pode recair sobre o que não existe, e a profissional supre a falta com aparelho, internet, material, conhecimento ou tempo próprios. Mudam o objeto da decisão e quem paga por ela. É uma proposição, e não um achado. Por isso fixei, antes de qualquer entrevista, as condições em que terei de confirmá-la, delimitá-la, renomeá-la ou abandoná-la.</w:t>
+        <w:t>Por que escolhi o 1º e o 2º anos? Porque nessas turmas a mesma professora fica com as crianças o dia inteiro. Então, se a educação digital acontece ou não, dá para saber quem decidiu e por quê. Também é o momento em que a criança entra na escola, e muitas já mexem no celular. Mas mexer no celular não é o mesmo que entender o mundo digital, os riscos e os direitos. É isso que a escola tem de ensinar. Deixo claro o que fica de fora: não avalio a aprendizagem das crianças, não observo aulas e as crianças não são entrevistadas.</w:t>
       </w:r>
     </w:p>
     <w:p>
@@ -1444,12 +2032,12 @@
         <w:pStyle w:val="Heading2"/>
       </w:pPr>
       <w:r>
-        <w:t>Slide 9 – Três componentes e os riscos a analisar  (0:32; acumulado 6:48)</w:t>
+        <w:t>Slide 9 – Justificativa  (0:35; acumulado 5:17)</w:t>
       </w:r>
     </w:p>
     <w:p>
       <w:r>
-        <w:t>A categoria tem três componentes: não há recurso a distribuir; há substituição com meios próprios; e há custo pessoal, assumido diante de crianças e famílias que a professora reencontra no território. Os riscos, como a variação do eixo entre turmas e o uso de aparelhos pessoais com crianças, serão analisados, e não presumidos.</w:t>
+        <w:t>Por que vale a pena estudar isso? Primeiro, pelo que a lei promete às crianças: participação consciente no mundo digital e proteção dos seus dados. Segundo, porque quem faz a política acontecer são pessoas: professoras, coordenação, direção, Secretaria. E terceiro, pelo território. Pipa reúne famílias de moradores antigos, migrantes, estrangeiros e trabalhadores do turismo, e essas crianças chegam à mesma sala com experiências digitais muito diferentes.</w:t>
       </w:r>
     </w:p>
     <w:p>
@@ -1457,12 +2045,12 @@
         <w:pStyle w:val="Heading2"/>
       </w:pPr>
       <w:r>
-        <w:t>Slide 10 – Três formulações, dois estatutos  (0:21; acumulado 7:09)</w:t>
+        <w:t>Slide 10 – Problematização: do portão para fora, do portão para dentro  (0:32; acumulado 5:49)</w:t>
       </w:r>
     </w:p>
     <w:p>
       <w:r>
-        <w:t>A tese trabalha com três formulações, mas com estatutos diferentes. Habitar digital e rugosidade tecnológica são condições documentadas no Capítulo 6. A discricionariedade substitutiva é uma hipótese, a única em jogo nas entrevistas.</w:t>
+        <w:t>Esta imagem mostra bem o problema. Do portão para fora, Pipa é um destino turístico conectado: pousada, restaurante e passeio, tudo se vende pela internet. Do portão para dentro, quando fotografei o laboratório da escola, os computadores estavam desligados, e nas salas do 1º e do 2º ano não havia nenhum aparelho. É o mesmo lugar, com duas realidades muito diferentes.</w:t>
       </w:r>
     </w:p>
     <w:p>
@@ -1470,12 +2058,12 @@
         <w:pStyle w:val="Heading2"/>
       </w:pPr>
       <w:r>
-        <w:t>Slide 11 – O motor teórico: duas engrenagens e o fosso  (0:56; acumulado 8:05)</w:t>
+        <w:t>Slide 11 – Questão norteadora e objetivos  (0:36; acumulado 6:25)</w:t>
       </w:r>
     </w:p>
     <w:p>
       <w:r>
-        <w:t>O quadro teórico tem duas engrenagens. O Ciclo de Políticas mostra que a política é recriada no contexto da prática; Lipsky mostra que a decisão na ponta vira a política praticada. O encaixe é a recontextualização. O fosso aparece porque as duas supõem que os meios existem, e nenhuma nomeia a decisão sobre o que não existe. É aí que situo a contribuição. A ACP pensa a recriação da política em relação aos meios disponíveis; Lipsky, o racionamento de um serviço que existe. Quando o meio simplesmente não chega, falta nome para a decisão que se toma.</w:t>
+        <w:t>Para responder à pergunta, tenho três objetivos, e cada um vira um capítulo. O primeiro olha para a lei: o que ela promete e com que meios. O segundo olha para o território e para a escola: que condições recebem essa política. E o terceiro olha para as pessoas: o que os profissionais fazem com a distância entre o que a lei pede e o que eles têm.</w:t>
       </w:r>
     </w:p>
     <w:p>
@@ -1483,12 +2071,12 @@
         <w:pStyle w:val="Heading2"/>
       </w:pPr>
       <w:r>
-        <w:t>Slide 12 – A tessitura: os fios que sustentam a tese  (0:27; acumulado 8:32)</w:t>
+        <w:t>Slide 12 – Contribuição inédita: discricionariedade substitutiva  (1:02; acumulado 7:27)</w:t>
       </w:r>
     </w:p>
     <w:p>
       <w:r>
-        <w:t>Este slide mostra onde cada frente teórica sustenta os capítulos: política como processo, decisão na ponta, território e lugar, com Santos e Massey, cultura e tempo, condições de trabalho e posição de método. Zuboff e Morozov entram como contexto, e não como objeto empírico.</w:t>
+        <w:t>Aqui está a principal contribuição da tese, e vou explicar o nome com calma. Discricionariedade é a margem que o servidor público tem para decidir no dia a dia. O autor que estudou isso, Michael Lipsky, mostrou que, quando o recurso é pouco, quem atende o público decide quem recebe primeiro: faz fila, revezamento, racionamento. Só que, na escola de Pipa, muitas vezes não há nem o que racionar. Então a decisão muda de natureza: a professora decide se vai usar o próprio celular, a própria internet, o próprio tempo para fazer acontecer o que a lei prometeu. Chamei isso de discricionariedade substitutiva, porque o profissional substitui com meios próprios aquilo que o Estado não entregou. Por enquanto, é uma hipótese.</w:t>
       </w:r>
     </w:p>
     <w:p>
@@ -1496,12 +2084,12 @@
         <w:pStyle w:val="Heading2"/>
       </w:pPr>
       <w:r>
-        <w:t>Slide 13 – Onde os referenciais deixam de cobrir o caso  (0:22; acumulado 8:54)</w:t>
+        <w:t>Slide 13 – Três componentes e os riscos a analisar  (0:30; acumulado 7:57)</w:t>
       </w:r>
     </w:p>
     <w:p>
       <w:r>
-        <w:t>Em resumo: o Ciclo de Políticas supõe que os meios existam; Lipsky pensou em serviços de atendimento em massa. Em Pipa, não há dispositivos para racionar, e a decisão acontece diante de famílias conhecidas.</w:t>
+        <w:t>Para não ser só uma ideia solta, a categoria tem três componentes que precisam aparecer juntos: não há recurso para distribuir; o profissional usa meios próprios; e paga um custo pessoal, diante de famílias que ele encontra na rua no dia seguinte. E vou observar um risco: a falta ficar escondida justamente porque alguém a cobriu.</w:t>
       </w:r>
     </w:p>
     <w:p>
@@ -1509,12 +2097,12 @@
         <w:pStyle w:val="Heading2"/>
       </w:pPr>
       <w:r>
-        <w:t>Slide 14 – A revisão sistemática: questão e resposta  (0:58; acumulado 9:52)</w:t>
+        <w:t>Slide 14 – Três formulações, dois estatutos  (0:14; acumulado 8:11)</w:t>
       </w:r>
     </w:p>
     <w:p>
       <w:r>
-        <w:t>A revisão seguiu a PRISMA 2020 em sete bases e chegou a nove estudos. A atuação dessas políticas depende da articulação entre recursos, condições institucionais e trabalho dos profissionais. A evidência é forte sobre as condições e os profissionais, e frágil sobre cultura digital e cidadania. Nenhum estudo trata da PNED nem de rede municipal de pequeno porte, e nenhum acompanha o que os profissionais fazem quando a formação não chega. Esses vazios são esperados, porque a norma é recente e a implementação curricular só se tornou obrigatória em 2026, mas são eles que dão lugar ao objeto desta tese.</w:t>
+        <w:t>Das três ideias da tese, duas já foram documentadas, o habitar digital e a rugosidade tecnológica; a terceira, a discricionariedade substitutiva, ainda é hipótese.</w:t>
       </w:r>
     </w:p>
     <w:p>
@@ -1522,12 +2110,12 @@
         <w:pStyle w:val="Heading2"/>
       </w:pPr>
       <w:r>
-        <w:t>Slide 15 – Desenho: estudo de caso único, qualitativo  (0:37; acumulado 10:29)</w:t>
+        <w:t>Slide 15 – Onde os referenciais deixam de cobrir o caso  (0:25; acumulado 8:36)</w:t>
       </w:r>
     </w:p>
     <w:p>
       <w:r>
-        <w:t>É um estudo de caso único e qualitativo, com análise temática reflexiva. O registro iconográfico, com 38 figuras, já foi feito; os documentos, o questionário e as entrevistas vêm depois da emenda aprovada pelo Comitê de Ética. Serão doze participantes: seis professoras em regência, quatro da coordenação, uma pessoa da direção e uma da Secretaria, posições postas em relação, sem hierarquia prévia.</w:t>
+        <w:t>Por que criar uma categoria nova? Porque os autores que uso pensaram situações em que os meios existem, mesmo que sejam poucos. Lipsky estudou grandes serviços, com atendimento em massa. Em Pipa, numa escola pequena, não há aparelhos para dividir, e quem decide conhece cada família.</w:t>
       </w:r>
     </w:p>
     <w:p>
@@ -1535,12 +2123,12 @@
         <w:pStyle w:val="Heading2"/>
       </w:pPr>
       <w:r>
-        <w:t>Slide 16 – Como a categoria pode falhar  (0:41; acumulado 11:10)</w:t>
+        <w:t>Slide 16 – O motor teórico: duas engrenagens e o fosso entre elas  (0:58; acumulado 9:34)</w:t>
       </w:r>
     </w:p>
     <w:p>
       <w:r>
-        <w:t>Os critérios foram registrados antes do campo. A categoria se confirma com recorrência e sem indução; fica delimitada se aparecer só na regência; muda de nome se não houver alternativa, porque aí é transferência de custo; e é recusada se houver fila pelo kit multimídia, leitura da lei apenas como ambígua ou ausência de meios próprios. Recusar também é resultado. No Capítulo 7, direi qual dessas situações se verificou.</w:t>
+        <w:t>Gosto de pensar a teoria como duas engrenagens. A primeira é a Abordagem do Ciclo de Políticas, de Stephen Ball e colegas, trazida ao Brasil por Mainardes. Ela diz que uma lei não é simplesmente aplicada: na escola, ela é lida, interpretada e recriada. A segunda é a burocracia de nível de rua, de Lipsky, que mostra que as decisões de quem está na ponta acabam virando a política que existe de fato. As duas se encaixam na ideia de recontextualização, que é a política ganhando sentidos próprios em cada lugar. Mas entre elas há um vão: nenhuma explica a decisão sobre aquilo que não chegou. É nesse vão que a tese entra.</w:t>
       </w:r>
     </w:p>
     <w:p>
@@ -1548,12 +2136,12 @@
         <w:pStyle w:val="Heading2"/>
       </w:pPr>
       <w:r>
-        <w:t>Slide 17 – A agenda internacional: das presenças às condições  (0:49; acumulado 11:59)</w:t>
+        <w:t>Slide 17 – Como a categoria pode falhar  (0:30; acumulado 10:04)</w:t>
       </w:r>
     </w:p>
     <w:p>
       <w:r>
-        <w:t>No Capítulo 5, começo pelos organismos internacionais. A UNESCO lembra que uma em cada quatro escolas primárias do mundo não tem eletricidade; a OCDE considera misto o impacto dos computadores sobre o desempenho; o Banco Mundial pergunta qual é o problema educacional antes da tecnologia. Os três tiram o foco da presença dos recursos e o colocam nas condições de uso. Esses documentos não chegam ao Brasil como aplicação automática; entre o que formulam e o que cada país incorpora há disputa e reinterpretação.</w:t>
+        <w:t>Uma hipótese só vale se puder ser derrubada. Por isso, antes de entrevistar qualquer pessoa, registrei por escrito o que vai confirmar, limitar, mudar o nome ou recusar a categoria. Por exemplo: se houver fila para usar o kit multimídia, isso é a discricionariedade comum, de Lipsky. Recusar a hipótese também é resultado de pesquisa.</w:t>
       </w:r>
     </w:p>
     <w:p>
@@ -1561,12 +2149,12 @@
         <w:pStyle w:val="Heading2"/>
       </w:pPr>
       <w:r>
-        <w:t>Slide 18 – Mapa das políticas de educação digital  (0:16; acumulado 12:15)</w:t>
+        <w:t>Slide 18 – Ética, posição e reflexividade  (0:18; acumulado 10:22)</w:t>
       </w:r>
     </w:p>
     <w:p>
       <w:r>
-        <w:t>Li dezenove experiências na Europa e nas Américas, sem buscar modelos para importar. A cor indica a categoria que cada experiência mais informa.</w:t>
+        <w:t>Sobre ética: pseudônimos escolhidos pelos participantes e nenhuma foto com rosto de criança. E uma postura: o improviso não é virtude nem culpa da professora, é sinal das condições em que ela trabalha.</w:t>
       </w:r>
     </w:p>
     <w:p>
@@ -1574,12 +2162,12 @@
         <w:pStyle w:val="Heading2"/>
       </w:pPr>
       <w:r>
-        <w:t>Slide 19 – O que essas experiências trazem para a tese  (0:39; acumulado 12:54)</w:t>
+        <w:t>Slide 19 – A tessitura: os fios que sustentam a tese  (0:10; acumulado 10:32)</w:t>
       </w:r>
     </w:p>
     <w:p>
       <w:r>
-        <w:t>Delas saem cinco categorias sensibilizadoras: governança, formação, infraestrutura, continuidade institucional e cultura digital. Equalizar equipamentos não equalizou usos; laptops não resolveram a conexão rural; a continuidade separou o Ceibal das reversões argentinas. Cada categoria vira uma pergunta para o campo em Pipa. Que formação chegou à escola? Com que equipamentos se trabalha? Que continuidade a rede teve? Nenhuma dessas lições descreve Pipa; elas servem de lente.</w:t>
+        <w:t>Aqui estão os fios teóricos da tese e os capítulos em que cada um aparece.</w:t>
       </w:r>
     </w:p>
     <w:p>
@@ -1587,12 +2175,12 @@
         <w:pStyle w:val="Heading2"/>
       </w:pPr>
       <w:r>
-        <w:t>Slide 20 – Quatro décadas até a PNED  (0:32; acumulado 13:26)</w:t>
+        <w:t>Slide 20 – Parte II – Revisão sistemática  (0:10; acumulado 10:42)</w:t>
       </w:r>
     </w:p>
     <w:p>
       <w:r>
-        <w:t>No Brasil, do EDUCOM à PNED, as ênfases mudaram, mas as tensões se repetem: manutenção, suporte, reposição, conectividade desigual e cultura digital sem componente próprio. Cada programa deixou equipamentos nas escolas. Parte deles continua lá depois do fim das ações, o que liga essa trajetória à noção de rugosidade que discuto no Capítulo 6.</w:t>
+        <w:t>Passo para a segunda parte: o que a produção científica já sabe sobre o tema.</w:t>
       </w:r>
     </w:p>
     <w:p>
@@ -1600,12 +2188,12 @@
         <w:pStyle w:val="Heading2"/>
       </w:pPr>
       <w:r>
-        <w:t>Slide 21 – Por que a PNED importa  (0:27; acumulado 13:53)</w:t>
+        <w:t>Slide 21 – A RSL: questão norteadora e resposta  (0:50; acumulado 11:32)</w:t>
       </w:r>
     </w:p>
     <w:p>
       <w:r>
-        <w:t>A lei tem méritos: deu à educação digital estatuto de política nacional, tornou-a componente curricular e dever do Estado e ligou-a aos direitos das crianças. Uma de suas melhores passagens pede que a tecnologia fortaleça o papel de quem ensina e de quem aprende.</w:t>
+        <w:t>Fiz uma revisão sistemática, que é uma busca organizada, com regras fixas e registradas, para que outra pessoa possa repetir o caminho. Segui o protocolo PRISMA, consultei sete bases e, de 176 trabalhos encontrados, nove atendiam aos critérios. O que eles mostram? Que essas políticas dependem de recursos, de condições da escola e do trabalho dos profissionais, que interpretam a política. Mas o mais importante é o que falta: nenhum estudo trata da PNED, só um olha para a alfabetização e nenhum estuda rede municipal pequena. É nesse espaço vazio que a tese se coloca.</w:t>
       </w:r>
     </w:p>
     <w:p>
@@ -1613,12 +2201,12 @@
         <w:pStyle w:val="Heading2"/>
       </w:pPr>
       <w:r>
-        <w:t>Slide 22 – A PNED e o calendário da exigência  (0:19; acumulado 14:12)</w:t>
+        <w:t>Slide 22 – Parte III – Metodologia  (0:06; acumulado 11:38)</w:t>
       </w:r>
     </w:p>
     <w:p>
       <w:r>
-        <w:t>O calendário mostra a pressa da exigência: veto em janeiro de 2023, derrubada em dezembro, resolução do CNE em 2025 e implementação obrigatória em 2026, justamente quando a pesquisa acontece.</w:t>
+        <w:t>Agora, como a pesquisa vai ser feita.</w:t>
       </w:r>
     </w:p>
     <w:p>
@@ -1626,12 +2214,12 @@
         <w:pStyle w:val="Heading2"/>
       </w:pPr>
       <w:r>
-        <w:t>Slide 23 – A promessa e o desenho  (0:53; acumulado 15:05)</w:t>
+        <w:t>Slide 23 – Desenho: estudo de caso único, qualitativo  (0:32; acumulado 12:10)</w:t>
       </w:r>
     </w:p>
     <w:p>
       <w:r>
-        <w:t>Este é o achado central do capítulo. A PNED é instância de articulação; a inclusão digital depende dos limites orçamentários de cada órgão; não há fundo próprio nem transferência obrigatória aos municípios; e a formação aparece como promoção, sem responsáveis nem custeio. Chamo isso de vazio material: a exigência tem data marcada, e os meios não. Numa rede pequena, a falta não para na Secretaria; chega à sala de aula, onde a professora continua responsável pelo componente, com ou sem os meios. É aí que o financiamento se liga à discricionariedade substitutiva.</w:t>
+        <w:t>É um estudo de caso de uma única escola, com abordagem qualitativa, ou seja, o interesse está nos sentidos e nas decisões, e não em números. Uso quatro fontes: fotografias, que já fiz; documentos da escola e da rede; um questionário; e entrevistas. O questionário e as entrevistas só começam depois que o Comitê de Ética aprovar a emenda.</w:t>
       </w:r>
     </w:p>
     <w:p>
@@ -1639,12 +2227,12 @@
         <w:pStyle w:val="Heading2"/>
       </w:pPr>
       <w:r>
-        <w:t>Slide 24 – A antiga Pipa: trabalho, moradia e mar  (0:31; acumulado 15:36)</w:t>
+        <w:t>Slide 24 – Quem será ouvido  (0:24; acumulado 12:34)</w:t>
       </w:r>
     </w:p>
     <w:p>
       <w:r>
-        <w:t>No Capítulo 6, as imagens do Museu Digital de Pipa mostram um território em que trabalho, moradia e mar estavam próximos. Com Santos e Massey, leio essas formas sem nostalgia. O barco construído junto às casas, as embarcações na maré baixa e o mutirão do curral mostram saberes aprendidos no próprio fazer.</w:t>
+        <w:t>Vou ouvir doze pessoas: seis professoras dos 1º e 2º anos, quatro da coordenação, uma da direção e uma da Secretaria de Educação. Ouço posições diferentes porque cada uma recebe a lei de um jeito. Atrás dessas doze pessoas estão cento e quarenta crianças.</w:t>
       </w:r>
     </w:p>
     <w:p>
@@ -1652,12 +2240,12 @@
         <w:pStyle w:val="Heading2"/>
       </w:pPr>
       <w:r>
-        <w:t>Slide 25 – A Pipa de hoje: um território conectado  (0:50; acumulado 16:26)</w:t>
+        <w:t>Slide 25 – Parte IV – Agenda internacional e PNED  (0:09; acumulado 12:43)</w:t>
       </w:r>
     </w:p>
     <w:p>
       <w:r>
-        <w:t>A Pipa de hoje é atravessada pelos circuitos do turismo, de reservas a pagamentos, distribuídos de modo desigual. Incluí nesta revisão uma fotografia atual: um pescador descarregando o pescado, com lanchas e escunas ao fundo. A pesca não foi substituída pelo turismo; divide com ele o mesmo mar, e o barco de madeira recebeu motor de popa. A foto prova presença, e não escala, mas mostra que as crianças da escola vêm de famílias com relações muito diferentes com o mar, o trabalho e as tecnologias.</w:t>
+        <w:t>Na quarta parte, olho para a lei e para o que veio de fora.</w:t>
       </w:r>
     </w:p>
     <w:p>
@@ -1665,12 +2253,12 @@
         <w:pStyle w:val="Heading2"/>
       </w:pPr>
       <w:r>
-        <w:t>Slide 26 – Na escola: o que existe e onde está  (0:46; acumulado 17:12)</w:t>
+        <w:t>Slide 26 – A agenda internacional: das presenças às condições  (0:40; acumulado 13:23)</w:t>
       </w:r>
     </w:p>
     <w:p>
       <w:r>
-        <w:t>Na escola, o laboratório tinha os computadores desligados; segundo informações preliminares, há duas conexões e um único kit multimídia; nas salas de 1º e 2º anos, nenhum dispositivo, só recursos impressos e feitos à mão. Tudo isso será verificado na análise documental. Chamo de rugosidade tecnológica essa permanência de equipamentos de uma iniciativa anterior, aos quais a PNED atribui nova função, e a pergunta é se o laboratório perdeu sua função ou se ela nunca chegou a se constituir.</w:t>
+        <w:t>Comecei pelos organismos internacionais. A UNESCO lembra que uma em cada quatro escolas primárias do mundo não tem nem eletricidade. A OCDE diz que o efeito dos computadores no desempenho é, na melhor das hipóteses, misto. E o Banco Mundial faz uma pergunta muito boa: se a tecnologia é a resposta, qual é a pergunta? O recado dos três é parecido: não basta ter o equipamento; importam as condições e para que ele é usado.</w:t>
       </w:r>
     </w:p>
     <w:p>
@@ -1678,12 +2266,12 @@
         <w:pStyle w:val="Heading2"/>
       </w:pPr>
       <w:r>
-        <w:t>Slide 27 – Onde estamos e o que falta  (0:22; acumulado 17:34)</w:t>
+        <w:t>Slide 27 – Mapa das políticas de educação digital  (0:22; acumulado 13:45)</w:t>
       </w:r>
     </w:p>
     <w:p>
       <w:r>
-        <w:t>Os Capítulos 2, 4 e 5 estão construídos, o 6 em boa parte, e o 3 em construção. Faltam a emenda ao Comitê de Ética, a análise documental e o campo, planejado para dez semanas.</w:t>
+        <w:t>Depois, analisei dezenove experiências na Europa e nas Américas. Não fui buscar modelos para copiar. Fui buscar lentes, ou seja, questões que me ajudam a enxergar melhor o caso brasileiro. As cores indicam o que cada país mais ensina.</w:t>
       </w:r>
     </w:p>
     <w:p>
@@ -1691,12 +2279,12 @@
         <w:pStyle w:val="Heading2"/>
       </w:pPr>
       <w:r>
-        <w:t>Slide 28 – O que submeto à banca  (0:29; acumulado 18:03)</w:t>
+        <w:t>Slide 28 – O que essas experiências trazem para a tese  (0:18; acumulado 14:03)</w:t>
       </w:r>
     </w:p>
     <w:p>
       <w:r>
-        <w:t>Trago quatro questões: se a confirmação precisa de um limiar numérico; se o custo sob visibilidade direta se sustenta só com narrativas; se descrever direção e Secretaria, com um participante cada, basta para a delimitação; e se os critérios sobre a formação como condição ausente estão adequados.</w:t>
+        <w:t>Daí saíram cinco temas: governança, formação, infraestrutura, continuidade e cultura digital. Por exemplo, no Peru, dar um laptop por criança não melhorou a aprendizagem. Cada tema virou uma pergunta para levar a Pipa.</w:t>
       </w:r>
     </w:p>
     <w:p>
@@ -1704,12 +2292,12 @@
         <w:pStyle w:val="Heading2"/>
       </w:pPr>
       <w:r>
-        <w:t>Slide 29 – A questão aberta / Agradecimento  (0:25; acumulado 18:28)</w:t>
+        <w:t>Slide 29 – Quatro décadas até a PNED  (0:18; acumulado 14:21)</w:t>
       </w:r>
     </w:p>
     <w:p>
       <w:r>
-        <w:t>A política fez da educação digital um direito e deixou os meios a cargo de cada ente. Quando o equipamento e a formação não chegam, quem paga esse preço no cotidiano da escola? Muito obrigada. Fico à disposição da banca.</w:t>
+        <w:t>No Brasil, a história também é longa: do EDUCOM, nos anos 1980, ao ProInfo, aos laptops do PROUCA e à conectividade. E os problemas se repetem: falta manutenção, falta suporte, falta reposição.</w:t>
       </w:r>
     </w:p>
     <w:p>
@@ -1717,12 +2305,12 @@
         <w:pStyle w:val="Heading2"/>
       </w:pPr>
       <w:r>
-        <w:t>Slide 30 – Referências  (—; acumulado —)</w:t>
+        <w:t>Slide 30 – Por que a PNED importa  (0:26; acumulado 14:47)</w:t>
       </w:r>
     </w:p>
     <w:p>
       <w:r>
-        <w:t>Slide de consulta; não apresentar.</w:t>
+        <w:t>Quero ser justa com a lei: ela tem méritos. Juntou num só texto ações que estavam espalhadas, fez da educação digital um dever do Estado e um direito das crianças, e diz que a tecnologia deve fortalecer o papel de quem ensina e de quem aprende, e não substituí-lo.</w:t>
       </w:r>
     </w:p>
     <w:p>
@@ -1730,55 +2318,181 @@
         <w:pStyle w:val="Heading2"/>
       </w:pPr>
       <w:r>
-        <w:t>Perguntas prováveis da banca (para preparar)</w:t>
+        <w:t>Slide 31 – A PNED e o calendário da exigência  (0:30; acumulado 15:17)</w:t>
+      </w:r>
+    </w:p>
+    <w:p>
+      <w:r>
+        <w:t>Repare no calendário. Em janeiro de 2023, a parte que tornava a educação digital obrigatória foi vetada. Em dezembro, o Congresso derrubou o veto. Em 2025, o Conselho Nacional de Educação pediu novos currículos, e em 2026 a implementação passou a ser obrigatória. Ou seja, a pesquisa acontece exatamente agora, quando a exigência chega às escolas.</w:t>
       </w:r>
     </w:p>
     <w:p>
       <w:pPr>
-        <w:pStyle w:val="ListBullet"/>
+        <w:pStyle w:val="Heading2"/>
       </w:pPr>
       <w:r>
-        <w:t>Por que um caso único e não comparar escolas?</w:t>
+        <w:t>Slide 32 – A promessa e o desenho  (0:40; acumulado 15:57)</w:t>
+      </w:r>
+    </w:p>
+    <w:p>
+      <w:r>
+        <w:t>E aqui está o achado central da análise da lei. Ela se define como uma política de articulação, que não cria fundo próprio de financiamento. A conexão das escolas fica dentro dos limites do orçamento de cada governo. E a formação de professores aparece só como algo a ser promovido, sem dizer quem faz, quando nem com que dinheiro. A esse desenho dei o nome de vazio material: a exigência tem data marcada, mas os meios não.</w:t>
       </w:r>
     </w:p>
     <w:p>
       <w:pPr>
-        <w:pStyle w:val="ListBullet"/>
+        <w:pStyle w:val="Heading2"/>
       </w:pPr>
       <w:r>
-        <w:t>Como evitar que a proximidade com a rede influencie as respostas?</w:t>
+        <w:t>Slide 33 – Parte V – O território e a escola  (0:05; acumulado 16:02)</w:t>
+      </w:r>
+    </w:p>
+    <w:p>
+      <w:r>
+        <w:t>Na quinta parte, vamos para Pipa.</w:t>
       </w:r>
     </w:p>
     <w:p>
       <w:pPr>
-        <w:pStyle w:val="ListBullet"/>
+        <w:pStyle w:val="Heading2"/>
       </w:pPr>
       <w:r>
-        <w:t>A discricionariedade substitutiva não seria apenas a precarização do trabalho docente com outro nome?</w:t>
+        <w:t>Slide 34 – A antiga Pipa: trabalho, moradia e mar  (0:32; acumulado 16:34)</w:t>
+      </w:r>
+    </w:p>
+    <w:p>
+      <w:r>
+        <w:t>Estas fotos são do Museu Digital de Pipa. Mostram uma vila onde trabalho, casa e mar ficavam muito próximos: o barco sendo construído no quintal, o mutirão para montar o curral de pesca. Para ler essas imagens, uso o geógrafo Milton Santos, que fala em território usado, isto é, o espaço entendido a partir do que as pessoas fazem nele.</w:t>
       </w:r>
     </w:p>
     <w:p>
       <w:pPr>
-        <w:pStyle w:val="ListBullet"/>
+        <w:pStyle w:val="Heading2"/>
       </w:pPr>
       <w:r>
-        <w:t>Por que incluir uma foto atual do pescador num capítulo sobre a escola?</w:t>
+        <w:t>Slide 35 – As transformações: de vila a polo turístico  (0:21; acumulado 16:55)</w:t>
+      </w:r>
+    </w:p>
+    <w:p>
+      <w:r>
+        <w:t>A partir dos anos 1990, com o surfe, Pipa vira destino turístico. Chegam investimentos, trabalhadores de fora e, mais recentemente, pessoas que trabalham a distância. Mas uma coisa não apagou a outra: o novo convive com o antigo.</w:t>
       </w:r>
     </w:p>
     <w:p>
       <w:pPr>
-        <w:pStyle w:val="ListBullet"/>
+        <w:pStyle w:val="Heading2"/>
       </w:pPr>
       <w:r>
-        <w:t>Como os dados quantitativos citados (TIC Educação, PISA) se relacionam com uma pesquisa qualitativa?</w:t>
+        <w:t>Slide 36 – A Pipa de hoje: um território conectado  (0:52; acumulado 17:47)</w:t>
+      </w:r>
+    </w:p>
+    <w:p>
+      <w:r>
+        <w:t>E esta foto prova isso. É um pescador de hoje, descarregando o peixe na enseada, com lanchas e escunas de passeio ao fundo. A pesca não acabou com o turismo; ela divide o mesmo mar com ele. Até o barco mostra essa mistura: é de madeira, mas tem motor de popa. Para a escola, isso significa crianças de famílias com relações muito diferentes com o mar, com o trabalho e com a tecnologia. Chamo de habitar digital essa convivência desigual: a tecnologia está em toda parte no turismo, mas chega de forma diferente a cada família e à escola.</w:t>
       </w:r>
     </w:p>
     <w:p>
       <w:pPr>
-        <w:pStyle w:val="ListBullet"/>
+        <w:pStyle w:val="Heading2"/>
       </w:pPr>
       <w:r>
-        <w:t>O que muda na tese se o campo recusar a categoria?</w:t>
+        <w:t>Slide 37 – A escola não se resume ao que falta  (0:10; acumulado 17:57)</w:t>
+      </w:r>
+    </w:p>
+    <w:p>
+      <w:r>
+        <w:t>A escola não é só falta: tem acessibilidade e um parque dentro da mata de restinga.</w:t>
+      </w:r>
+    </w:p>
+    <w:p>
+      <w:pPr>
+        <w:pStyle w:val="Heading2"/>
+      </w:pPr>
+      <w:r>
+        <w:t>Slide 38 – Na escola: o que existe e onde está  (0:34; acumulado 18:31)</w:t>
+      </w:r>
+    </w:p>
+    <w:p>
+      <w:r>
+        <w:t>Mas, quando olhamos para os recursos digitais, o quadro muda. O laboratório, que segundo as informações iniciais foi montado pela Prefeitura em 2022, estava com os computadores desligados. Haveria um único kit multimídia para a escola toda. E nas salas do 1º e do 2º ano, nenhum aparelho: o alfabeto móvel é feito à mão. Tudo isso ainda vai ser conferido nos documentos.</w:t>
+      </w:r>
+    </w:p>
+    <w:p>
+      <w:pPr>
+        <w:pStyle w:val="Heading2"/>
+      </w:pPr>
+      <w:r>
+        <w:t>Slide 39 – Rugosidade tecnológica: perda ou ausência?  (0:30; acumulado 19:01)</w:t>
+      </w:r>
+    </w:p>
+    <w:p>
+      <w:r>
+        <w:t>Para ler o laboratório, uso outra ideia de Milton Santos: rugosidade, que são as marcas que um tempo deixa no espaço e que continuam lá. A pergunta é: o laboratório perdeu a função, por falta de manutenção, ou nunca chegou a ter uma, porque faltou formação e tempo? A resposta muda o que a política precisa fazer.</w:t>
+      </w:r>
+    </w:p>
+    <w:p>
+      <w:pPr>
+        <w:pStyle w:val="Heading2"/>
+      </w:pPr>
+      <w:r>
+        <w:t>Slide 40 – Contribuições analíticas do capítulo  (0:14; acumulado 19:15)</w:t>
+      </w:r>
+    </w:p>
+    <w:p>
+      <w:r>
+        <w:t>Em síntese, o capítulo propõe ler a escola como ponto de uma rede e reconhecer o trabalho dos profissionais sem romantizar o improviso.</w:t>
+      </w:r>
+    </w:p>
+    <w:p>
+      <w:pPr>
+        <w:pStyle w:val="Heading2"/>
+      </w:pPr>
+      <w:r>
+        <w:t>Slide 41 – Parte VI – O que ainda falta  (0:05; acumulado 19:20)</w:t>
+      </w:r>
+    </w:p>
+    <w:p>
+      <w:r>
+        <w:t>Por fim, o que ainda falta.</w:t>
+      </w:r>
+    </w:p>
+    <w:p>
+      <w:pPr>
+        <w:pStyle w:val="Heading2"/>
+      </w:pPr>
+      <w:r>
+        <w:t>Slide 42 – Onde estamos e o que falta  (0:26; acumulado 19:46)</w:t>
+      </w:r>
+    </w:p>
+    <w:p>
+      <w:r>
+        <w:t>Estamos aqui, no meio do caminho. Antes de ir a campo, preciso da aprovação do Comitê de Ética, de registrar os critérios da categoria e de analisar os documentos: a compra do laboratório, a internet, os cadernos de uso e a prestação de contas do programa federal.</w:t>
+      </w:r>
+    </w:p>
+    <w:p>
+      <w:pPr>
+        <w:pStyle w:val="Heading2"/>
+      </w:pPr>
+      <w:r>
+        <w:t>Slide 43 – A questão aberta / Agradecimento  (0:35; acumulado 20:21)</w:t>
+      </w:r>
+    </w:p>
+    <w:p>
+      <w:r>
+        <w:t>Termino com a pergunta que move a tese. A lei fez da educação digital um direito e deixou os meios na conta de cada governo. Quando o equipamento e a formação não chegam, quem paga esse preço no dia a dia da escola? E o que isso significa para os direitos que a lei prometeu às crianças? Muito obrigada. Fico à disposição para ouvir a banca.</w:t>
+      </w:r>
+    </w:p>
+    <w:p>
+      <w:pPr>
+        <w:pStyle w:val="Heading2"/>
+      </w:pPr>
+      <w:r>
+        <w:t>Slide 44 – Referências  (—; acumulado —)</w:t>
+      </w:r>
+    </w:p>
+    <w:p>
+      <w:r>
+        <w:t>Slide de consulta; não apresentar.</w:t>
       </w:r>
     </w:p>
     <w:sectPr>
@@ -2156,7 +2870,7 @@
     <w:rsid w:val="00FC693F"/>
     <w:rPr>
       <w:rFonts w:ascii="Arial" w:hAnsi="Arial"/>
-      <w:sz w:val="24"/>
+      <w:sz w:val="26"/>
     </w:rPr>
   </w:style>
   <w:style w:type="paragraph" w:styleId="Header">

</xml_diff>

<commit_message>
Roteiro de fala em registro formal e explicativo
Co-Authored-By: Claude Opus 5.5 <noreply@anthropic.com>
Claude-Session: https://claude.ai/code/session_01HxStpW4pQoDfJdTDYr6zEC
</commit_message>
<xml_diff>
--- a/apresentacao_qualificacao/ROTEIRO_DE_FALA_QUALIFICACAO.docx
+++ b/apresentacao_qualificacao/ROTEIRO_DE_FALA_QUALIFICACAO.docx
@@ -17,7 +17,7 @@
     </w:p>
     <w:p>
       <w:r>
-        <w:t>Como usar: o texto está em linguagem de fala, para ser dito com naturalidade, e não lido palavra por palavra. Os tempos foram calculados a 120 palavras por minuto, mais 2 segundos por troca de slide; o total previsto é de cerca de 20 minutos. Os slides de abertura de parte (5, 20, 22, 25, 33 e 41) são de passagem rápida. Se precisar de mais folga, os slides 17, 18 e 29 podem ser encurtados.</w:t>
+        <w:t>Como usar: o texto está em registro formal e explicativo, adequado à banca de qualificação; recomenda-se ensaiá-lo até que possa ser dito com naturalidade. Os tempos foram calculados a 120 palavras por minuto, mais 2 segundos por troca de slide; o total previsto é de cerca de 20 minutos. Os slides de abertura de parte (5, 20, 22, 25, 33 e 41) são de passagem rápida. Se precisar de mais folga, os slides 17, 18 e 29 podem ser encurtados.</w:t>
       </w:r>
     </w:p>
     <w:tbl>
@@ -101,7 +101,7 @@
           </w:tcPr>
           <w:p>
             <w:r>
-              <w:t>0:34</w:t>
+              <w:t>0:43</w:t>
             </w:r>
           </w:p>
         </w:tc>
@@ -111,7 +111,7 @@
           </w:tcPr>
           <w:p>
             <w:r>
-              <w:t>0:34</w:t>
+              <w:t>0:43</w:t>
             </w:r>
           </w:p>
         </w:tc>
@@ -153,7 +153,7 @@
           </w:tcPr>
           <w:p>
             <w:r>
-              <w:t>0:58</w:t>
+              <w:t>1:07</w:t>
             </w:r>
           </w:p>
         </w:tc>
@@ -185,7 +185,7 @@
           </w:tcPr>
           <w:p>
             <w:r>
-              <w:t>0:58</w:t>
+              <w:t>0:50</w:t>
             </w:r>
           </w:p>
         </w:tc>
@@ -195,7 +195,7 @@
           </w:tcPr>
           <w:p>
             <w:r>
-              <w:t>1:56</w:t>
+              <w:t>1:57</w:t>
             </w:r>
           </w:p>
         </w:tc>
@@ -227,7 +227,7 @@
           </w:tcPr>
           <w:p>
             <w:r>
-              <w:t>0:19</w:t>
+              <w:t>0:26</w:t>
             </w:r>
           </w:p>
         </w:tc>
@@ -237,7 +237,7 @@
           </w:tcPr>
           <w:p>
             <w:r>
-              <w:t>2:15</w:t>
+              <w:t>2:23</w:t>
             </w:r>
           </w:p>
         </w:tc>
@@ -269,7 +269,7 @@
           </w:tcPr>
           <w:p>
             <w:r>
-              <w:t>0:06</w:t>
+              <w:t>0:07</w:t>
             </w:r>
           </w:p>
         </w:tc>
@@ -279,7 +279,7 @@
           </w:tcPr>
           <w:p>
             <w:r>
-              <w:t>2:21</w:t>
+              <w:t>2:30</w:t>
             </w:r>
           </w:p>
         </w:tc>
@@ -311,7 +311,7 @@
           </w:tcPr>
           <w:p>
             <w:r>
-              <w:t>0:25</w:t>
+              <w:t>0:24</w:t>
             </w:r>
           </w:p>
         </w:tc>
@@ -321,7 +321,7 @@
           </w:tcPr>
           <w:p>
             <w:r>
-              <w:t>2:46</w:t>
+              <w:t>2:54</w:t>
             </w:r>
           </w:p>
         </w:tc>
@@ -353,7 +353,7 @@
           </w:tcPr>
           <w:p>
             <w:r>
-              <w:t>1:02</w:t>
+              <w:t>0:54</w:t>
             </w:r>
           </w:p>
         </w:tc>
@@ -395,7 +395,7 @@
           </w:tcPr>
           <w:p>
             <w:r>
-              <w:t>0:54</w:t>
+              <w:t>0:46</w:t>
             </w:r>
           </w:p>
         </w:tc>
@@ -405,7 +405,7 @@
           </w:tcPr>
           <w:p>
             <w:r>
-              <w:t>4:42</w:t>
+              <w:t>4:34</w:t>
             </w:r>
           </w:p>
         </w:tc>
@@ -437,7 +437,7 @@
           </w:tcPr>
           <w:p>
             <w:r>
-              <w:t>0:35</w:t>
+              <w:t>0:40</w:t>
             </w:r>
           </w:p>
         </w:tc>
@@ -447,7 +447,7 @@
           </w:tcPr>
           <w:p>
             <w:r>
-              <w:t>5:17</w:t>
+              <w:t>5:14</w:t>
             </w:r>
           </w:p>
         </w:tc>
@@ -479,7 +479,7 @@
           </w:tcPr>
           <w:p>
             <w:r>
-              <w:t>0:32</w:t>
+              <w:t>0:40</w:t>
             </w:r>
           </w:p>
         </w:tc>
@@ -489,7 +489,7 @@
           </w:tcPr>
           <w:p>
             <w:r>
-              <w:t>5:49</w:t>
+              <w:t>5:54</w:t>
             </w:r>
           </w:p>
         </w:tc>
@@ -521,7 +521,7 @@
           </w:tcPr>
           <w:p>
             <w:r>
-              <w:t>0:36</w:t>
+              <w:t>0:32</w:t>
             </w:r>
           </w:p>
         </w:tc>
@@ -531,7 +531,7 @@
           </w:tcPr>
           <w:p>
             <w:r>
-              <w:t>6:25</w:t>
+              <w:t>6:26</w:t>
             </w:r>
           </w:p>
         </w:tc>
@@ -563,7 +563,7 @@
           </w:tcPr>
           <w:p>
             <w:r>
-              <w:t>1:02</w:t>
+              <w:t>0:54</w:t>
             </w:r>
           </w:p>
         </w:tc>
@@ -573,7 +573,7 @@
           </w:tcPr>
           <w:p>
             <w:r>
-              <w:t>7:27</w:t>
+              <w:t>7:20</w:t>
             </w:r>
           </w:p>
         </w:tc>
@@ -605,7 +605,7 @@
           </w:tcPr>
           <w:p>
             <w:r>
-              <w:t>0:30</w:t>
+              <w:t>0:33</w:t>
             </w:r>
           </w:p>
         </w:tc>
@@ -615,7 +615,7 @@
           </w:tcPr>
           <w:p>
             <w:r>
-              <w:t>7:57</w:t>
+              <w:t>7:53</w:t>
             </w:r>
           </w:p>
         </w:tc>
@@ -647,7 +647,7 @@
           </w:tcPr>
           <w:p>
             <w:r>
-              <w:t>0:14</w:t>
+              <w:t>0:20</w:t>
             </w:r>
           </w:p>
         </w:tc>
@@ -657,7 +657,7 @@
           </w:tcPr>
           <w:p>
             <w:r>
-              <w:t>8:11</w:t>
+              <w:t>8:13</w:t>
             </w:r>
           </w:p>
         </w:tc>
@@ -689,7 +689,7 @@
           </w:tcPr>
           <w:p>
             <w:r>
-              <w:t>0:25</w:t>
+              <w:t>0:29</w:t>
             </w:r>
           </w:p>
         </w:tc>
@@ -699,7 +699,7 @@
           </w:tcPr>
           <w:p>
             <w:r>
-              <w:t>8:36</w:t>
+              <w:t>8:42</w:t>
             </w:r>
           </w:p>
         </w:tc>
@@ -731,7 +731,7 @@
           </w:tcPr>
           <w:p>
             <w:r>
-              <w:t>0:58</w:t>
+              <w:t>1:05</w:t>
             </w:r>
           </w:p>
         </w:tc>
@@ -741,7 +741,7 @@
           </w:tcPr>
           <w:p>
             <w:r>
-              <w:t>9:34</w:t>
+              <w:t>9:47</w:t>
             </w:r>
           </w:p>
         </w:tc>
@@ -773,7 +773,7 @@
           </w:tcPr>
           <w:p>
             <w:r>
-              <w:t>0:30</w:t>
+              <w:t>0:28</w:t>
             </w:r>
           </w:p>
         </w:tc>
@@ -783,7 +783,7 @@
           </w:tcPr>
           <w:p>
             <w:r>
-              <w:t>10:04</w:t>
+              <w:t>10:15</w:t>
             </w:r>
           </w:p>
         </w:tc>
@@ -825,7 +825,7 @@
           </w:tcPr>
           <w:p>
             <w:r>
-              <w:t>10:22</w:t>
+              <w:t>10:33</w:t>
             </w:r>
           </w:p>
         </w:tc>
@@ -857,7 +857,7 @@
           </w:tcPr>
           <w:p>
             <w:r>
-              <w:t>0:10</w:t>
+              <w:t>0:15</w:t>
             </w:r>
           </w:p>
         </w:tc>
@@ -867,7 +867,7 @@
           </w:tcPr>
           <w:p>
             <w:r>
-              <w:t>10:32</w:t>
+              <w:t>10:48</w:t>
             </w:r>
           </w:p>
         </w:tc>
@@ -899,7 +899,7 @@
           </w:tcPr>
           <w:p>
             <w:r>
-              <w:t>0:10</w:t>
+              <w:t>0:07</w:t>
             </w:r>
           </w:p>
         </w:tc>
@@ -909,7 +909,7 @@
           </w:tcPr>
           <w:p>
             <w:r>
-              <w:t>10:42</w:t>
+              <w:t>10:55</w:t>
             </w:r>
           </w:p>
         </w:tc>
@@ -941,7 +941,7 @@
           </w:tcPr>
           <w:p>
             <w:r>
-              <w:t>0:50</w:t>
+              <w:t>0:53</w:t>
             </w:r>
           </w:p>
         </w:tc>
@@ -951,7 +951,7 @@
           </w:tcPr>
           <w:p>
             <w:r>
-              <w:t>11:32</w:t>
+              <w:t>11:48</w:t>
             </w:r>
           </w:p>
         </w:tc>
@@ -983,7 +983,7 @@
           </w:tcPr>
           <w:p>
             <w:r>
-              <w:t>0:06</w:t>
+              <w:t>0:05</w:t>
             </w:r>
           </w:p>
         </w:tc>
@@ -993,7 +993,7 @@
           </w:tcPr>
           <w:p>
             <w:r>
-              <w:t>11:38</w:t>
+              <w:t>11:53</w:t>
             </w:r>
           </w:p>
         </w:tc>
@@ -1025,7 +1025,7 @@
           </w:tcPr>
           <w:p>
             <w:r>
-              <w:t>0:32</w:t>
+              <w:t>0:31</w:t>
             </w:r>
           </w:p>
         </w:tc>
@@ -1035,7 +1035,7 @@
           </w:tcPr>
           <w:p>
             <w:r>
-              <w:t>12:10</w:t>
+              <w:t>12:24</w:t>
             </w:r>
           </w:p>
         </w:tc>
@@ -1067,7 +1067,7 @@
           </w:tcPr>
           <w:p>
             <w:r>
-              <w:t>0:24</w:t>
+              <w:t>0:28</w:t>
             </w:r>
           </w:p>
         </w:tc>
@@ -1077,7 +1077,7 @@
           </w:tcPr>
           <w:p>
             <w:r>
-              <w:t>12:34</w:t>
+              <w:t>12:52</w:t>
             </w:r>
           </w:p>
         </w:tc>
@@ -1109,7 +1109,7 @@
           </w:tcPr>
           <w:p>
             <w:r>
-              <w:t>0:09</w:t>
+              <w:t>0:07</w:t>
             </w:r>
           </w:p>
         </w:tc>
@@ -1119,7 +1119,7 @@
           </w:tcPr>
           <w:p>
             <w:r>
-              <w:t>12:43</w:t>
+              <w:t>12:59</w:t>
             </w:r>
           </w:p>
         </w:tc>
@@ -1151,7 +1151,7 @@
           </w:tcPr>
           <w:p>
             <w:r>
-              <w:t>0:40</w:t>
+              <w:t>0:41</w:t>
             </w:r>
           </w:p>
         </w:tc>
@@ -1161,7 +1161,7 @@
           </w:tcPr>
           <w:p>
             <w:r>
-              <w:t>13:23</w:t>
+              <w:t>13:40</w:t>
             </w:r>
           </w:p>
         </w:tc>
@@ -1193,7 +1193,7 @@
           </w:tcPr>
           <w:p>
             <w:r>
-              <w:t>0:22</w:t>
+              <w:t>0:16</w:t>
             </w:r>
           </w:p>
         </w:tc>
@@ -1203,7 +1203,7 @@
           </w:tcPr>
           <w:p>
             <w:r>
-              <w:t>13:45</w:t>
+              <w:t>13:56</w:t>
             </w:r>
           </w:p>
         </w:tc>
@@ -1235,7 +1235,7 @@
           </w:tcPr>
           <w:p>
             <w:r>
-              <w:t>0:18</w:t>
+              <w:t>0:24</w:t>
             </w:r>
           </w:p>
         </w:tc>
@@ -1245,7 +1245,7 @@
           </w:tcPr>
           <w:p>
             <w:r>
-              <w:t>14:03</w:t>
+              <w:t>14:20</w:t>
             </w:r>
           </w:p>
         </w:tc>
@@ -1277,7 +1277,7 @@
           </w:tcPr>
           <w:p>
             <w:r>
-              <w:t>0:18</w:t>
+              <w:t>0:19</w:t>
             </w:r>
           </w:p>
         </w:tc>
@@ -1287,7 +1287,7 @@
           </w:tcPr>
           <w:p>
             <w:r>
-              <w:t>14:21</w:t>
+              <w:t>14:39</w:t>
             </w:r>
           </w:p>
         </w:tc>
@@ -1319,7 +1319,7 @@
           </w:tcPr>
           <w:p>
             <w:r>
-              <w:t>0:26</w:t>
+              <w:t>0:24</w:t>
             </w:r>
           </w:p>
         </w:tc>
@@ -1329,7 +1329,7 @@
           </w:tcPr>
           <w:p>
             <w:r>
-              <w:t>14:47</w:t>
+              <w:t>15:03</w:t>
             </w:r>
           </w:p>
         </w:tc>
@@ -1361,7 +1361,7 @@
           </w:tcPr>
           <w:p>
             <w:r>
-              <w:t>0:30</w:t>
+              <w:t>0:31</w:t>
             </w:r>
           </w:p>
         </w:tc>
@@ -1371,7 +1371,7 @@
           </w:tcPr>
           <w:p>
             <w:r>
-              <w:t>15:17</w:t>
+              <w:t>15:34</w:t>
             </w:r>
           </w:p>
         </w:tc>
@@ -1403,7 +1403,7 @@
           </w:tcPr>
           <w:p>
             <w:r>
-              <w:t>0:40</w:t>
+              <w:t>0:38</w:t>
             </w:r>
           </w:p>
         </w:tc>
@@ -1413,7 +1413,7 @@
           </w:tcPr>
           <w:p>
             <w:r>
-              <w:t>15:57</w:t>
+              <w:t>16:12</w:t>
             </w:r>
           </w:p>
         </w:tc>
@@ -1445,7 +1445,7 @@
           </w:tcPr>
           <w:p>
             <w:r>
-              <w:t>0:05</w:t>
+              <w:t>0:06</w:t>
             </w:r>
           </w:p>
         </w:tc>
@@ -1455,7 +1455,7 @@
           </w:tcPr>
           <w:p>
             <w:r>
-              <w:t>16:02</w:t>
+              <w:t>16:18</w:t>
             </w:r>
           </w:p>
         </w:tc>
@@ -1487,7 +1487,7 @@
           </w:tcPr>
           <w:p>
             <w:r>
-              <w:t>0:32</w:t>
+              <w:t>0:24</w:t>
             </w:r>
           </w:p>
         </w:tc>
@@ -1497,7 +1497,7 @@
           </w:tcPr>
           <w:p>
             <w:r>
-              <w:t>16:34</w:t>
+              <w:t>16:42</w:t>
             </w:r>
           </w:p>
         </w:tc>
@@ -1539,7 +1539,7 @@
           </w:tcPr>
           <w:p>
             <w:r>
-              <w:t>16:55</w:t>
+              <w:t>17:03</w:t>
             </w:r>
           </w:p>
         </w:tc>
@@ -1571,7 +1571,7 @@
           </w:tcPr>
           <w:p>
             <w:r>
-              <w:t>0:52</w:t>
+              <w:t>0:47</w:t>
             </w:r>
           </w:p>
         </w:tc>
@@ -1581,7 +1581,7 @@
           </w:tcPr>
           <w:p>
             <w:r>
-              <w:t>17:47</w:t>
+              <w:t>17:50</w:t>
             </w:r>
           </w:p>
         </w:tc>
@@ -1613,7 +1613,7 @@
           </w:tcPr>
           <w:p>
             <w:r>
-              <w:t>0:10</w:t>
+              <w:t>0:15</w:t>
             </w:r>
           </w:p>
         </w:tc>
@@ -1623,7 +1623,7 @@
           </w:tcPr>
           <w:p>
             <w:r>
-              <w:t>17:57</w:t>
+              <w:t>18:05</w:t>
             </w:r>
           </w:p>
         </w:tc>
@@ -1665,7 +1665,7 @@
           </w:tcPr>
           <w:p>
             <w:r>
-              <w:t>18:31</w:t>
+              <w:t>18:39</w:t>
             </w:r>
           </w:p>
         </w:tc>
@@ -1697,7 +1697,7 @@
           </w:tcPr>
           <w:p>
             <w:r>
-              <w:t>0:30</w:t>
+              <w:t>0:36</w:t>
             </w:r>
           </w:p>
         </w:tc>
@@ -1707,7 +1707,7 @@
           </w:tcPr>
           <w:p>
             <w:r>
-              <w:t>19:01</w:t>
+              <w:t>19:15</w:t>
             </w:r>
           </w:p>
         </w:tc>
@@ -1749,7 +1749,7 @@
           </w:tcPr>
           <w:p>
             <w:r>
-              <w:t>19:15</w:t>
+              <w:t>19:29</w:t>
             </w:r>
           </w:p>
         </w:tc>
@@ -1781,7 +1781,7 @@
           </w:tcPr>
           <w:p>
             <w:r>
-              <w:t>0:05</w:t>
+              <w:t>0:06</w:t>
             </w:r>
           </w:p>
         </w:tc>
@@ -1791,7 +1791,7 @@
           </w:tcPr>
           <w:p>
             <w:r>
-              <w:t>19:20</w:t>
+              <w:t>19:35</w:t>
             </w:r>
           </w:p>
         </w:tc>
@@ -1833,7 +1833,7 @@
           </w:tcPr>
           <w:p>
             <w:r>
-              <w:t>19:46</w:t>
+              <w:t>20:01</w:t>
             </w:r>
           </w:p>
         </w:tc>
@@ -1865,7 +1865,7 @@
           </w:tcPr>
           <w:p>
             <w:r>
-              <w:t>0:35</w:t>
+              <w:t>0:39</w:t>
             </w:r>
           </w:p>
         </w:tc>
@@ -1875,7 +1875,7 @@
           </w:tcPr>
           <w:p>
             <w:r>
-              <w:t>20:21</w:t>
+              <w:t>20:40</w:t>
             </w:r>
           </w:p>
         </w:tc>
@@ -1928,12 +1928,12 @@
         <w:pStyle w:val="Heading2"/>
       </w:pPr>
       <w:r>
-        <w:t>Slide 1 – Título  (0:34; acumulado 0:34)</w:t>
+        <w:t>Slide 1 – Título  (0:43; acumulado 0:43)</w:t>
       </w:r>
     </w:p>
     <w:p>
       <w:r>
-        <w:t>Bom dia a todas e a todos. Quero começar agradecendo à banca pela leitura atenta e à minha orientadora, a professora Maria Cristina. A pesquisa que vou apresentar se chama “A política no canteiro da prática”. Em poucas palavras, ela quer entender o que acontece quando uma lei nacional sobre educação digital chega numa escola pública de verdade, com as condições que essa escola tem.</w:t>
+        <w:t>Bom dia. Cumprimento os membros da banca, a quem agradeço a leitura atenta do texto, e minha orientadora, professora Maria Cristina Leandro de Paiva. Apresento a qualificação da tese intitulada “A política no canteiro da prática: norma, território e atuação profissional na implementação da educação digital escolar nos anos iniciais”. A investigação busca compreender de que modo uma política nacional de educação digital é recebida, interpretada e posta em prática em uma escola pública situada em Pipa, distrito de Tibau do Sul.</w:t>
       </w:r>
     </w:p>
     <w:p>
@@ -1941,12 +1941,12 @@
         <w:pStyle w:val="Heading2"/>
       </w:pPr>
       <w:r>
-        <w:t>Slide 2 – Percurso da apresentação  (0:24; acumulado 0:58)</w:t>
+        <w:t>Slide 2 – Percurso da apresentação  (0:24; acumulado 1:07)</w:t>
       </w:r>
     </w:p>
     <w:p>
       <w:r>
-        <w:t>Para vocês se localizarem, a fala está dividida em seis partes: primeiro a proposta da tese; depois a revisão sistemática; a metodologia; a agenda internacional e a lei brasileira; o território de Pipa e a escola; e, no fim, o que ainda falta fazer.</w:t>
+        <w:t>A exposição está organizada em seis partes: a proposta da tese; a revisão sistemática da literatura; o desenho metodológico; a análise da agenda internacional e da Política Nacional de Educação Digital; o território e a escola; e, por fim, as etapas que ainda serão realizadas.</w:t>
       </w:r>
     </w:p>
     <w:p>
@@ -1954,12 +1954,12 @@
         <w:pStyle w:val="Heading2"/>
       </w:pPr>
       <w:r>
-        <w:t>Slide 3 – Trajetória: de onde parto  (0:58; acumulado 1:56)</w:t>
+        <w:t>Slide 3 – Trajetória: de onde parto  (0:50; acumulado 1:57)</w:t>
       </w:r>
     </w:p>
     <w:p>
       <w:r>
-        <w:t>Antes de falar da pesquisa, preciso dizer de onde eu falo, porque isso pesa. Eu convivo com Pipa há quase vinte anos e trabalhei dezoito anos na rede municipal de Tibau do Sul. No mestrado, pesquisei essa mesma escola durante o ensino remoto, e um dado me marcou: setenta por cento das crianças da turma dividiam o celular com os pais. O doutorado continua essa história, agora diante de uma lei nova. Como conheço muito o lugar, criei uma regra para mim mesma: memória não é dado. O que eu sei por ter vivido orienta o meu olhar, mas o que entra como prova na tese vem dos instrumentos de pesquisa.</w:t>
+        <w:t>Inicio pela posição de quem pesquisa, pois ela integra as condições da investigação. Convivo com o território de Pipa há quase duas décadas e atuei por dezoito anos na rede municipal de Tibau do Sul. No mestrado, realizei uma pesquisa-ação na mesma escola, durante o ensino remoto, e constatei que setenta por cento das crianças da turma compartilhavam o aparelho celular com os pais. Em razão dessa proximidade, adotei uma regra de método: a memória não é tomada como dado. A trajetória orienta o olhar, mas as afirmações da tese apoiam-se exclusivamente nos instrumentos de pesquisa.</w:t>
       </w:r>
     </w:p>
     <w:p>
@@ -1967,12 +1967,12 @@
         <w:pStyle w:val="Heading2"/>
       </w:pPr>
       <w:r>
-        <w:t>Slide 4 – Relevâncias da pesquisa  (0:19; acumulado 2:15)</w:t>
+        <w:t>Slide 4 – Relevâncias da pesquisa  (0:26; acumulado 2:23)</w:t>
       </w:r>
     </w:p>
     <w:p>
       <w:r>
-        <w:t>Além da relevância pessoal, há a científica, porque a lei ainda não foi estudada na prática nos anos iniciais, e a social, porque falamos de cidadania e de proteção das crianças no mundo digital.</w:t>
+        <w:t>A pesquisa apresenta relevância em três dimensões. Do ponto de vista científico, a política ainda não foi examinada empiricamente nos anos iniciais, e as redes municipais de pequeno porte permanecem pouco estudadas. Do ponto de vista social, trata de cidadania e de proteção da infância no ambiente digital.</w:t>
       </w:r>
     </w:p>
     <w:p>
@@ -1980,12 +1980,12 @@
         <w:pStyle w:val="Heading2"/>
       </w:pPr>
       <w:r>
-        <w:t>Slide 5 – Parte I – A proposta da tese  (0:06; acumulado 2:21)</w:t>
+        <w:t>Slide 5 – Parte I – A proposta da tese  (0:07; acumulado 2:30)</w:t>
       </w:r>
     </w:p>
     <w:p>
       <w:r>
-        <w:t>Entro agora na primeira parte, a proposta da tese.</w:t>
+        <w:t>Passo, então, à primeira parte, dedicada à proposta da tese.</w:t>
       </w:r>
     </w:p>
     <w:p>
@@ -1993,12 +1993,12 @@
         <w:pStyle w:val="Heading2"/>
       </w:pPr>
       <w:r>
-        <w:t>Slide 6 – Estrutura da tese  (0:25; acumulado 2:46)</w:t>
+        <w:t>Slide 6 – Estrutura da tese  (0:24; acumulado 2:54)</w:t>
       </w:r>
     </w:p>
     <w:p>
       <w:r>
-        <w:t>A tese tem oito capítulos. Já estão escritos a introdução, a revisão, a metodologia, o capítulo da lei e o do território. O capítulo três, sobre cultura digital, está em construção, e o sete e o oito dependem do trabalho de campo, que ainda vai acontecer.</w:t>
+        <w:t>A tese organiza-se em oito capítulos. A introdução, a revisão sistemática, a metodologia, a análise da política e o capítulo sobre o território encontram-se redigidos. O terceiro capítulo, de fundamentação teórica, está em elaboração, e os capítulos sete e oito dependem do trabalho de campo.</w:t>
       </w:r>
     </w:p>
     <w:p>
@@ -2006,12 +2006,12 @@
         <w:pStyle w:val="Heading2"/>
       </w:pPr>
       <w:r>
-        <w:t>Slide 7 – A tese em uma imagem: o vazio material  (1:02; acumulado 3:48)</w:t>
+        <w:t>Slide 7 – A tese em uma imagem: o vazio material  (0:54; acumulado 3:48)</w:t>
       </w:r>
     </w:p>
     <w:p>
       <w:r>
-        <w:t>Se eu tivesse que resumir a tese numa frase, seria esta: a lei promete muito e garante pouco. Explico. A Lei 14.533, de 2023, criou a Política Nacional de Educação Digital, que vou chamar de PNED. Ela transformou a educação digital num direito, num dever do Estado e numa disciplina obrigatória do ensino fundamental. Só que ela não garante o que é preciso para isso acontecer: formação para as professoras, internet que funcione na sala e tempo para planejar. Essas coisas acabam sendo resolvidas, ou não, no dia a dia da escola. Por isso a minha pergunta é: como essa política acontece de fato nos anos iniciais, a partir do jeito como os profissionais a entendem e a adaptam?</w:t>
+        <w:t>Este slide sintetiza o argumento central. A Lei nº 14.533, de 2023, instituiu a Política Nacional de Educação Digital, que denomino PNED. Por meio dela, a educação digital passou a constituir direito, dever do Estado e componente curricular do ensino fundamental. Contudo, a lei não assegura as condições necessárias à sua realização, como formação específica dos profissionais, infraestrutura de rede e tempo de planejamento, que acabam sendo construídas, ou não, no cotidiano escolar. Daí decorre a questão norteadora: como ocorre a implementação do eixo Educação Digital Escolar nos anos iniciais, considerando os processos de interpretação, tradução e recontextualização construídos pelos profissionais da educação?</w:t>
       </w:r>
     </w:p>
     <w:p>
@@ -2019,12 +2019,12 @@
         <w:pStyle w:val="Heading2"/>
       </w:pPr>
       <w:r>
-        <w:t>Slide 8 – O objeto e o recorte  (0:54; acumulado 4:42)</w:t>
+        <w:t>Slide 8 – O objeto e o recorte  (0:46; acumulado 4:34)</w:t>
       </w:r>
     </w:p>
     <w:p>
       <w:r>
-        <w:t>Por que escolhi o 1º e o 2º anos? Porque nessas turmas a mesma professora fica com as crianças o dia inteiro. Então, se a educação digital acontece ou não, dá para saber quem decidiu e por quê. Também é o momento em que a criança entra na escola, e muitas já mexem no celular. Mas mexer no celular não é o mesmo que entender o mundo digital, os riscos e os direitos. É isso que a escola tem de ensinar. Deixo claro o que fica de fora: não avalio a aprendizagem das crianças, não observo aulas e as crianças não são entrevistadas.</w:t>
+        <w:t>O recorte nas turmas de 1º e 2º anos justifica-se pela organização do trabalho escolar: nessas turmas, a mesma professora acompanha as crianças durante toda a jornada, o que permite identificar a autoria das decisões relativas à educação digital. Trata-se, ainda, do ingresso da criança no Ensino Fundamental, momento em que a familiaridade com aparelhos não se converte, por si só, em compreensão crítica dos usos, riscos e direitos. Ressalto que não se avaliam aprendizagens, não se observam aulas e as crianças não participam diretamente da produção de dados.</w:t>
       </w:r>
     </w:p>
     <w:p>
@@ -2032,12 +2032,12 @@
         <w:pStyle w:val="Heading2"/>
       </w:pPr>
       <w:r>
-        <w:t>Slide 9 – Justificativa  (0:35; acumulado 5:17)</w:t>
+        <w:t>Slide 9 – Justificativa  (0:40; acumulado 5:14)</w:t>
       </w:r>
     </w:p>
     <w:p>
       <w:r>
-        <w:t>Por que vale a pena estudar isso? Primeiro, pelo que a lei promete às crianças: participação consciente no mundo digital e proteção dos seus dados. Segundo, porque quem faz a política acontecer são pessoas: professoras, coordenação, direção, Secretaria. E terceiro, pelo território. Pipa reúne famílias de moradores antigos, migrantes, estrangeiros e trabalhadores do turismo, e essas crianças chegam à mesma sala com experiências digitais muito diferentes.</w:t>
+        <w:t>A justificativa apoia-se em três razões. A primeira diz respeito ao que a lei promete às crianças: participação consciente e democrática no ambiente digital e proteção de seus dados. A segunda refere-se aos sujeitos que realizam a política, isto é, professoras, coordenação, direção e equipe da Secretaria. A terceira relaciona-se ao território: Pipa reúne famílias de moradores antigos, migrantes, estrangeiros e trabalhadores do turismo, cujas crianças chegam à mesma turma com experiências digitais bastante desiguais.</w:t>
       </w:r>
     </w:p>
     <w:p>
@@ -2045,12 +2045,12 @@
         <w:pStyle w:val="Heading2"/>
       </w:pPr>
       <w:r>
-        <w:t>Slide 10 – Problematização: do portão para fora, do portão para dentro  (0:32; acumulado 5:49)</w:t>
+        <w:t>Slide 10 – Problematização: do portão para fora, do portão para dentro  (0:40; acumulado 5:54)</w:t>
       </w:r>
     </w:p>
     <w:p>
       <w:r>
-        <w:t>Esta imagem mostra bem o problema. Do portão para fora, Pipa é um destino turístico conectado: pousada, restaurante e passeio, tudo se vende pela internet. Do portão para dentro, quando fotografei o laboratório da escola, os computadores estavam desligados, e nas salas do 1º e do 2º ano não havia nenhum aparelho. É o mesmo lugar, com duas realidades muito diferentes.</w:t>
+        <w:t>A problematização pode ser visualizada neste contraste. Fora da escola, Pipa constitui um polo turístico conectado, no qual hospedagem, alimentação e passeios são comercializados pela internet. Dentro da escola, no momento do registro fotográfico, o laboratório apresentava os computadores desligados, e as salas de 1º e 2º anos não dispunham de qualquer dispositivo digital. O mesmo território abriga, portanto, circuitos de alta conectividade e uma escola pública que não dispõe desses recursos nas mesmas condições.</w:t>
       </w:r>
     </w:p>
     <w:p>
@@ -2058,12 +2058,12 @@
         <w:pStyle w:val="Heading2"/>
       </w:pPr>
       <w:r>
-        <w:t>Slide 11 – Questão norteadora e objetivos  (0:36; acumulado 6:25)</w:t>
+        <w:t>Slide 11 – Questão norteadora e objetivos  (0:32; acumulado 6:26)</w:t>
       </w:r>
     </w:p>
     <w:p>
       <w:r>
-        <w:t>Para responder à pergunta, tenho três objetivos, e cada um vira um capítulo. O primeiro olha para a lei: o que ela promete e com que meios. O segundo olha para o território e para a escola: que condições recebem essa política. E o terceiro olha para as pessoas: o que os profissionais fazem com a distância entre o que a lei pede e o que eles têm.</w:t>
+        <w:t>Para responder à questão norteadora, defini três objetivos específicos, cada um correspondente a um capítulo. O primeiro examina o que a política promete e com que meios. O segundo caracteriza as condições territoriais e institucionais que recebem a política. O terceiro busca compreender como os profissionais interpretam e atuam diante da distância entre as exigências da norma e as condições disponíveis.</w:t>
       </w:r>
     </w:p>
     <w:p>
@@ -2071,12 +2071,12 @@
         <w:pStyle w:val="Heading2"/>
       </w:pPr>
       <w:r>
-        <w:t>Slide 12 – Contribuição inédita: discricionariedade substitutiva  (1:02; acumulado 7:27)</w:t>
+        <w:t>Slide 12 – Contribuição inédita: discricionariedade substitutiva  (0:54; acumulado 7:20)</w:t>
       </w:r>
     </w:p>
     <w:p>
       <w:r>
-        <w:t>Aqui está a principal contribuição da tese, e vou explicar o nome com calma. Discricionariedade é a margem que o servidor público tem para decidir no dia a dia. O autor que estudou isso, Michael Lipsky, mostrou que, quando o recurso é pouco, quem atende o público decide quem recebe primeiro: faz fila, revezamento, racionamento. Só que, na escola de Pipa, muitas vezes não há nem o que racionar. Então a decisão muda de natureza: a professora decide se vai usar o próprio celular, a própria internet, o próprio tempo para fazer acontecer o que a lei prometeu. Chamei isso de discricionariedade substitutiva, porque o profissional substitui com meios próprios aquilo que o Estado não entregou. Por enquanto, é uma hipótese.</w:t>
+        <w:t>Apresento agora a principal contribuição proposta. Discricionariedade designa a margem de decisão de que dispõem os servidores que atendem diretamente a população. Michael Lipsky demonstrou que, diante de recursos escassos, esses trabalhadores racionam o serviço, decidindo quem é atendido e em que ordem. Na escola investigada, entretanto, frequentemente não há o que racionar. A decisão, nesse caso, recai sobre aquilo que não existe: a profissional pode suprir com aparelho, conexão, conhecimento ou tempo próprios uma condição anunciada pela política e não assegurada à escola. Denomino essa situação discricionariedade substitutiva. Trata-se, neste momento, de uma proposição a ser examinada, e não de um resultado.</w:t>
       </w:r>
     </w:p>
     <w:p>
@@ -2084,12 +2084,12 @@
         <w:pStyle w:val="Heading2"/>
       </w:pPr>
       <w:r>
-        <w:t>Slide 13 – Três componentes e os riscos a analisar  (0:30; acumulado 7:57)</w:t>
+        <w:t>Slide 13 – Três componentes e os riscos a analisar  (0:33; acumulado 7:53)</w:t>
       </w:r>
     </w:p>
     <w:p>
       <w:r>
-        <w:t>Para não ser só uma ideia solta, a categoria tem três componentes que precisam aparecer juntos: não há recurso para distribuir; o profissional usa meios próprios; e paga um custo pessoal, diante de famílias que ele encontra na rua no dia seguinte. E vou observar um risco: a falta ficar escondida justamente porque alguém a cobriu.</w:t>
+        <w:t>A categoria é composta por três elementos que devem ocorrer simultaneamente: a ausência de recurso a distribuir, a substituição com meios próprios e o custo pessoal assumido diante de crianças e famílias com as quais a profissional convive no território. Entre os riscos a analisar, destaca-se o de que a substituição oculte a falta dos meios, fazendo a política parecer em curso.</w:t>
       </w:r>
     </w:p>
     <w:p>
@@ -2097,12 +2097,12 @@
         <w:pStyle w:val="Heading2"/>
       </w:pPr>
       <w:r>
-        <w:t>Slide 14 – Três formulações, dois estatutos  (0:14; acumulado 8:11)</w:t>
+        <w:t>Slide 14 – Três formulações, dois estatutos  (0:20; acumulado 8:13)</w:t>
       </w:r>
     </w:p>
     <w:p>
       <w:r>
-        <w:t>Das três ideias da tese, duas já foram documentadas, o habitar digital e a rugosidade tecnológica; a terceira, a discricionariedade substitutiva, ainda é hipótese.</w:t>
+        <w:t>A tese opera com três formulações de estatutos distintos. O habitar digital e a rugosidade tecnológica constituem condições já documentadas no Capítulo 6. A discricionariedade substitutiva, por sua vez, é uma hipótese, a ser examinada nas entrevistas.</w:t>
       </w:r>
     </w:p>
     <w:p>
@@ -2110,12 +2110,12 @@
         <w:pStyle w:val="Heading2"/>
       </w:pPr>
       <w:r>
-        <w:t>Slide 15 – Onde os referenciais deixam de cobrir o caso  (0:25; acumulado 8:36)</w:t>
+        <w:t>Slide 15 – Onde os referenciais deixam de cobrir o caso  (0:29; acumulado 8:42)</w:t>
       </w:r>
     </w:p>
     <w:p>
       <w:r>
-        <w:t>Por que criar uma categoria nova? Porque os autores que uso pensaram situações em que os meios existem, mesmo que sejam poucos. Lipsky estudou grandes serviços, com atendimento em massa. Em Pipa, numa escola pequena, não há aparelhos para dividir, e quem decide conhece cada família.</w:t>
+        <w:t>A proposição de uma nova categoria justifica-se pelo limite dos referenciais. A Abordagem do Ciclo de Políticas e a teoria de Lipsky pressupõem que os meios existam, ainda que de forma escassa. Em Pipa, não há dispositivos a racionar, e a decisão é tomada diante de famílias que a profissional reencontra fora da escola.</w:t>
       </w:r>
     </w:p>
     <w:p>
@@ -2123,12 +2123,12 @@
         <w:pStyle w:val="Heading2"/>
       </w:pPr>
       <w:r>
-        <w:t>Slide 16 – O motor teórico: duas engrenagens e o fosso entre elas  (0:58; acumulado 9:34)</w:t>
+        <w:t>Slide 16 – O motor teórico: duas engrenagens e o fosso entre elas  (1:05; acumulado 9:47)</w:t>
       </w:r>
     </w:p>
     <w:p>
       <w:r>
-        <w:t>Gosto de pensar a teoria como duas engrenagens. A primeira é a Abordagem do Ciclo de Políticas, de Stephen Ball e colegas, trazida ao Brasil por Mainardes. Ela diz que uma lei não é simplesmente aplicada: na escola, ela é lida, interpretada e recriada. A segunda é a burocracia de nível de rua, de Lipsky, que mostra que as decisões de quem está na ponta acabam virando a política que existe de fato. As duas se encaixam na ideia de recontextualização, que é a política ganhando sentidos próprios em cada lugar. Mas entre elas há um vão: nenhuma explica a decisão sobre aquilo que não chegou. É nesse vão que a tese entra.</w:t>
+        <w:t>O quadro teórico pode ser representado por duas engrenagens. A primeira é a Abordagem do Ciclo de Políticas, formulada por Bowe, Ball e Gold e sistematizada no Brasil por Mainardes, segundo a qual a política não é simplesmente aplicada, mas interpretada e recriada no contexto da prática. A segunda é a teoria da burocracia de nível de rua, de Lipsky, que demonstra que as decisões cotidianas dos trabalhadores acabam por constituir a política efetivamente realizada. O ponto de encaixe entre ambas é a recontextualização, entendida como o processo pelo qual a política adquire sentidos particulares em cada lugar. Permanece, contudo, um fosso: nenhuma das duas abordagens nomeia a decisão sobre o que não chegou à escola. É nesse ponto que se situa a contribuição da tese.</w:t>
       </w:r>
     </w:p>
     <w:p>
@@ -2136,12 +2136,12 @@
         <w:pStyle w:val="Heading2"/>
       </w:pPr>
       <w:r>
-        <w:t>Slide 17 – Como a categoria pode falhar  (0:30; acumulado 10:04)</w:t>
+        <w:t>Slide 17 – Como a categoria pode falhar  (0:28; acumulado 10:15)</w:t>
       </w:r>
     </w:p>
     <w:p>
       <w:r>
-        <w:t>Uma hipótese só vale se puder ser derrubada. Por isso, antes de entrevistar qualquer pessoa, registrei por escrito o que vai confirmar, limitar, mudar o nome ou recusar a categoria. Por exemplo: se houver fila para usar o kit multimídia, isso é a discricionariedade comum, de Lipsky. Recusar a hipótese também é resultado de pesquisa.</w:t>
+        <w:t>Para que a hipótese seja verificável, registrei previamente, antes da primeira entrevista, as condições de confirmação, delimitação, renomeação e recusa da categoria. Caso, por exemplo, as narrativas descrevam revezamento no uso do kit multimídia, estaremos diante da discricionariedade alocativa descrita por Lipsky. A recusa da categoria também constituirá um resultado legítimo da pesquisa.</w:t>
       </w:r>
     </w:p>
     <w:p>
@@ -2149,12 +2149,12 @@
         <w:pStyle w:val="Heading2"/>
       </w:pPr>
       <w:r>
-        <w:t>Slide 18 – Ética, posição e reflexividade  (0:18; acumulado 10:22)</w:t>
+        <w:t>Slide 18 – Ética, posição e reflexividade  (0:18; acumulado 10:33)</w:t>
       </w:r>
     </w:p>
     <w:p>
       <w:r>
-        <w:t>Sobre ética: pseudônimos escolhidos pelos participantes e nenhuma foto com rosto de criança. E uma postura: o improviso não é virtude nem culpa da professora, é sinal das condições em que ela trabalha.</w:t>
+        <w:t>No plano ético, a pesquisa observa as Resoluções nº 466 e nº 510 do Conselho Nacional de Saúde, adota pseudônimos escolhidos pelos participantes e não utiliza imagens com rostos de crianças.</w:t>
       </w:r>
     </w:p>
     <w:p>
@@ -2162,12 +2162,12 @@
         <w:pStyle w:val="Heading2"/>
       </w:pPr>
       <w:r>
-        <w:t>Slide 19 – A tessitura: os fios que sustentam a tese  (0:10; acumulado 10:32)</w:t>
+        <w:t>Slide 19 – A tessitura: os fios que sustentam a tese  (0:15; acumulado 10:48)</w:t>
       </w:r>
     </w:p>
     <w:p>
       <w:r>
-        <w:t>Aqui estão os fios teóricos da tese e os capítulos em que cada um aparece.</w:t>
+        <w:t>Este quadro apresenta as frentes teóricas da tese e os capítulos em que cada uma é mobilizada, articulando política, território, cultura, condições de trabalho e método.</w:t>
       </w:r>
     </w:p>
     <w:p>
@@ -2175,12 +2175,12 @@
         <w:pStyle w:val="Heading2"/>
       </w:pPr>
       <w:r>
-        <w:t>Slide 20 – Parte II – Revisão sistemática  (0:10; acumulado 10:42)</w:t>
+        <w:t>Slide 20 – Parte II – Revisão sistemática  (0:07; acumulado 10:55)</w:t>
       </w:r>
     </w:p>
     <w:p>
       <w:r>
-        <w:t>Passo para a segunda parte: o que a produção científica já sabe sobre o tema.</w:t>
+        <w:t>Passo à segunda parte, referente à revisão sistemática da literatura.</w:t>
       </w:r>
     </w:p>
     <w:p>
@@ -2188,12 +2188,12 @@
         <w:pStyle w:val="Heading2"/>
       </w:pPr>
       <w:r>
-        <w:t>Slide 21 – A RSL: questão norteadora e resposta  (0:50; acumulado 11:32)</w:t>
+        <w:t>Slide 21 – A RSL: questão norteadora e resposta  (0:53; acumulado 11:48)</w:t>
       </w:r>
     </w:p>
     <w:p>
       <w:r>
-        <w:t>Fiz uma revisão sistemática, que é uma busca organizada, com regras fixas e registradas, para que outra pessoa possa repetir o caminho. Segui o protocolo PRISMA, consultei sete bases e, de 176 trabalhos encontrados, nove atendiam aos critérios. O que eles mostram? Que essas políticas dependem de recursos, de condições da escola e do trabalho dos profissionais, que interpretam a política. Mas o mais importante é o que falta: nenhum estudo trata da PNED, só um olha para a alfabetização e nenhum estuda rede municipal pequena. É nesse espaço vazio que a tese se coloca.</w:t>
+        <w:t>A revisão sistemática é um procedimento de busca e seleção com critérios explícitos e registrados, que permite a outro pesquisador reproduzir o percurso. Seguindo a declaração PRISMA 2020, foram consultadas sete bases, e, dos 176 registros identificados, nove estudos compuseram o corpus final. Os resultados indicam que a implementação dessas políticas depende da articulação entre recursos, condições institucionais e trabalho dos profissionais. Mais relevante, porém, é o que a literatura não examina: nenhum estudo trata da PNED, apenas um delimita o ciclo de alfabetização, e nenhum investiga redes municipais de pequeno porte. É nesse conjunto de lacunas que a tese se inscreve.</w:t>
       </w:r>
     </w:p>
     <w:p>
@@ -2201,12 +2201,12 @@
         <w:pStyle w:val="Heading2"/>
       </w:pPr>
       <w:r>
-        <w:t>Slide 22 – Parte III – Metodologia  (0:06; acumulado 11:38)</w:t>
+        <w:t>Slide 22 – Parte III – Metodologia  (0:05; acumulado 11:53)</w:t>
       </w:r>
     </w:p>
     <w:p>
       <w:r>
-        <w:t>Agora, como a pesquisa vai ser feita.</w:t>
+        <w:t>Apresento, a seguir, o desenho metodológico.</w:t>
       </w:r>
     </w:p>
     <w:p>
@@ -2214,12 +2214,12 @@
         <w:pStyle w:val="Heading2"/>
       </w:pPr>
       <w:r>
-        <w:t>Slide 23 – Desenho: estudo de caso único, qualitativo  (0:32; acumulado 12:10)</w:t>
+        <w:t>Slide 23 – Desenho: estudo de caso único, qualitativo  (0:31; acumulado 12:24)</w:t>
       </w:r>
     </w:p>
     <w:p>
       <w:r>
-        <w:t>É um estudo de caso de uma única escola, com abordagem qualitativa, ou seja, o interesse está nos sentidos e nas decisões, e não em números. Uso quatro fontes: fotografias, que já fiz; documentos da escola e da rede; um questionário; e entrevistas. O questionário e as entrevistas só começam depois que o Comitê de Ética aprovar a emenda.</w:t>
+        <w:t>Trata-se de um estudo de caso único, de abordagem qualitativa, cujo interesse recai sobre os sentidos e as decisões, e não sobre a mensuração. São mobilizadas quatro fontes: o registro iconográfico, já realizado; a análise documental; o questionário de perfil; e as entrevistas semiestruturadas, que serão aplicadas após a aprovação da emenda pelo Comitê de Ética em Pesquisa.</w:t>
       </w:r>
     </w:p>
     <w:p>
@@ -2227,12 +2227,12 @@
         <w:pStyle w:val="Heading2"/>
       </w:pPr>
       <w:r>
-        <w:t>Slide 24 – Quem será ouvido  (0:24; acumulado 12:34)</w:t>
+        <w:t>Slide 24 – Quem será ouvido  (0:28; acumulado 12:52)</w:t>
       </w:r>
     </w:p>
     <w:p>
       <w:r>
-        <w:t>Vou ouvir doze pessoas: seis professoras dos 1º e 2º anos, quatro da coordenação, uma da direção e uma da Secretaria de Educação. Ouço posições diferentes porque cada uma recebe a lei de um jeito. Atrás dessas doze pessoas estão cento e quarenta crianças.</w:t>
+        <w:t>Participarão doze profissionais da educação: seis professoras regentes de 1º e 2º anos, quatro integrantes da coordenação pedagógica, uma pessoa da direção e uma da Secretaria Municipal de Educação. A escolha de posições diferentes decorre do fato de que cada uma recebe a política com margens de decisão e responsabilidades próprias.</w:t>
       </w:r>
     </w:p>
     <w:p>
@@ -2240,12 +2240,12 @@
         <w:pStyle w:val="Heading2"/>
       </w:pPr>
       <w:r>
-        <w:t>Slide 25 – Parte IV – Agenda internacional e PNED  (0:09; acumulado 12:43)</w:t>
+        <w:t>Slide 25 – Parte IV – Agenda internacional e PNED  (0:07; acumulado 12:59)</w:t>
       </w:r>
     </w:p>
     <w:p>
       <w:r>
-        <w:t>Na quarta parte, olho para a lei e para o que veio de fora.</w:t>
+        <w:t>A quarta parte trata da produção do texto da política.</w:t>
       </w:r>
     </w:p>
     <w:p>
@@ -2253,12 +2253,12 @@
         <w:pStyle w:val="Heading2"/>
       </w:pPr>
       <w:r>
-        <w:t>Slide 26 – A agenda internacional: das presenças às condições  (0:40; acumulado 13:23)</w:t>
+        <w:t>Slide 26 – A agenda internacional: das presenças às condições  (0:41; acumulado 13:40)</w:t>
       </w:r>
     </w:p>
     <w:p>
       <w:r>
-        <w:t>Comecei pelos organismos internacionais. A UNESCO lembra que uma em cada quatro escolas primárias do mundo não tem nem eletricidade. A OCDE diz que o efeito dos computadores no desempenho é, na melhor das hipóteses, misto. E o Banco Mundial faz uma pergunta muito boa: se a tecnologia é a resposta, qual é a pergunta? O recado dos três é parecido: não basta ter o equipamento; importam as condições e para que ele é usado.</w:t>
+        <w:t>A análise iniciou-se pelos organismos internacionais. A UNESCO registra que uma em cada quatro escolas primárias no mundo não dispõe de eletricidade. A OCDE considera, na melhor das hipóteses, misto o impacto dos computadores sobre o desempenho dos estudantes. O Banco Mundial, por sua vez, recomenda que se defina o problema educacional antes da escolha da tecnologia. Em comum, os três documentos deslocam o foco da presença dos recursos para as condições e as finalidades de seu uso.</w:t>
       </w:r>
     </w:p>
     <w:p>
@@ -2266,12 +2266,12 @@
         <w:pStyle w:val="Heading2"/>
       </w:pPr>
       <w:r>
-        <w:t>Slide 27 – Mapa das políticas de educação digital  (0:22; acumulado 13:45)</w:t>
+        <w:t>Slide 27 – Mapa das políticas de educação digital  (0:16; acumulado 13:56)</w:t>
       </w:r>
     </w:p>
     <w:p>
       <w:r>
-        <w:t>Depois, analisei dezenove experiências na Europa e nas Américas. Não fui buscar modelos para copiar. Fui buscar lentes, ou seja, questões que me ajudam a enxergar melhor o caso brasileiro. As cores indicam o que cada país mais ensina.</w:t>
+        <w:t>Em seguida, foram analisadas dezenove experiências na Europa e nas Américas. O propósito não foi identificar modelos a serem importados, mas construir lentes de leitura para o caso brasileiro.</w:t>
       </w:r>
     </w:p>
     <w:p>
@@ -2279,12 +2279,12 @@
         <w:pStyle w:val="Heading2"/>
       </w:pPr>
       <w:r>
-        <w:t>Slide 28 – O que essas experiências trazem para a tese  (0:18; acumulado 14:03)</w:t>
+        <w:t>Slide 28 – O que essas experiências trazem para a tese  (0:24; acumulado 14:20)</w:t>
       </w:r>
     </w:p>
     <w:p>
       <w:r>
-        <w:t>Daí saíram cinco temas: governança, formação, infraestrutura, continuidade e cultura digital. Por exemplo, no Peru, dar um laptop por criança não melhorou a aprendizagem. Cada tema virou uma pergunta para levar a Pipa.</w:t>
+        <w:t>Dessa comparação resultaram cinco categorias sensibilizadoras: governança, formação, infraestrutura, continuidade institucional e cultura digital. O caso peruano, por exemplo, demonstra que a distribuição de computadores não produziu, por si só, ganhos de aprendizagem. Cada categoria converte-se em uma questão a ser examinada no campo.</w:t>
       </w:r>
     </w:p>
     <w:p>
@@ -2292,12 +2292,12 @@
         <w:pStyle w:val="Heading2"/>
       </w:pPr>
       <w:r>
-        <w:t>Slide 29 – Quatro décadas até a PNED  (0:18; acumulado 14:21)</w:t>
+        <w:t>Slide 29 – Quatro décadas até a PNED  (0:19; acumulado 14:39)</w:t>
       </w:r>
     </w:p>
     <w:p>
       <w:r>
-        <w:t>No Brasil, a história também é longa: do EDUCOM, nos anos 1980, ao ProInfo, aos laptops do PROUCA e à conectividade. E os problemas se repetem: falta manutenção, falta suporte, falta reposição.</w:t>
+        <w:t>No Brasil, as políticas de tecnologia educacional percorreram quatro décadas, do EDUCOM, nos anos 1980, ao ProInfo, ao PROUCA e às iniciativas de conectividade. Repetem-se, nesse percurso, problemas de manutenção e reposição de equipamentos.</w:t>
       </w:r>
     </w:p>
     <w:p>
@@ -2305,12 +2305,12 @@
         <w:pStyle w:val="Heading2"/>
       </w:pPr>
       <w:r>
-        <w:t>Slide 30 – Por que a PNED importa  (0:26; acumulado 14:47)</w:t>
+        <w:t>Slide 30 – Por que a PNED importa  (0:24; acumulado 15:03)</w:t>
       </w:r>
     </w:p>
     <w:p>
       <w:r>
-        <w:t>Quero ser justa com a lei: ela tem méritos. Juntou num só texto ações que estavam espalhadas, fez da educação digital um dever do Estado e um direito das crianças, e diz que a tecnologia deve fortalecer o papel de quem ensina e de quem aprende, e não substituí-lo.</w:t>
+        <w:t>É necessário reconhecer os méritos da PNED: a lei articula ações antes dispersas, inscreve a educação digital entre os deveres do Estado e associa-a aos direitos das crianças, determinando que as tecnologias fortaleçam, e não substituam, o papel de quem ensina e de quem aprende.</w:t>
       </w:r>
     </w:p>
     <w:p>
@@ -2318,12 +2318,12 @@
         <w:pStyle w:val="Heading2"/>
       </w:pPr>
       <w:r>
-        <w:t>Slide 31 – A PNED e o calendário da exigência  (0:30; acumulado 15:17)</w:t>
+        <w:t>Slide 31 – A PNED e o calendário da exigência  (0:31; acumulado 15:34)</w:t>
       </w:r>
     </w:p>
     <w:p>
       <w:r>
-        <w:t>Repare no calendário. Em janeiro de 2023, a parte que tornava a educação digital obrigatória foi vetada. Em dezembro, o Congresso derrubou o veto. Em 2025, o Conselho Nacional de Educação pediu novos currículos, e em 2026 a implementação passou a ser obrigatória. Ou seja, a pesquisa acontece exatamente agora, quando a exigência chega às escolas.</w:t>
+        <w:t>O calendário normativo evidencia a urgência da exigência. Em janeiro de 2023, o dispositivo que tornava a educação digital obrigatória foi vetado; em dezembro, o veto foi derrubado pelo Congresso. Em 2025, o Conselho Nacional de Educação determinou a elaboração dos novos currículos, cuja implementação tornou-se obrigatória em 2026, precisamente o período em que se realiza esta pesquisa.</w:t>
       </w:r>
     </w:p>
     <w:p>
@@ -2331,12 +2331,12 @@
         <w:pStyle w:val="Heading2"/>
       </w:pPr>
       <w:r>
-        <w:t>Slide 32 – A promessa e o desenho  (0:40; acumulado 15:57)</w:t>
+        <w:t>Slide 32 – A promessa e o desenho  (0:38; acumulado 16:12)</w:t>
       </w:r>
     </w:p>
     <w:p>
       <w:r>
-        <w:t>E aqui está o achado central da análise da lei. Ela se define como uma política de articulação, que não cria fundo próprio de financiamento. A conexão das escolas fica dentro dos limites do orçamento de cada governo. E a formação de professores aparece só como algo a ser promovido, sem dizer quem faz, quando nem com que dinheiro. A esse desenho dei o nome de vazio material: a exigência tem data marcada, mas os meios não.</w:t>
+        <w:t>Este é o principal achado da análise do texto legal. A PNED define-se como instância de articulação e não institui fundo próprio de financiamento. A conectividade das escolas está condicionada aos limites orçamentários de cada ente, e a formação de professores figura apenas como ação de promoção, sem definição de responsáveis, prazos ou custeio. Denomino esse desenho vazio material: a exigência curricular possui data definida, mas os meios para cumpri-la não.</w:t>
       </w:r>
     </w:p>
     <w:p>
@@ -2344,12 +2344,12 @@
         <w:pStyle w:val="Heading2"/>
       </w:pPr>
       <w:r>
-        <w:t>Slide 33 – Parte V – O território e a escola  (0:05; acumulado 16:02)</w:t>
+        <w:t>Slide 33 – Parte V – O território e a escola  (0:06; acumulado 16:18)</w:t>
       </w:r>
     </w:p>
     <w:p>
       <w:r>
-        <w:t>Na quinta parte, vamos para Pipa.</w:t>
+        <w:t>A quinta parte dedica-se ao território e à escola.</w:t>
       </w:r>
     </w:p>
     <w:p>
@@ -2357,12 +2357,12 @@
         <w:pStyle w:val="Heading2"/>
       </w:pPr>
       <w:r>
-        <w:t>Slide 34 – A antiga Pipa: trabalho, moradia e mar  (0:32; acumulado 16:34)</w:t>
+        <w:t>Slide 34 – A antiga Pipa: trabalho, moradia e mar  (0:24; acumulado 16:42)</w:t>
       </w:r>
     </w:p>
     <w:p>
       <w:r>
-        <w:t>Estas fotos são do Museu Digital de Pipa. Mostram uma vila onde trabalho, casa e mar ficavam muito próximos: o barco sendo construído no quintal, o mutirão para montar o curral de pesca. Para ler essas imagens, uso o geógrafo Milton Santos, que fala em território usado, isto é, o espaço entendido a partir do que as pessoas fazem nele.</w:t>
+        <w:t>As imagens do Museu Digital de Pipa registram uma organização territorial em que trabalho, moradia e atividade marítima estavam espacialmente próximos. Para interpretá-las, recorro a Milton Santos e à noção de território usado, que compreende o espaço a partir das práticas sociais nele desenvolvidas.</w:t>
       </w:r>
     </w:p>
     <w:p>
@@ -2370,12 +2370,12 @@
         <w:pStyle w:val="Heading2"/>
       </w:pPr>
       <w:r>
-        <w:t>Slide 35 – As transformações: de vila a polo turístico  (0:21; acumulado 16:55)</w:t>
+        <w:t>Slide 35 – As transformações: de vila a polo turístico  (0:21; acumulado 17:03)</w:t>
       </w:r>
     </w:p>
     <w:p>
       <w:r>
-        <w:t>A partir dos anos 1990, com o surfe, Pipa vira destino turístico. Chegam investimentos, trabalhadores de fora e, mais recentemente, pessoas que trabalham a distância. Mas uma coisa não apagou a outra: o novo convive com o antigo.</w:t>
+        <w:t>A partir da década de 1990, com o turismo associado ao surfe, Pipa tornou-se um destino de projeção internacional, recebendo investimentos e trabalhadores de outras regiões. Essas transformações, contudo, não apagaram as formas anteriores de uso do território.</w:t>
       </w:r>
     </w:p>
     <w:p>
@@ -2383,12 +2383,12 @@
         <w:pStyle w:val="Heading2"/>
       </w:pPr>
       <w:r>
-        <w:t>Slide 36 – A Pipa de hoje: um território conectado  (0:52; acumulado 17:47)</w:t>
+        <w:t>Slide 36 – A Pipa de hoje: um território conectado  (0:47; acumulado 17:50)</w:t>
       </w:r>
     </w:p>
     <w:p>
       <w:r>
-        <w:t>E esta foto prova isso. É um pescador de hoje, descarregando o peixe na enseada, com lanchas e escunas de passeio ao fundo. A pesca não acabou com o turismo; ela divide o mesmo mar com ele. Até o barco mostra essa mistura: é de madeira, mas tem motor de popa. Para a escola, isso significa crianças de famílias com relações muito diferentes com o mar, com o trabalho e com a tecnologia. Chamo de habitar digital essa convivência desigual: a tecnologia está em toda parte no turismo, mas chega de forma diferente a cada família e à escola.</w:t>
+        <w:t>O registro atual que apresento demonstra essa coexistência. Trata-se de um pescador descarregando o pescado na enseada, tendo ao fundo lanchas e escunas de passeio. A pesca não foi substituída pelo turismo; ambas as atividades compartilham o mesmo espaço marítimo. A própria embarcação expressa essa sobreposição, pois é de madeira e dispõe de motor de popa. Para a escola, isso significa atender crianças cujas famílias mantêm relações muito distintas com o mar, com o trabalho e com as tecnologias. Denomino habitar digital essa distribuição desigual das tecnologias no mesmo território.</w:t>
       </w:r>
     </w:p>
     <w:p>
@@ -2396,12 +2396,12 @@
         <w:pStyle w:val="Heading2"/>
       </w:pPr>
       <w:r>
-        <w:t>Slide 37 – A escola não se resume ao que falta  (0:10; acumulado 17:57)</w:t>
+        <w:t>Slide 37 – A escola não se resume ao que falta  (0:15; acumulado 18:05)</w:t>
       </w:r>
     </w:p>
     <w:p>
       <w:r>
-        <w:t>A escola não é só falta: tem acessibilidade e um parque dentro da mata de restinga.</w:t>
+        <w:t>Cabe registrar que a escola não se define apenas pela ausência: ela dispõe de recursos de acessibilidade e de um parque integrado à vegetação de restinga.</w:t>
       </w:r>
     </w:p>
     <w:p>
@@ -2409,12 +2409,12 @@
         <w:pStyle w:val="Heading2"/>
       </w:pPr>
       <w:r>
-        <w:t>Slide 38 – Na escola: o que existe e onde está  (0:34; acumulado 18:31)</w:t>
+        <w:t>Slide 38 – Na escola: o que existe e onde está  (0:34; acumulado 18:39)</w:t>
       </w:r>
     </w:p>
     <w:p>
       <w:r>
-        <w:t>Mas, quando olhamos para os recursos digitais, o quadro muda. O laboratório, que segundo as informações iniciais foi montado pela Prefeitura em 2022, estava com os computadores desligados. Haveria um único kit multimídia para a escola toda. E nas salas do 1º e do 2º ano, nenhum aparelho: o alfabeto móvel é feito à mão. Tudo isso ainda vai ser conferido nos documentos.</w:t>
+        <w:t>Quanto aos recursos digitais, contudo, o quadro é distinto. O laboratório, que, segundo informações preliminares, foi montado pela Prefeitura em 2022, apresentava os computadores desligados no momento do registro; haveria um único kit multimídia para toda a escola; e as salas de 1º e 2º anos não dispunham de dispositivos digitais, predominando materiais impressos e artesanais. Essas informações serão verificadas na análise documental.</w:t>
       </w:r>
     </w:p>
     <w:p>
@@ -2422,12 +2422,12 @@
         <w:pStyle w:val="Heading2"/>
       </w:pPr>
       <w:r>
-        <w:t>Slide 39 – Rugosidade tecnológica: perda ou ausência?  (0:30; acumulado 19:01)</w:t>
+        <w:t>Slide 39 – Rugosidade tecnológica: perda ou ausência?  (0:36; acumulado 19:15)</w:t>
       </w:r>
     </w:p>
     <w:p>
       <w:r>
-        <w:t>Para ler o laboratório, uso outra ideia de Milton Santos: rugosidade, que são as marcas que um tempo deixa no espaço e que continuam lá. A pergunta é: o laboratório perdeu a função, por falta de manutenção, ou nunca chegou a ter uma, porque faltou formação e tempo? A resposta muda o que a política precisa fazer.</w:t>
+        <w:t>Para interpretar a situação do laboratório, recorro à noção de rugosidade, de Milton Santos, que designa as formas herdadas de períodos anteriores e que permanecem no espaço. A questão é saber se o laboratório perdeu sua função, por falta de manutenção, ou se essa função nunca chegou a constituir-se, por ausência de formação e de tempo de planejamento. Cada hipótese demanda uma resposta de política pública distinta.</w:t>
       </w:r>
     </w:p>
     <w:p>
@@ -2435,12 +2435,12 @@
         <w:pStyle w:val="Heading2"/>
       </w:pPr>
       <w:r>
-        <w:t>Slide 40 – Contribuições analíticas do capítulo  (0:14; acumulado 19:15)</w:t>
+        <w:t>Slide 40 – Contribuições analíticas do capítulo  (0:14; acumulado 19:29)</w:t>
       </w:r>
     </w:p>
     <w:p>
       <w:r>
-        <w:t>Em síntese, o capítulo propõe ler a escola como ponto de uma rede e reconhecer o trabalho dos profissionais sem romantizar o improviso.</w:t>
+        <w:t>Em síntese, o capítulo propõe compreender a escola como ponto de uma rede territorial e reconhecer a atuação dos profissionais sem romantizar o improviso.</w:t>
       </w:r>
     </w:p>
     <w:p>
@@ -2448,12 +2448,12 @@
         <w:pStyle w:val="Heading2"/>
       </w:pPr>
       <w:r>
-        <w:t>Slide 41 – Parte VI – O que ainda falta  (0:05; acumulado 19:20)</w:t>
+        <w:t>Slide 41 – Parte VI – O que ainda falta  (0:06; acumulado 19:35)</w:t>
       </w:r>
     </w:p>
     <w:p>
       <w:r>
-        <w:t>Por fim, o que ainda falta.</w:t>
+        <w:t>Por fim, apresento as etapas que ainda serão realizadas.</w:t>
       </w:r>
     </w:p>
     <w:p>
@@ -2461,12 +2461,12 @@
         <w:pStyle w:val="Heading2"/>
       </w:pPr>
       <w:r>
-        <w:t>Slide 42 – Onde estamos e o que falta  (0:26; acumulado 19:46)</w:t>
+        <w:t>Slide 42 – Onde estamos e o que falta  (0:26; acumulado 20:01)</w:t>
       </w:r>
     </w:p>
     <w:p>
       <w:r>
-        <w:t>Estamos aqui, no meio do caminho. Antes de ir a campo, preciso da aprovação do Comitê de Ética, de registrar os critérios da categoria e de analisar os documentos: a compra do laboratório, a internet, os cadernos de uso e a prestação de contas do programa federal.</w:t>
+        <w:t>Antes do trabalho de campo, restam a aprovação da emenda pelo Comitê de Ética, o registro formal dos critérios da categoria e a análise documental, que inclui a aquisição do laboratório, a conectividade, os cadernos de uso e a prestação de contas do programa federal de conectividade.</w:t>
       </w:r>
     </w:p>
     <w:p>
@@ -2474,12 +2474,12 @@
         <w:pStyle w:val="Heading2"/>
       </w:pPr>
       <w:r>
-        <w:t>Slide 43 – A questão aberta / Agradecimento  (0:35; acumulado 20:21)</w:t>
+        <w:t>Slide 43 – A questão aberta / Agradecimento  (0:39; acumulado 20:40)</w:t>
       </w:r>
     </w:p>
     <w:p>
       <w:r>
-        <w:t>Termino com a pergunta que move a tese. A lei fez da educação digital um direito e deixou os meios na conta de cada governo. Quando o equipamento e a formação não chegam, quem paga esse preço no dia a dia da escola? E o que isso significa para os direitos que a lei prometeu às crianças? Muito obrigada. Fico à disposição para ouvir a banca.</w:t>
+        <w:t>Concluo com a questão que orienta a tese. A política fez da educação digital um direito e deixou a provisão dos meios a cargo de cada ente federado. Quando o equipamento e a formação não chegam à escola, quem arca, no cotidiano escolar, com o custo dessa ausência? E o que isso representa para os direitos que a lei assegurou às crianças? Agradeço a atenção e coloco-me à disposição da banca para as contribuições.</w:t>
       </w:r>
     </w:p>
     <w:p>

</xml_diff>

<commit_message>
Roteiro de fala com as orientações por slide da pesquisadora
Co-Authored-By: Claude Opus 5.5 <noreply@anthropic.com>
Claude-Session: https://claude.ai/code/session_01HxStpW4pQoDfJdTDYr6zEC
</commit_message>
<xml_diff>
--- a/apresentacao_qualificacao/ROTEIRO_DE_FALA_QUALIFICACAO.docx
+++ b/apresentacao_qualificacao/ROTEIRO_DE_FALA_QUALIFICACAO.docx
@@ -17,7 +17,7 @@
     </w:p>
     <w:p>
       <w:r>
-        <w:t>Como usar: o texto está em registro formal e explicativo, adequado à banca de qualificação; recomenda-se ensaiá-lo até que possa ser dito com naturalidade. Os tempos foram calculados a 120 palavras por minuto, mais 2 segundos por troca de slide; o total previsto é de cerca de 20 minutos. Os slides de abertura de parte (5, 20, 22, 25, 33 e 41) são de passagem rápida. Se precisar de mais folga, os slides 17, 18 e 29 podem ser encurtados.</w:t>
+        <w:t>Como usar: o texto está em registro formal e explicativo, adequado à banca de qualificação; recomenda-se ensaiá-lo até que possa ser dito com naturalidade. Os tempos foram calculados a 120 palavras por minuto, mais 2 segundos por troca de slide; o total previsto é de cerca de 20 minutos. Os slides de abertura de parte (5, 21, 23, 26, 34 e 42) são de passagem rápida. Se precisar de mais folga, os slides 18, 19, 20 e 30 podem ser encurtados.</w:t>
       </w:r>
     </w:p>
     <w:tbl>
@@ -91,7 +91,7 @@
           </w:tcPr>
           <w:p>
             <w:r>
-              <w:t>Título</w:t>
+              <w:t>Apresentação do tema</w:t>
             </w:r>
           </w:p>
         </w:tc>
@@ -101,7 +101,7 @@
           </w:tcPr>
           <w:p>
             <w:r>
-              <w:t>0:43</w:t>
+              <w:t>1:02</w:t>
             </w:r>
           </w:p>
         </w:tc>
@@ -111,7 +111,7 @@
           </w:tcPr>
           <w:p>
             <w:r>
-              <w:t>0:43</w:t>
+              <w:t>1:02</w:t>
             </w:r>
           </w:p>
         </w:tc>
@@ -143,7 +143,7 @@
           </w:tcPr>
           <w:p>
             <w:r>
-              <w:t>0:24</w:t>
+              <w:t>0:18</w:t>
             </w:r>
           </w:p>
         </w:tc>
@@ -153,7 +153,7 @@
           </w:tcPr>
           <w:p>
             <w:r>
-              <w:t>1:07</w:t>
+              <w:t>1:20</w:t>
             </w:r>
           </w:p>
         </w:tc>
@@ -175,7 +175,7 @@
           </w:tcPr>
           <w:p>
             <w:r>
-              <w:t>Trajetória: de onde parto</w:t>
+              <w:t>Minha trajetória associada à pesquisa</w:t>
             </w:r>
           </w:p>
         </w:tc>
@@ -185,7 +185,7 @@
           </w:tcPr>
           <w:p>
             <w:r>
-              <w:t>0:50</w:t>
+              <w:t>1:18</w:t>
             </w:r>
           </w:p>
         </w:tc>
@@ -195,7 +195,7 @@
           </w:tcPr>
           <w:p>
             <w:r>
-              <w:t>1:57</w:t>
+              <w:t>2:38</w:t>
             </w:r>
           </w:p>
         </w:tc>
@@ -227,7 +227,7 @@
           </w:tcPr>
           <w:p>
             <w:r>
-              <w:t>0:26</w:t>
+              <w:t>1:24</w:t>
             </w:r>
           </w:p>
         </w:tc>
@@ -237,7 +237,7 @@
           </w:tcPr>
           <w:p>
             <w:r>
-              <w:t>2:23</w:t>
+              <w:t>4:02</w:t>
             </w:r>
           </w:p>
         </w:tc>
@@ -279,7 +279,7 @@
           </w:tcPr>
           <w:p>
             <w:r>
-              <w:t>2:30</w:t>
+              <w:t>4:09</w:t>
             </w:r>
           </w:p>
         </w:tc>
@@ -311,7 +311,7 @@
           </w:tcPr>
           <w:p>
             <w:r>
-              <w:t>0:24</w:t>
+              <w:t>0:12</w:t>
             </w:r>
           </w:p>
         </w:tc>
@@ -321,7 +321,7 @@
           </w:tcPr>
           <w:p>
             <w:r>
-              <w:t>2:54</w:t>
+              <w:t>4:21</w:t>
             </w:r>
           </w:p>
         </w:tc>
@@ -353,7 +353,7 @@
           </w:tcPr>
           <w:p>
             <w:r>
-              <w:t>0:54</w:t>
+              <w:t>1:43</w:t>
             </w:r>
           </w:p>
         </w:tc>
@@ -363,7 +363,7 @@
           </w:tcPr>
           <w:p>
             <w:r>
-              <w:t>3:48</w:t>
+              <w:t>6:04</w:t>
             </w:r>
           </w:p>
         </w:tc>
@@ -395,7 +395,7 @@
           </w:tcPr>
           <w:p>
             <w:r>
-              <w:t>0:46</w:t>
+              <w:t>1:45</w:t>
             </w:r>
           </w:p>
         </w:tc>
@@ -405,7 +405,7 @@
           </w:tcPr>
           <w:p>
             <w:r>
-              <w:t>4:34</w:t>
+              <w:t>7:49</w:t>
             </w:r>
           </w:p>
         </w:tc>
@@ -437,7 +437,7 @@
           </w:tcPr>
           <w:p>
             <w:r>
-              <w:t>0:40</w:t>
+              <w:t>2:28</w:t>
             </w:r>
           </w:p>
         </w:tc>
@@ -447,7 +447,7 @@
           </w:tcPr>
           <w:p>
             <w:r>
-              <w:t>5:14</w:t>
+              <w:t>10:17</w:t>
             </w:r>
           </w:p>
         </w:tc>
@@ -479,7 +479,7 @@
           </w:tcPr>
           <w:p>
             <w:r>
-              <w:t>0:40</w:t>
+              <w:t>0:18</w:t>
             </w:r>
           </w:p>
         </w:tc>
@@ -489,7 +489,7 @@
           </w:tcPr>
           <w:p>
             <w:r>
-              <w:t>5:54</w:t>
+              <w:t>10:35</w:t>
             </w:r>
           </w:p>
         </w:tc>
@@ -511,7 +511,7 @@
           </w:tcPr>
           <w:p>
             <w:r>
-              <w:t>Questão norteadora e objetivos</w:t>
+              <w:t>Problematização: há conexão, faltam computadores e tempo</w:t>
             </w:r>
           </w:p>
         </w:tc>
@@ -521,7 +521,7 @@
           </w:tcPr>
           <w:p>
             <w:r>
-              <w:t>0:32</w:t>
+              <w:t>1:46</w:t>
             </w:r>
           </w:p>
         </w:tc>
@@ -531,7 +531,7 @@
           </w:tcPr>
           <w:p>
             <w:r>
-              <w:t>6:26</w:t>
+              <w:t>12:21</w:t>
             </w:r>
           </w:p>
         </w:tc>
@@ -553,7 +553,7 @@
           </w:tcPr>
           <w:p>
             <w:r>
-              <w:t>Contribuição inédita: discricionariedade substitutiva</w:t>
+              <w:t>Questão norteadora e objetivos</w:t>
             </w:r>
           </w:p>
         </w:tc>
@@ -563,7 +563,7 @@
           </w:tcPr>
           <w:p>
             <w:r>
-              <w:t>0:54</w:t>
+              <w:t>0:22</w:t>
             </w:r>
           </w:p>
         </w:tc>
@@ -573,7 +573,7 @@
           </w:tcPr>
           <w:p>
             <w:r>
-              <w:t>7:20</w:t>
+              <w:t>12:43</w:t>
             </w:r>
           </w:p>
         </w:tc>
@@ -595,7 +595,7 @@
           </w:tcPr>
           <w:p>
             <w:r>
-              <w:t>Três componentes e os riscos a analisar</w:t>
+              <w:t>Contribuição inédita: discricionariedade substitutiva</w:t>
             </w:r>
           </w:p>
         </w:tc>
@@ -605,7 +605,7 @@
           </w:tcPr>
           <w:p>
             <w:r>
-              <w:t>0:33</w:t>
+              <w:t>1:24</w:t>
             </w:r>
           </w:p>
         </w:tc>
@@ -615,7 +615,7 @@
           </w:tcPr>
           <w:p>
             <w:r>
-              <w:t>7:53</w:t>
+              <w:t>14:07</w:t>
             </w:r>
           </w:p>
         </w:tc>
@@ -637,7 +637,7 @@
           </w:tcPr>
           <w:p>
             <w:r>
-              <w:t>Três formulações, dois estatutos</w:t>
+              <w:t>Três componentes e os riscos a analisar</w:t>
             </w:r>
           </w:p>
         </w:tc>
@@ -657,7 +657,7 @@
           </w:tcPr>
           <w:p>
             <w:r>
-              <w:t>8:13</w:t>
+              <w:t>14:27</w:t>
             </w:r>
           </w:p>
         </w:tc>
@@ -679,7 +679,7 @@
           </w:tcPr>
           <w:p>
             <w:r>
-              <w:t>Onde os referenciais deixam de cobrir o caso</w:t>
+              <w:t>Três formulações, dois estatutos</w:t>
             </w:r>
           </w:p>
         </w:tc>
@@ -689,7 +689,7 @@
           </w:tcPr>
           <w:p>
             <w:r>
-              <w:t>0:29</w:t>
+              <w:t>0:10</w:t>
             </w:r>
           </w:p>
         </w:tc>
@@ -699,7 +699,7 @@
           </w:tcPr>
           <w:p>
             <w:r>
-              <w:t>8:42</w:t>
+              <w:t>14:37</w:t>
             </w:r>
           </w:p>
         </w:tc>
@@ -721,7 +721,7 @@
           </w:tcPr>
           <w:p>
             <w:r>
-              <w:t>O motor teórico: duas engrenagens e o fosso entre elas</w:t>
+              <w:t>Onde os referenciais deixam de cobrir o caso</w:t>
             </w:r>
           </w:p>
         </w:tc>
@@ -731,7 +731,7 @@
           </w:tcPr>
           <w:p>
             <w:r>
-              <w:t>1:05</w:t>
+              <w:t>0:10</w:t>
             </w:r>
           </w:p>
         </w:tc>
@@ -741,7 +741,7 @@
           </w:tcPr>
           <w:p>
             <w:r>
-              <w:t>9:47</w:t>
+              <w:t>14:47</w:t>
             </w:r>
           </w:p>
         </w:tc>
@@ -763,7 +763,7 @@
           </w:tcPr>
           <w:p>
             <w:r>
-              <w:t>Como a categoria pode falhar</w:t>
+              <w:t>O motor teórico: duas engrenagens e o fosso entre elas</w:t>
             </w:r>
           </w:p>
         </w:tc>
@@ -783,7 +783,7 @@
           </w:tcPr>
           <w:p>
             <w:r>
-              <w:t>10:15</w:t>
+              <w:t>15:15</w:t>
             </w:r>
           </w:p>
         </w:tc>
@@ -805,7 +805,7 @@
           </w:tcPr>
           <w:p>
             <w:r>
-              <w:t>Ética, posição e reflexividade</w:t>
+              <w:t>Como a categoria pode falhar</w:t>
             </w:r>
           </w:p>
         </w:tc>
@@ -815,7 +815,7 @@
           </w:tcPr>
           <w:p>
             <w:r>
-              <w:t>0:18</w:t>
+              <w:t>0:12</w:t>
             </w:r>
           </w:p>
         </w:tc>
@@ -825,7 +825,7 @@
           </w:tcPr>
           <w:p>
             <w:r>
-              <w:t>10:33</w:t>
+              <w:t>15:27</w:t>
             </w:r>
           </w:p>
         </w:tc>
@@ -847,7 +847,7 @@
           </w:tcPr>
           <w:p>
             <w:r>
-              <w:t>A tessitura: os fios que sustentam a tese</w:t>
+              <w:t>Ética, posição e reflexividade</w:t>
             </w:r>
           </w:p>
         </w:tc>
@@ -857,7 +857,7 @@
           </w:tcPr>
           <w:p>
             <w:r>
-              <w:t>0:15</w:t>
+              <w:t>0:14</w:t>
             </w:r>
           </w:p>
         </w:tc>
@@ -867,7 +867,7 @@
           </w:tcPr>
           <w:p>
             <w:r>
-              <w:t>10:48</w:t>
+              <w:t>15:41</w:t>
             </w:r>
           </w:p>
         </w:tc>
@@ -880,6 +880,48 @@
           <w:p>
             <w:r>
               <w:t>20</w:t>
+            </w:r>
+          </w:p>
+        </w:tc>
+        <w:tc>
+          <w:tcPr>
+            <w:tcW w:type="dxa" w:w="2351"/>
+          </w:tcPr>
+          <w:p>
+            <w:r>
+              <w:t>A tessitura: os fios que sustentam a tese</w:t>
+            </w:r>
+          </w:p>
+        </w:tc>
+        <w:tc>
+          <w:tcPr>
+            <w:tcW w:type="dxa" w:w="2351"/>
+          </w:tcPr>
+          <w:p>
+            <w:r>
+              <w:t>0:10</w:t>
+            </w:r>
+          </w:p>
+        </w:tc>
+        <w:tc>
+          <w:tcPr>
+            <w:tcW w:type="dxa" w:w="2351"/>
+          </w:tcPr>
+          <w:p>
+            <w:r>
+              <w:t>15:51</w:t>
+            </w:r>
+          </w:p>
+        </w:tc>
+      </w:tr>
+      <w:tr>
+        <w:tc>
+          <w:tcPr>
+            <w:tcW w:type="dxa" w:w="2351"/>
+          </w:tcPr>
+          <w:p>
+            <w:r>
+              <w:t>21</w:t>
             </w:r>
           </w:p>
         </w:tc>
@@ -909,7 +951,7 @@
           </w:tcPr>
           <w:p>
             <w:r>
-              <w:t>10:55</w:t>
+              <w:t>15:58</w:t>
             </w:r>
           </w:p>
         </w:tc>
@@ -921,7 +963,7 @@
           </w:tcPr>
           <w:p>
             <w:r>
-              <w:t>21</w:t>
+              <w:t>22</w:t>
             </w:r>
           </w:p>
         </w:tc>
@@ -941,7 +983,7 @@
           </w:tcPr>
           <w:p>
             <w:r>
-              <w:t>0:53</w:t>
+              <w:t>0:30</w:t>
             </w:r>
           </w:p>
         </w:tc>
@@ -951,7 +993,7 @@
           </w:tcPr>
           <w:p>
             <w:r>
-              <w:t>11:48</w:t>
+              <w:t>16:28</w:t>
             </w:r>
           </w:p>
         </w:tc>
@@ -963,7 +1005,7 @@
           </w:tcPr>
           <w:p>
             <w:r>
-              <w:t>22</w:t>
+              <w:t>23</w:t>
             </w:r>
           </w:p>
         </w:tc>
@@ -993,49 +1035,7 @@
           </w:tcPr>
           <w:p>
             <w:r>
-              <w:t>11:53</w:t>
-            </w:r>
-          </w:p>
-        </w:tc>
-      </w:tr>
-      <w:tr>
-        <w:tc>
-          <w:tcPr>
-            <w:tcW w:type="dxa" w:w="2351"/>
-          </w:tcPr>
-          <w:p>
-            <w:r>
-              <w:t>23</w:t>
-            </w:r>
-          </w:p>
-        </w:tc>
-        <w:tc>
-          <w:tcPr>
-            <w:tcW w:type="dxa" w:w="2351"/>
-          </w:tcPr>
-          <w:p>
-            <w:r>
-              <w:t>Desenho: estudo de caso único, qualitativo</w:t>
-            </w:r>
-          </w:p>
-        </w:tc>
-        <w:tc>
-          <w:tcPr>
-            <w:tcW w:type="dxa" w:w="2351"/>
-          </w:tcPr>
-          <w:p>
-            <w:r>
-              <w:t>0:31</w:t>
-            </w:r>
-          </w:p>
-        </w:tc>
-        <w:tc>
-          <w:tcPr>
-            <w:tcW w:type="dxa" w:w="2351"/>
-          </w:tcPr>
-          <w:p>
-            <w:r>
-              <w:t>12:24</w:t>
+              <w:t>16:33</w:t>
             </w:r>
           </w:p>
         </w:tc>
@@ -1057,7 +1057,7 @@
           </w:tcPr>
           <w:p>
             <w:r>
-              <w:t>Quem será ouvido</w:t>
+              <w:t>Desenho: estudo de caso único, qualitativo</w:t>
             </w:r>
           </w:p>
         </w:tc>
@@ -1067,7 +1067,7 @@
           </w:tcPr>
           <w:p>
             <w:r>
-              <w:t>0:28</w:t>
+              <w:t>0:16</w:t>
             </w:r>
           </w:p>
         </w:tc>
@@ -1077,7 +1077,7 @@
           </w:tcPr>
           <w:p>
             <w:r>
-              <w:t>12:52</w:t>
+              <w:t>16:49</w:t>
             </w:r>
           </w:p>
         </w:tc>
@@ -1090,6 +1090,48 @@
           <w:p>
             <w:r>
               <w:t>25</w:t>
+            </w:r>
+          </w:p>
+        </w:tc>
+        <w:tc>
+          <w:tcPr>
+            <w:tcW w:type="dxa" w:w="2351"/>
+          </w:tcPr>
+          <w:p>
+            <w:r>
+              <w:t>Quem será ouvido</w:t>
+            </w:r>
+          </w:p>
+        </w:tc>
+        <w:tc>
+          <w:tcPr>
+            <w:tcW w:type="dxa" w:w="2351"/>
+          </w:tcPr>
+          <w:p>
+            <w:r>
+              <w:t>0:11</w:t>
+            </w:r>
+          </w:p>
+        </w:tc>
+        <w:tc>
+          <w:tcPr>
+            <w:tcW w:type="dxa" w:w="2351"/>
+          </w:tcPr>
+          <w:p>
+            <w:r>
+              <w:t>17:00</w:t>
+            </w:r>
+          </w:p>
+        </w:tc>
+      </w:tr>
+      <w:tr>
+        <w:tc>
+          <w:tcPr>
+            <w:tcW w:type="dxa" w:w="2351"/>
+          </w:tcPr>
+          <w:p>
+            <w:r>
+              <w:t>26</w:t>
             </w:r>
           </w:p>
         </w:tc>
@@ -1119,49 +1161,7 @@
           </w:tcPr>
           <w:p>
             <w:r>
-              <w:t>12:59</w:t>
-            </w:r>
-          </w:p>
-        </w:tc>
-      </w:tr>
-      <w:tr>
-        <w:tc>
-          <w:tcPr>
-            <w:tcW w:type="dxa" w:w="2351"/>
-          </w:tcPr>
-          <w:p>
-            <w:r>
-              <w:t>26</w:t>
-            </w:r>
-          </w:p>
-        </w:tc>
-        <w:tc>
-          <w:tcPr>
-            <w:tcW w:type="dxa" w:w="2351"/>
-          </w:tcPr>
-          <w:p>
-            <w:r>
-              <w:t>A agenda internacional: das presenças às condições</w:t>
-            </w:r>
-          </w:p>
-        </w:tc>
-        <w:tc>
-          <w:tcPr>
-            <w:tcW w:type="dxa" w:w="2351"/>
-          </w:tcPr>
-          <w:p>
-            <w:r>
-              <w:t>0:41</w:t>
-            </w:r>
-          </w:p>
-        </w:tc>
-        <w:tc>
-          <w:tcPr>
-            <w:tcW w:type="dxa" w:w="2351"/>
-          </w:tcPr>
-          <w:p>
-            <w:r>
-              <w:t>13:40</w:t>
+              <w:t>17:07</w:t>
             </w:r>
           </w:p>
         </w:tc>
@@ -1183,7 +1183,7 @@
           </w:tcPr>
           <w:p>
             <w:r>
-              <w:t>Mapa das políticas de educação digital</w:t>
+              <w:t>A agenda internacional: das presenças às condições</w:t>
             </w:r>
           </w:p>
         </w:tc>
@@ -1193,7 +1193,7 @@
           </w:tcPr>
           <w:p>
             <w:r>
-              <w:t>0:16</w:t>
+              <w:t>0:13</w:t>
             </w:r>
           </w:p>
         </w:tc>
@@ -1203,7 +1203,7 @@
           </w:tcPr>
           <w:p>
             <w:r>
-              <w:t>13:56</w:t>
+              <w:t>17:20</w:t>
             </w:r>
           </w:p>
         </w:tc>
@@ -1225,7 +1225,7 @@
           </w:tcPr>
           <w:p>
             <w:r>
-              <w:t>O que essas experiências trazem para a tese</w:t>
+              <w:t>Mapa das políticas de educação digital</w:t>
             </w:r>
           </w:p>
         </w:tc>
@@ -1235,7 +1235,7 @@
           </w:tcPr>
           <w:p>
             <w:r>
-              <w:t>0:24</w:t>
+              <w:t>0:10</w:t>
             </w:r>
           </w:p>
         </w:tc>
@@ -1245,7 +1245,7 @@
           </w:tcPr>
           <w:p>
             <w:r>
-              <w:t>14:20</w:t>
+              <w:t>17:30</w:t>
             </w:r>
           </w:p>
         </w:tc>
@@ -1267,7 +1267,7 @@
           </w:tcPr>
           <w:p>
             <w:r>
-              <w:t>Quatro décadas até a PNED</w:t>
+              <w:t>O que essas experiências trazem para a tese</w:t>
             </w:r>
           </w:p>
         </w:tc>
@@ -1277,7 +1277,7 @@
           </w:tcPr>
           <w:p>
             <w:r>
-              <w:t>0:19</w:t>
+              <w:t>0:08</w:t>
             </w:r>
           </w:p>
         </w:tc>
@@ -1287,7 +1287,7 @@
           </w:tcPr>
           <w:p>
             <w:r>
-              <w:t>14:39</w:t>
+              <w:t>17:38</w:t>
             </w:r>
           </w:p>
         </w:tc>
@@ -1309,7 +1309,7 @@
           </w:tcPr>
           <w:p>
             <w:r>
-              <w:t>Por que a PNED importa</w:t>
+              <w:t>Quatro décadas até a PNED</w:t>
             </w:r>
           </w:p>
         </w:tc>
@@ -1319,7 +1319,7 @@
           </w:tcPr>
           <w:p>
             <w:r>
-              <w:t>0:24</w:t>
+              <w:t>0:09</w:t>
             </w:r>
           </w:p>
         </w:tc>
@@ -1329,7 +1329,7 @@
           </w:tcPr>
           <w:p>
             <w:r>
-              <w:t>15:03</w:t>
+              <w:t>17:47</w:t>
             </w:r>
           </w:p>
         </w:tc>
@@ -1351,7 +1351,7 @@
           </w:tcPr>
           <w:p>
             <w:r>
-              <w:t>A PNED e o calendário da exigência</w:t>
+              <w:t>Por que a PNED importa</w:t>
             </w:r>
           </w:p>
         </w:tc>
@@ -1361,7 +1361,7 @@
           </w:tcPr>
           <w:p>
             <w:r>
-              <w:t>0:31</w:t>
+              <w:t>0:13</w:t>
             </w:r>
           </w:p>
         </w:tc>
@@ -1371,7 +1371,7 @@
           </w:tcPr>
           <w:p>
             <w:r>
-              <w:t>15:34</w:t>
+              <w:t>18:00</w:t>
             </w:r>
           </w:p>
         </w:tc>
@@ -1393,7 +1393,7 @@
           </w:tcPr>
           <w:p>
             <w:r>
-              <w:t>A promessa e o desenho</w:t>
+              <w:t>A PNED e o calendário da exigência</w:t>
             </w:r>
           </w:p>
         </w:tc>
@@ -1403,7 +1403,7 @@
           </w:tcPr>
           <w:p>
             <w:r>
-              <w:t>0:38</w:t>
+              <w:t>0:12</w:t>
             </w:r>
           </w:p>
         </w:tc>
@@ -1413,7 +1413,7 @@
           </w:tcPr>
           <w:p>
             <w:r>
-              <w:t>16:12</w:t>
+              <w:t>18:12</w:t>
             </w:r>
           </w:p>
         </w:tc>
@@ -1426,6 +1426,48 @@
           <w:p>
             <w:r>
               <w:t>33</w:t>
+            </w:r>
+          </w:p>
+        </w:tc>
+        <w:tc>
+          <w:tcPr>
+            <w:tcW w:type="dxa" w:w="2351"/>
+          </w:tcPr>
+          <w:p>
+            <w:r>
+              <w:t>A promessa e o desenho</w:t>
+            </w:r>
+          </w:p>
+        </w:tc>
+        <w:tc>
+          <w:tcPr>
+            <w:tcW w:type="dxa" w:w="2351"/>
+          </w:tcPr>
+          <w:p>
+            <w:r>
+              <w:t>0:20</w:t>
+            </w:r>
+          </w:p>
+        </w:tc>
+        <w:tc>
+          <w:tcPr>
+            <w:tcW w:type="dxa" w:w="2351"/>
+          </w:tcPr>
+          <w:p>
+            <w:r>
+              <w:t>18:32</w:t>
+            </w:r>
+          </w:p>
+        </w:tc>
+      </w:tr>
+      <w:tr>
+        <w:tc>
+          <w:tcPr>
+            <w:tcW w:type="dxa" w:w="2351"/>
+          </w:tcPr>
+          <w:p>
+            <w:r>
+              <w:t>34</w:t>
             </w:r>
           </w:p>
         </w:tc>
@@ -1455,49 +1497,7 @@
           </w:tcPr>
           <w:p>
             <w:r>
-              <w:t>16:18</w:t>
-            </w:r>
-          </w:p>
-        </w:tc>
-      </w:tr>
-      <w:tr>
-        <w:tc>
-          <w:tcPr>
-            <w:tcW w:type="dxa" w:w="2351"/>
-          </w:tcPr>
-          <w:p>
-            <w:r>
-              <w:t>34</w:t>
-            </w:r>
-          </w:p>
-        </w:tc>
-        <w:tc>
-          <w:tcPr>
-            <w:tcW w:type="dxa" w:w="2351"/>
-          </w:tcPr>
-          <w:p>
-            <w:r>
-              <w:t>A antiga Pipa: trabalho, moradia e mar</w:t>
-            </w:r>
-          </w:p>
-        </w:tc>
-        <w:tc>
-          <w:tcPr>
-            <w:tcW w:type="dxa" w:w="2351"/>
-          </w:tcPr>
-          <w:p>
-            <w:r>
-              <w:t>0:24</w:t>
-            </w:r>
-          </w:p>
-        </w:tc>
-        <w:tc>
-          <w:tcPr>
-            <w:tcW w:type="dxa" w:w="2351"/>
-          </w:tcPr>
-          <w:p>
-            <w:r>
-              <w:t>16:42</w:t>
+              <w:t>18:38</w:t>
             </w:r>
           </w:p>
         </w:tc>
@@ -1519,7 +1519,7 @@
           </w:tcPr>
           <w:p>
             <w:r>
-              <w:t>As transformações: de vila a polo turístico</w:t>
+              <w:t>A antiga Pipa: trabalho, moradia e mar</w:t>
             </w:r>
           </w:p>
         </w:tc>
@@ -1529,7 +1529,7 @@
           </w:tcPr>
           <w:p>
             <w:r>
-              <w:t>0:21</w:t>
+              <w:t>0:12</w:t>
             </w:r>
           </w:p>
         </w:tc>
@@ -1539,7 +1539,7 @@
           </w:tcPr>
           <w:p>
             <w:r>
-              <w:t>17:03</w:t>
+              <w:t>18:50</w:t>
             </w:r>
           </w:p>
         </w:tc>
@@ -1561,7 +1561,7 @@
           </w:tcPr>
           <w:p>
             <w:r>
-              <w:t>A Pipa de hoje: um território conectado</w:t>
+              <w:t>As transformações: de vila a polo turístico</w:t>
             </w:r>
           </w:p>
         </w:tc>
@@ -1571,7 +1571,7 @@
           </w:tcPr>
           <w:p>
             <w:r>
-              <w:t>0:47</w:t>
+              <w:t>0:10</w:t>
             </w:r>
           </w:p>
         </w:tc>
@@ -1581,7 +1581,7 @@
           </w:tcPr>
           <w:p>
             <w:r>
-              <w:t>17:50</w:t>
+              <w:t>19:00</w:t>
             </w:r>
           </w:p>
         </w:tc>
@@ -1603,7 +1603,7 @@
           </w:tcPr>
           <w:p>
             <w:r>
-              <w:t>A escola não se resume ao que falta</w:t>
+              <w:t>A Pipa de hoje: um território conectado</w:t>
             </w:r>
           </w:p>
         </w:tc>
@@ -1613,7 +1613,7 @@
           </w:tcPr>
           <w:p>
             <w:r>
-              <w:t>0:15</w:t>
+              <w:t>0:26</w:t>
             </w:r>
           </w:p>
         </w:tc>
@@ -1623,7 +1623,7 @@
           </w:tcPr>
           <w:p>
             <w:r>
-              <w:t>18:05</w:t>
+              <w:t>19:26</w:t>
             </w:r>
           </w:p>
         </w:tc>
@@ -1645,7 +1645,7 @@
           </w:tcPr>
           <w:p>
             <w:r>
-              <w:t>Na escola: o que existe e onde está</w:t>
+              <w:t>A escola não se resume ao que falta</w:t>
             </w:r>
           </w:p>
         </w:tc>
@@ -1655,7 +1655,7 @@
           </w:tcPr>
           <w:p>
             <w:r>
-              <w:t>0:34</w:t>
+              <w:t>0:10</w:t>
             </w:r>
           </w:p>
         </w:tc>
@@ -1665,7 +1665,7 @@
           </w:tcPr>
           <w:p>
             <w:r>
-              <w:t>18:39</w:t>
+              <w:t>19:36</w:t>
             </w:r>
           </w:p>
         </w:tc>
@@ -1687,7 +1687,7 @@
           </w:tcPr>
           <w:p>
             <w:r>
-              <w:t>Rugosidade tecnológica: perda ou ausência?</w:t>
+              <w:t>Na escola: o que existe e onde está</w:t>
             </w:r>
           </w:p>
         </w:tc>
@@ -1697,7 +1697,7 @@
           </w:tcPr>
           <w:p>
             <w:r>
-              <w:t>0:36</w:t>
+              <w:t>0:16</w:t>
             </w:r>
           </w:p>
         </w:tc>
@@ -1707,7 +1707,7 @@
           </w:tcPr>
           <w:p>
             <w:r>
-              <w:t>19:15</w:t>
+              <w:t>19:52</w:t>
             </w:r>
           </w:p>
         </w:tc>
@@ -1729,7 +1729,7 @@
           </w:tcPr>
           <w:p>
             <w:r>
-              <w:t>Contribuições analíticas do capítulo</w:t>
+              <w:t>Rugosidade tecnológica: perda ou ausência?</w:t>
             </w:r>
           </w:p>
         </w:tc>
@@ -1739,7 +1739,7 @@
           </w:tcPr>
           <w:p>
             <w:r>
-              <w:t>0:14</w:t>
+              <w:t>0:15</w:t>
             </w:r>
           </w:p>
         </w:tc>
@@ -1749,7 +1749,7 @@
           </w:tcPr>
           <w:p>
             <w:r>
-              <w:t>19:29</w:t>
+              <w:t>20:07</w:t>
             </w:r>
           </w:p>
         </w:tc>
@@ -1762,6 +1762,48 @@
           <w:p>
             <w:r>
               <w:t>41</w:t>
+            </w:r>
+          </w:p>
+        </w:tc>
+        <w:tc>
+          <w:tcPr>
+            <w:tcW w:type="dxa" w:w="2351"/>
+          </w:tcPr>
+          <w:p>
+            <w:r>
+              <w:t>Contribuições analíticas do capítulo</w:t>
+            </w:r>
+          </w:p>
+        </w:tc>
+        <w:tc>
+          <w:tcPr>
+            <w:tcW w:type="dxa" w:w="2351"/>
+          </w:tcPr>
+          <w:p>
+            <w:r>
+              <w:t>0:10</w:t>
+            </w:r>
+          </w:p>
+        </w:tc>
+        <w:tc>
+          <w:tcPr>
+            <w:tcW w:type="dxa" w:w="2351"/>
+          </w:tcPr>
+          <w:p>
+            <w:r>
+              <w:t>20:17</w:t>
+            </w:r>
+          </w:p>
+        </w:tc>
+      </w:tr>
+      <w:tr>
+        <w:tc>
+          <w:tcPr>
+            <w:tcW w:type="dxa" w:w="2351"/>
+          </w:tcPr>
+          <w:p>
+            <w:r>
+              <w:t>42</w:t>
             </w:r>
           </w:p>
         </w:tc>
@@ -1791,49 +1833,7 @@
           </w:tcPr>
           <w:p>
             <w:r>
-              <w:t>19:35</w:t>
-            </w:r>
-          </w:p>
-        </w:tc>
-      </w:tr>
-      <w:tr>
-        <w:tc>
-          <w:tcPr>
-            <w:tcW w:type="dxa" w:w="2351"/>
-          </w:tcPr>
-          <w:p>
-            <w:r>
-              <w:t>42</w:t>
-            </w:r>
-          </w:p>
-        </w:tc>
-        <w:tc>
-          <w:tcPr>
-            <w:tcW w:type="dxa" w:w="2351"/>
-          </w:tcPr>
-          <w:p>
-            <w:r>
-              <w:t>Onde estamos e o que falta</w:t>
-            </w:r>
-          </w:p>
-        </w:tc>
-        <w:tc>
-          <w:tcPr>
-            <w:tcW w:type="dxa" w:w="2351"/>
-          </w:tcPr>
-          <w:p>
-            <w:r>
-              <w:t>0:26</w:t>
-            </w:r>
-          </w:p>
-        </w:tc>
-        <w:tc>
-          <w:tcPr>
-            <w:tcW w:type="dxa" w:w="2351"/>
-          </w:tcPr>
-          <w:p>
-            <w:r>
-              <w:t>20:01</w:t>
+              <w:t>20:23</w:t>
             </w:r>
           </w:p>
         </w:tc>
@@ -1855,7 +1855,7 @@
           </w:tcPr>
           <w:p>
             <w:r>
-              <w:t>A questão aberta / Agradecimento</w:t>
+              <w:t>Onde estamos e o que falta</w:t>
             </w:r>
           </w:p>
         </w:tc>
@@ -1865,7 +1865,7 @@
           </w:tcPr>
           <w:p>
             <w:r>
-              <w:t>0:39</w:t>
+              <w:t>0:11</w:t>
             </w:r>
           </w:p>
         </w:tc>
@@ -1875,7 +1875,7 @@
           </w:tcPr>
           <w:p>
             <w:r>
-              <w:t>20:40</w:t>
+              <w:t>20:34</w:t>
             </w:r>
           </w:p>
         </w:tc>
@@ -1888,6 +1888,48 @@
           <w:p>
             <w:r>
               <w:t>44</w:t>
+            </w:r>
+          </w:p>
+        </w:tc>
+        <w:tc>
+          <w:tcPr>
+            <w:tcW w:type="dxa" w:w="2351"/>
+          </w:tcPr>
+          <w:p>
+            <w:r>
+              <w:t>A questão aberta / Agradecimento</w:t>
+            </w:r>
+          </w:p>
+        </w:tc>
+        <w:tc>
+          <w:tcPr>
+            <w:tcW w:type="dxa" w:w="2351"/>
+          </w:tcPr>
+          <w:p>
+            <w:r>
+              <w:t>0:24</w:t>
+            </w:r>
+          </w:p>
+        </w:tc>
+        <w:tc>
+          <w:tcPr>
+            <w:tcW w:type="dxa" w:w="2351"/>
+          </w:tcPr>
+          <w:p>
+            <w:r>
+              <w:t>20:58</w:t>
+            </w:r>
+          </w:p>
+        </w:tc>
+      </w:tr>
+      <w:tr>
+        <w:tc>
+          <w:tcPr>
+            <w:tcW w:type="dxa" w:w="2351"/>
+          </w:tcPr>
+          <w:p>
+            <w:r>
+              <w:t>45</w:t>
             </w:r>
           </w:p>
         </w:tc>
@@ -1928,12 +1970,12 @@
         <w:pStyle w:val="Heading2"/>
       </w:pPr>
       <w:r>
-        <w:t>Slide 1 – Título  (0:43; acumulado 0:43)</w:t>
+        <w:t>Slide 1 – Apresentação do tema  (1:02; acumulado 1:02)</w:t>
       </w:r>
     </w:p>
     <w:p>
       <w:r>
-        <w:t>Bom dia. Cumprimento os membros da banca, a quem agradeço a leitura atenta do texto, e minha orientadora, professora Maria Cristina Leandro de Paiva. Apresento a qualificação da tese intitulada “A política no canteiro da prática: norma, território e atuação profissional na implementação da educação digital escolar nos anos iniciais”. A investigação busca compreender de que modo uma política nacional de educação digital é recebida, interpretada e posta em prática em uma escola pública situada em Pipa, distrito de Tibau do Sul.</w:t>
+        <w:t>Bom dia. Cumprimento os membros da banca, a quem agradeço a leitura atenta do texto, e minha orientadora, professora Maria Cristina Leandro de Paiva. Apresento a qualificação da tese intitulada “A política no canteiro da prática: norma, território e atuação profissional na implementação da educação digital escolar nos anos iniciais”. O tema da pesquisa é a Política Nacional de Educação Digital, instituída em 2023, observada no ponto em que ela efetivamente se realiza: a escola. Interessa-me compreender como essa política é recebida, interpretada e posta em prática pelos profissionais da educação de uma escola pública dos anos iniciais em Pipa, distrito de Tibau do Sul, no Rio Grande do Norte, e em que condições materiais, institucionais e territoriais isso acontece.</w:t>
       </w:r>
     </w:p>
     <w:p>
@@ -1941,12 +1983,12 @@
         <w:pStyle w:val="Heading2"/>
       </w:pPr>
       <w:r>
-        <w:t>Slide 2 – Percurso da apresentação  (0:24; acumulado 1:07)</w:t>
+        <w:t>Slide 2 – Percurso da apresentação  (0:18; acumulado 1:20)</w:t>
       </w:r>
     </w:p>
     <w:p>
       <w:r>
-        <w:t>A exposição está organizada em seis partes: a proposta da tese; a revisão sistemática da literatura; o desenho metodológico; a análise da agenda internacional e da Política Nacional de Educação Digital; o território e a escola; e, por fim, as etapas que ainda serão realizadas.</w:t>
+        <w:t>A exposição organiza-se em seis partes: a proposta da tese, a revisão sistemática, a metodologia, a agenda internacional e a PNED, o território e a escola e, por fim, as etapas que restam.</w:t>
       </w:r>
     </w:p>
     <w:p>
@@ -1954,12 +1996,12 @@
         <w:pStyle w:val="Heading2"/>
       </w:pPr>
       <w:r>
-        <w:t>Slide 3 – Trajetória: de onde parto  (0:50; acumulado 1:57)</w:t>
+        <w:t>Slide 3 – Minha trajetória associada à pesquisa  (1:18; acumulado 2:38)</w:t>
       </w:r>
     </w:p>
     <w:p>
       <w:r>
-        <w:t>Inicio pela posição de quem pesquisa, pois ela integra as condições da investigação. Convivo com o território de Pipa há quase duas décadas e atuei por dezoito anos na rede municipal de Tibau do Sul. No mestrado, realizei uma pesquisa-ação na mesma escola, durante o ensino remoto, e constatei que setenta por cento das crianças da turma compartilhavam o aparelho celular com os pais. Em razão dessa proximidade, adotei uma regra de método: a memória não é tomada como dado. A trajetória orienta o olhar, mas as afirmações da tese apoiam-se exclusivamente nos instrumentos de pesquisa.</w:t>
+        <w:t>Inicio pela minha trajetória, porque ela está diretamente associada à origem desta pesquisa. Convivo com o território de Pipa há quase duas décadas e atuei por dezoito anos na rede municipal de educação de Tibau do Sul, o que me permitiu acompanhar de perto o modo como as políticas chegam às escolas. No mestrado, realizei uma pesquisa-ação com uma turma de 2º ano da mesma escola, durante o ensino remoto. Naquele período, as atividades eram assíncronas, enviadas por aplicativos de mensagens, e setenta por cento das crianças dependiam do celular dos pais ou responsáveis para acompanhá-las. Foi essa experiência que me levou ao doutorado: a mesma escola, agora diante de uma lei que transforma a educação digital em direito e componente curricular. Por isso, adotei uma regra de método: a memória não é tomada como dado. A trajetória orienta o olhar, mas as afirmações da tese apoiam-se nos instrumentos de pesquisa.</w:t>
       </w:r>
     </w:p>
     <w:p>
@@ -1967,12 +2009,12 @@
         <w:pStyle w:val="Heading2"/>
       </w:pPr>
       <w:r>
-        <w:t>Slide 4 – Relevâncias da pesquisa  (0:26; acumulado 2:23)</w:t>
+        <w:t>Slide 4 – Relevâncias da pesquisa  (1:24; acumulado 4:02)</w:t>
       </w:r>
     </w:p>
     <w:p>
       <w:r>
-        <w:t>A pesquisa apresenta relevância em três dimensões. Do ponto de vista científico, a política ainda não foi examinada empiricamente nos anos iniciais, e as redes municipais de pequeno porte permanecem pouco estudadas. Do ponto de vista social, trata de cidadania e de proteção da infância no ambiente digital.</w:t>
+        <w:t>A pesquisa apresenta três relevâncias. A relevância pessoal decorre da continuidade com o mestrado e da convivência com Pipa e com a rede municipal; ela exige, ao mesmo tempo, cuidado redobrado, porque o município é um dos entes federados aos quais a lei atribui a provisão dos meios, de modo que não olho o problema de fora. A relevância científica está em três pontos: a PNED ainda não foi examinada empiricamente nos anos iniciais; o ciclo de alfabetização e as redes municipais de pequeno porte estão quase ausentes da literatura; e a tese propõe uma categoria nova, com critérios de refutação definidos antes do campo, além de ler a política pelo espaço, por meio das noções de habitar digital e rugosidade tecnológica. A relevância social, por fim, reside no fato de que o eixo investigado trata de cidadania e de proteção da infância no ambiente digital; a presença das tecnologias na vida das crianças não garante as mesmas condições de uso e de compreensão;.</w:t>
       </w:r>
     </w:p>
     <w:p>
@@ -1980,7 +2022,7 @@
         <w:pStyle w:val="Heading2"/>
       </w:pPr>
       <w:r>
-        <w:t>Slide 5 – Parte I – A proposta da tese  (0:07; acumulado 2:30)</w:t>
+        <w:t>Slide 5 – Parte I – A proposta da tese  (0:07; acumulado 4:09)</w:t>
       </w:r>
     </w:p>
     <w:p>
@@ -1993,12 +2035,12 @@
         <w:pStyle w:val="Heading2"/>
       </w:pPr>
       <w:r>
-        <w:t>Slide 6 – Estrutura da tese  (0:24; acumulado 2:54)</w:t>
+        <w:t>Slide 6 – Estrutura da tese  (0:12; acumulado 4:21)</w:t>
       </w:r>
     </w:p>
     <w:p>
       <w:r>
-        <w:t>A tese organiza-se em oito capítulos. A introdução, a revisão sistemática, a metodologia, a análise da política e o capítulo sobre o território encontram-se redigidos. O terceiro capítulo, de fundamentação teórica, está em elaboração, e os capítulos sete e oito dependem do trabalho de campo.</w:t>
+        <w:t>A tese tem oito capítulos; cinco estão redigidos, o terceiro está em elaboração e os dois últimos dependem do campo.</w:t>
       </w:r>
     </w:p>
     <w:p>
@@ -2006,12 +2048,12 @@
         <w:pStyle w:val="Heading2"/>
       </w:pPr>
       <w:r>
-        <w:t>Slide 7 – A tese em uma imagem: o vazio material  (0:54; acumulado 3:48)</w:t>
+        <w:t>Slide 7 – A tese em uma imagem: o vazio material  (1:43; acumulado 6:04)</w:t>
       </w:r>
     </w:p>
     <w:p>
       <w:r>
-        <w:t>Este slide sintetiza o argumento central. A Lei nº 14.533, de 2023, instituiu a Política Nacional de Educação Digital, que denomino PNED. Por meio dela, a educação digital passou a constituir direito, dever do Estado e componente curricular do ensino fundamental. Contudo, a lei não assegura as condições necessárias à sua realização, como formação específica dos profissionais, infraestrutura de rede e tempo de planejamento, que acabam sendo construídas, ou não, no cotidiano escolar. Daí decorre a questão norteadora: como ocorre a implementação do eixo Educação Digital Escolar nos anos iniciais, considerando os processos de interpretação, tradução e recontextualização construídos pelos profissionais da educação?</w:t>
+        <w:t>Este slide sintetiza o argumento central. A Lei nº 14.533, de 2023, que institui a Política Nacional de Educação Digital, coloca a escola numa posição que exige muito mais do que o uso de equipamentos nas atividades pedagógicas. Por essa razão, a tese adota a noção de educação digital, e não apenas de letramento digital ou de uso de tecnologias, pois ela abrange dimensões culturais, éticas, críticas, sociais e cidadãs. Essas expressões, contudo, não são autoevidentes. Quando uma professora afirma trabalhar cultura digital, ou uma gestora afirma cuidar dos direitos digitais das crianças, cada uma fala a partir de um entendimento próprio. Com Stuart Hall, compreendo que essas falas constroem sentidos, e que os sentidos organizam a ação; por isso, as narrativas dos profissionais estão no centro da pesquisa. O problema reside na distância entre o direito declarado e os meios garantidos: a lei não assegura formação, infraestrutura de rede nem tempo de planejamento. Para ler essa distância, o desenho mobiliza Mainardes, que sistematizou no Brasil a Abordagem do Ciclo de Políticas e orienta a análise dos contextos de influência, de produção do texto e da prática, e Lipsky, que permite compreender as decisões tomadas pelos profissionais na ponta do serviço público.</w:t>
       </w:r>
     </w:p>
     <w:p>
@@ -2019,12 +2061,12 @@
         <w:pStyle w:val="Heading2"/>
       </w:pPr>
       <w:r>
-        <w:t>Slide 8 – O objeto e o recorte  (0:46; acumulado 4:34)</w:t>
+        <w:t>Slide 8 – O objeto e o recorte  (1:45; acumulado 7:49)</w:t>
       </w:r>
     </w:p>
     <w:p>
       <w:r>
-        <w:t>O recorte nas turmas de 1º e 2º anos justifica-se pela organização do trabalho escolar: nessas turmas, a mesma professora acompanha as crianças durante toda a jornada, o que permite identificar a autoria das decisões relativas à educação digital. Trata-se, ainda, do ingresso da criança no Ensino Fundamental, momento em que a familiaridade com aparelhos não se converte, por si só, em compreensão crítica dos usos, riscos e direitos. Ressalto que não se avaliam aprendizagens, não se observam aulas e as crianças não participam diretamente da produção de dados.</w:t>
+        <w:t>O objeto é a implementação do eixo Educação Digital Escolar nos anos iniciais da Escola Municipal Domitila Castelo. Cabe explicar o uso de dois termos. Mantenho a palavra implementação porque é o termo empregado pela própria legislação e pelo campo das políticas educacionais, e ela nomeia o processo investigado. Adoto, porém, a noção de atuação, de Ball, Maguire e Braun, como perspectiva de análise, porque ela recusa a ideia de simples execução: a política é interpretada, traduzida e recriada por quem a realiza. Esse é o sentido do contexto da prática, formulado por Bowe, Ball e Gold e sistematizado por Mainardes. O recorte no 1º e no 2º anos justifica-se porque, nessas turmas, a mesma professora acompanha as crianças durante toda a jornada, e a decisão sobre se e quando a educação digital acontece tem autoria identificável. Trata-se, além disso, do ingresso na escolarização obrigatória. Com Buckingham, lembro que as crianças não sabem usar as tecnologias de forma natural: a familiaridade com aparelhos não garante compreensão crítica dos usos, dos riscos e dos direitos, e essa compreensão precisa ser ensinada. Zuboff e Morozov, que discutem o capitalismo de vigilância e o solucionismo tecnológico, entram como contexto em que a política surge, e não como objeto empírico.</w:t>
       </w:r>
     </w:p>
     <w:p>
@@ -2032,12 +2074,12 @@
         <w:pStyle w:val="Heading2"/>
       </w:pPr>
       <w:r>
-        <w:t>Slide 9 – Justificativa  (0:40; acumulado 5:14)</w:t>
+        <w:t>Slide 9 – Justificativa  (2:28; acumulado 10:17)</w:t>
       </w:r>
     </w:p>
     <w:p>
       <w:r>
-        <w:t>A justificativa apoia-se em três razões. A primeira diz respeito ao que a lei promete às crianças: participação consciente e democrática no ambiente digital e proteção de seus dados. A segunda refere-se aos sujeitos que realizam a política, isto é, professoras, coordenação, direção e equipe da Secretaria. A terceira relaciona-se ao território: Pipa reúne famílias de moradores antigos, migrantes, estrangeiros e trabalhadores do turismo, cujas crianças chegam à mesma turma com experiências digitais bastante desiguais.</w:t>
+        <w:t>A justificativa organiza-se em quatro razões. A primeira está no que a legislação promete às crianças. A Lei nº 14.533, de 2023, associa, no artigo 3º, incisos III e IV, a cultura digital à participação consciente e democrática por meio das tecnologias e os direitos digitais à proteção dos dados de crianças e adolescentes. Com a derrubada do veto, a educação digital passou a ser componente curricular do ensino fundamental, pelo parágrafo 11 do artigo 26 da LDB, a Lei nº 9.394, de 1996. E a Lei nº 15.211, de 2025, o Estatuto Digital da Criança e do Adolescente, em vigor desde março de 2026, reforçou a proteção da infância no ambiente digital. A segunda razão diz respeito a quem faz a política acontecer. Utilizo a expressão profissionais da educação, e não apenas docentes, porque a implementação envolve professoras regentes, coordenação, direção e equipe técnica da Secretaria. É também a denominação adotada pela LDB, no Título VI, e pela Lei nº 14.817, de 2024; e, com Lipsky, entendo que cada uma dessas posições decide a política a partir de margens próprias. A terceira razão é o território. Milton Santos propõe que a categoria de análise não é o território em si, mas o território usado, entendido como campo de forças em que se confrontam o Estado e o mercado, o uso econômico e o uso social dos recursos. Doreen Massey compreende o lugar como encontro de trajetórias, o desafio de negociar um aqui e agora entre pessoas que chegaram por caminhos diferentes. Essas leituras mostram que a mesma turma reúne crianças com trajetórias e experiências digitais desiguais. A quarta razão é o que o eixo pede: ao reunir cinco dimensões, ele amplia o que se cobra das redes e das escolas públicas.</w:t>
       </w:r>
     </w:p>
     <w:p>
@@ -2045,12 +2087,12 @@
         <w:pStyle w:val="Heading2"/>
       </w:pPr>
       <w:r>
-        <w:t>Slide 10 – Problematização: do portão para fora, do portão para dentro  (0:40; acumulado 5:54)</w:t>
+        <w:t>Slide 10 – Problematização: do portão para fora, do portão para dentro  (0:18; acumulado 10:35)</w:t>
       </w:r>
     </w:p>
     <w:p>
       <w:r>
-        <w:t>A problematização pode ser visualizada neste contraste. Fora da escola, Pipa constitui um polo turístico conectado, no qual hospedagem, alimentação e passeios são comercializados pela internet. Dentro da escola, no momento do registro fotográfico, o laboratório apresentava os computadores desligados, e as salas de 1º e 2º anos não dispunham de qualquer dispositivo digital. O mesmo território abriga, portanto, circuitos de alta conectividade e uma escola pública que não dispõe desses recursos nas mesmas condições.</w:t>
+        <w:t>Fora da escola, Pipa é um polo turístico conectado; dentro dela, no registro fotográfico, o laboratório estava com os computadores desligados e as salas de 1º e 2º anos não tinham dispositivos digitais.</w:t>
       </w:r>
     </w:p>
     <w:p>
@@ -2058,12 +2100,12 @@
         <w:pStyle w:val="Heading2"/>
       </w:pPr>
       <w:r>
-        <w:t>Slide 11 – Questão norteadora e objetivos  (0:32; acumulado 6:26)</w:t>
+        <w:t>Slide 11 – Problematização: há conexão, faltam computadores e tempo  (1:46; acumulado 12:21)</w:t>
       </w:r>
     </w:p>
     <w:p>
       <w:r>
-        <w:t>Para responder à questão norteadora, defini três objetivos específicos, cada um correspondente a um capítulo. O primeiro examina o que a política promete e com que meios. O segundo caracteriza as condições territoriais e institucionais que recebem a política. O terceiro busca compreender como os profissionais interpretam e atuam diante da distância entre as exigências da norma e as condições disponíveis.</w:t>
+        <w:t>Este slide apresenta os dados que sustentam a problematização. Segundo a pesquisa TIC Educação 2024, do Comitê Gestor da Internet no Brasil, 96% das escolas brasileiras possuem acesso à internet, e na rede municipal o percentual é de 94%. Contudo, em 2024, menos de três em cada dez escolas rurais dispunham de computadores para uso dos alunos. A conexão chegou, mas o equipamento que permitiria levá-la ao trabalho pedagógico não chegou na mesma medida. O segundo dado refere-se ao tempo de trabalho. Queiroz e Paiva, com base em pesquisa realizada entre 2009 e 2010 em municípios do Rio Grande do Norte, registram que 81,1% dos profissionais levavam, sempre ou frequentemente, atividades do trabalho para realizar em casa. O dado antecede a PNED, mas situa o cenário. Para nomear esse problema, adoto o conceito de condições de trabalho de Oliveira e Vieira, retomado por Queiroz e Paiva: a forma como está organizado o processo de trabalho nas unidades educacionais, incluindo a divisão de tarefas, a jornada, os recursos materiais disponíveis e os tempos e espaços de realização do trabalho. Daí a questão que atravessa a tese: o que acontece com uma política quando os direitos que ela institui não vêm acompanhados das condições materiais e formativas para que se realizem?</w:t>
       </w:r>
     </w:p>
     <w:p>
@@ -2071,12 +2113,12 @@
         <w:pStyle w:val="Heading2"/>
       </w:pPr>
       <w:r>
-        <w:t>Slide 12 – Contribuição inédita: discricionariedade substitutiva  (0:54; acumulado 7:20)</w:t>
+        <w:t>Slide 12 – Questão norteadora e objetivos  (0:22; acumulado 12:43)</w:t>
       </w:r>
     </w:p>
     <w:p>
       <w:r>
-        <w:t>Apresento agora a principal contribuição proposta. Discricionariedade designa a margem de decisão de que dispõem os servidores que atendem diretamente a população. Michael Lipsky demonstrou que, diante de recursos escassos, esses trabalhadores racionam o serviço, decidindo quem é atendido e em que ordem. Na escola investigada, entretanto, frequentemente não há o que racionar. A decisão, nesse caso, recai sobre aquilo que não existe: a profissional pode suprir com aparelho, conexão, conhecimento ou tempo próprios uma condição anunciada pela política e não assegurada à escola. Denomino essa situação discricionariedade substitutiva. Trata-se, neste momento, de uma proposição a ser examinada, e não de um resultado.</w:t>
+        <w:t>Os três objetivos específicos correspondem aos capítulos de análise: o que a política promete e com que meios; que condições a recebem em Pipa; e o que os profissionais fazem com a distância entre a norma e essas condições.</w:t>
       </w:r>
     </w:p>
     <w:p>
@@ -2084,12 +2126,12 @@
         <w:pStyle w:val="Heading2"/>
       </w:pPr>
       <w:r>
-        <w:t>Slide 13 – Três componentes e os riscos a analisar  (0:33; acumulado 7:53)</w:t>
+        <w:t>Slide 13 – Contribuição inédita: discricionariedade substitutiva  (1:24; acumulado 14:07)</w:t>
       </w:r>
     </w:p>
     <w:p>
       <w:r>
-        <w:t>A categoria é composta por três elementos que devem ocorrer simultaneamente: a ausência de recurso a distribuir, a substituição com meios próprios e o custo pessoal assumido diante de crianças e famílias com as quais a profissional convive no território. Entre os riscos a analisar, destaca-se o de que a substituição oculte a falta dos meios, fazendo a política parecer em curso.</w:t>
+        <w:t>Apresento agora a principal contribuição proposta. Começo pelo conceito de discricionariedade. No âmbito da administração pública, discricionariedade é a margem de liberdade que a lei confere à autoridade ou ao servidor público para escolher, diante de uma situação concreta, a solução mais adequada, sempre orientada pelo interesse público. Michael Lipsky trouxe essa noção para os trabalhadores que atendem diretamente a população, como professores, e mostrou que, diante de recursos escassos, eles racionam o serviço: organizam filas, revezamentos e prioridades, decidindo quem é atendido e em que ordem. Na escola investigada, entretanto, frequentemente não há o que distribuir. A decisão passa, então, a recair sobre aquilo que não existe: a profissional pode suprir com aparelho, conexão, material, conhecimento ou tempo próprios uma condição anunciada pela política e não assegurada à escola. Mudam o objeto da decisão e quem arca com o seu custo. Denomino essa situação discricionariedade substitutiva. Trata-se, neste momento, de uma proposição a ser examinada nas entrevistas, e não de um resultado.</w:t>
       </w:r>
     </w:p>
     <w:p>
@@ -2097,12 +2139,12 @@
         <w:pStyle w:val="Heading2"/>
       </w:pPr>
       <w:r>
-        <w:t>Slide 14 – Três formulações, dois estatutos  (0:20; acumulado 8:13)</w:t>
+        <w:t>Slide 14 – Três componentes e os riscos a analisar  (0:20; acumulado 14:27)</w:t>
       </w:r>
     </w:p>
     <w:p>
       <w:r>
-        <w:t>A tese opera com três formulações de estatutos distintos. O habitar digital e a rugosidade tecnológica constituem condições já documentadas no Capítulo 6. A discricionariedade substitutiva, por sua vez, é uma hipótese, a ser examinada nas entrevistas.</w:t>
+        <w:t>A categoria exige três componentes simultâneos: ausência de recurso a distribuir, substituição com meios próprios e custo pessoal assumido diante das famílias. Entre os riscos, destaca-se o de a substituição ocultar a falta dos meios.</w:t>
       </w:r>
     </w:p>
     <w:p>
@@ -2110,12 +2152,12 @@
         <w:pStyle w:val="Heading2"/>
       </w:pPr>
       <w:r>
-        <w:t>Slide 15 – Onde os referenciais deixam de cobrir o caso  (0:29; acumulado 8:42)</w:t>
+        <w:t>Slide 15 – Três formulações, dois estatutos  (0:10; acumulado 14:37)</w:t>
       </w:r>
     </w:p>
     <w:p>
       <w:r>
-        <w:t>A proposição de uma nova categoria justifica-se pelo limite dos referenciais. A Abordagem do Ciclo de Políticas e a teoria de Lipsky pressupõem que os meios existam, ainda que de forma escassa. Em Pipa, não há dispositivos a racionar, e a decisão é tomada diante de famílias que a profissional reencontra fora da escola.</w:t>
+        <w:t>Habitar digital e rugosidade tecnológica são condições já documentadas; a discricionariedade substitutiva é hipótese a examinar.</w:t>
       </w:r>
     </w:p>
     <w:p>
@@ -2123,12 +2165,12 @@
         <w:pStyle w:val="Heading2"/>
       </w:pPr>
       <w:r>
-        <w:t>Slide 16 – O motor teórico: duas engrenagens e o fosso entre elas  (1:05; acumulado 9:47)</w:t>
+        <w:t>Slide 16 – Onde os referenciais deixam de cobrir o caso  (0:10; acumulado 14:47)</w:t>
       </w:r>
     </w:p>
     <w:p>
       <w:r>
-        <w:t>O quadro teórico pode ser representado por duas engrenagens. A primeira é a Abordagem do Ciclo de Políticas, formulada por Bowe, Ball e Gold e sistematizada no Brasil por Mainardes, segundo a qual a política não é simplesmente aplicada, mas interpretada e recriada no contexto da prática. A segunda é a teoria da burocracia de nível de rua, de Lipsky, que demonstra que as decisões cotidianas dos trabalhadores acabam por constituir a política efetivamente realizada. O ponto de encaixe entre ambas é a recontextualização, entendida como o processo pelo qual a política adquire sentidos particulares em cada lugar. Permanece, contudo, um fosso: nenhuma das duas abordagens nomeia a decisão sobre o que não chegou à escola. É nesse ponto que se situa a contribuição da tese.</w:t>
+        <w:t>Os referenciais pressupõem que os meios existam, ainda que escassos; em Pipa, não há dispositivos a racionar.</w:t>
       </w:r>
     </w:p>
     <w:p>
@@ -2136,12 +2178,12 @@
         <w:pStyle w:val="Heading2"/>
       </w:pPr>
       <w:r>
-        <w:t>Slide 17 – Como a categoria pode falhar  (0:28; acumulado 10:15)</w:t>
+        <w:t>Slide 17 – O motor teórico: duas engrenagens e o fosso entre elas  (0:28; acumulado 15:15)</w:t>
       </w:r>
     </w:p>
     <w:p>
       <w:r>
-        <w:t>Para que a hipótese seja verificável, registrei previamente, antes da primeira entrevista, as condições de confirmação, delimitação, renomeação e recusa da categoria. Caso, por exemplo, as narrativas descrevam revezamento no uso do kit multimídia, estaremos diante da discricionariedade alocativa descrita por Lipsky. A recusa da categoria também constituirá um resultado legítimo da pesquisa.</w:t>
+        <w:t>O quadro teórico articula duas engrenagens: o Ciclo de Políticas, segundo o qual a política é recriada no contexto da prática, e Lipsky, para quem as decisões na ponta constituem a política realizada. O encaixe é a recontextualização; o fosso é a decisão sobre o que não chegou, onde se situa a contribuição.</w:t>
       </w:r>
     </w:p>
     <w:p>
@@ -2149,12 +2191,12 @@
         <w:pStyle w:val="Heading2"/>
       </w:pPr>
       <w:r>
-        <w:t>Slide 18 – Ética, posição e reflexividade  (0:18; acumulado 10:33)</w:t>
+        <w:t>Slide 18 – Como a categoria pode falhar  (0:12; acumulado 15:27)</w:t>
       </w:r>
     </w:p>
     <w:p>
       <w:r>
-        <w:t>No plano ético, a pesquisa observa as Resoluções nº 466 e nº 510 do Conselho Nacional de Saúde, adota pseudônimos escolhidos pelos participantes e não utiliza imagens com rostos de crianças.</w:t>
+        <w:t>Os critérios de confirmação, delimitação, renomeação e recusa foram registrados antes do campo. A recusa da categoria também será resultado.</w:t>
       </w:r>
     </w:p>
     <w:p>
@@ -2162,12 +2204,12 @@
         <w:pStyle w:val="Heading2"/>
       </w:pPr>
       <w:r>
-        <w:t>Slide 19 – A tessitura: os fios que sustentam a tese  (0:15; acumulado 10:48)</w:t>
+        <w:t>Slide 19 – Ética, posição e reflexividade  (0:14; acumulado 15:41)</w:t>
       </w:r>
     </w:p>
     <w:p>
       <w:r>
-        <w:t>Este quadro apresenta as frentes teóricas da tese e os capítulos em que cada uma é mobilizada, articulando política, território, cultura, condições de trabalho e método.</w:t>
+        <w:t>A pesquisa segue as Resoluções nº 466 e nº 510 do Conselho Nacional de Saúde, com pseudônimos e sem imagens de rostos de crianças.</w:t>
       </w:r>
     </w:p>
     <w:p>
@@ -2175,7 +2217,20 @@
         <w:pStyle w:val="Heading2"/>
       </w:pPr>
       <w:r>
-        <w:t>Slide 20 – Parte II – Revisão sistemática  (0:07; acumulado 10:55)</w:t>
+        <w:t>Slide 20 – A tessitura: os fios que sustentam a tese  (0:10; acumulado 15:51)</w:t>
+      </w:r>
+    </w:p>
+    <w:p>
+      <w:r>
+        <w:t>Este quadro mostra as frentes teóricas e os capítulos em que cada uma é mobilizada.</w:t>
+      </w:r>
+    </w:p>
+    <w:p>
+      <w:pPr>
+        <w:pStyle w:val="Heading2"/>
+      </w:pPr>
+      <w:r>
+        <w:t>Slide 21 – Parte II – Revisão sistemática  (0:07; acumulado 15:58)</w:t>
       </w:r>
     </w:p>
     <w:p>
@@ -2188,12 +2243,12 @@
         <w:pStyle w:val="Heading2"/>
       </w:pPr>
       <w:r>
-        <w:t>Slide 21 – A RSL: questão norteadora e resposta  (0:53; acumulado 11:48)</w:t>
+        <w:t>Slide 22 – A RSL: questão norteadora e resposta  (0:30; acumulado 16:28)</w:t>
       </w:r>
     </w:p>
     <w:p>
       <w:r>
-        <w:t>A revisão sistemática é um procedimento de busca e seleção com critérios explícitos e registrados, que permite a outro pesquisador reproduzir o percurso. Seguindo a declaração PRISMA 2020, foram consultadas sete bases, e, dos 176 registros identificados, nove estudos compuseram o corpus final. Os resultados indicam que a implementação dessas políticas depende da articulação entre recursos, condições institucionais e trabalho dos profissionais. Mais relevante, porém, é o que a literatura não examina: nenhum estudo trata da PNED, apenas um delimita o ciclo de alfabetização, e nenhum investiga redes municipais de pequeno porte. É nesse conjunto de lacunas que a tese se inscreve.</w:t>
+        <w:t>A revisão sistemática seguiu a declaração PRISMA 2020 em sete bases e reuniu nove estudos. Eles indicam que essas políticas dependem de recursos, condições institucionais e trabalho dos profissionais; nenhum, porém, trata da PNED ou de redes municipais de pequeno porte, e só um delimita a alfabetização. É nessas lacunas que a tese se inscreve.</w:t>
       </w:r>
     </w:p>
     <w:p>
@@ -2201,7 +2256,7 @@
         <w:pStyle w:val="Heading2"/>
       </w:pPr>
       <w:r>
-        <w:t>Slide 22 – Parte III – Metodologia  (0:05; acumulado 11:53)</w:t>
+        <w:t>Slide 23 – Parte III – Metodologia  (0:05; acumulado 16:33)</w:t>
       </w:r>
     </w:p>
     <w:p>
@@ -2214,12 +2269,12 @@
         <w:pStyle w:val="Heading2"/>
       </w:pPr>
       <w:r>
-        <w:t>Slide 23 – Desenho: estudo de caso único, qualitativo  (0:31; acumulado 12:24)</w:t>
+        <w:t>Slide 24 – Desenho: estudo de caso único, qualitativo  (0:16; acumulado 16:49)</w:t>
       </w:r>
     </w:p>
     <w:p>
       <w:r>
-        <w:t>Trata-se de um estudo de caso único, de abordagem qualitativa, cujo interesse recai sobre os sentidos e as decisões, e não sobre a mensuração. São mobilizadas quatro fontes: o registro iconográfico, já realizado; a análise documental; o questionário de perfil; e as entrevistas semiestruturadas, que serão aplicadas após a aprovação da emenda pelo Comitê de Ética em Pesquisa.</w:t>
+        <w:t>Trata-se de um estudo de caso único e qualitativo, com quatro fontes: registro iconográfico, já realizado, documentos, questionário e entrevistas, estes após a emenda ao Comitê de Ética.</w:t>
       </w:r>
     </w:p>
     <w:p>
@@ -2227,12 +2282,12 @@
         <w:pStyle w:val="Heading2"/>
       </w:pPr>
       <w:r>
-        <w:t>Slide 24 – Quem será ouvido  (0:28; acumulado 12:52)</w:t>
+        <w:t>Slide 25 – Quem será ouvido  (0:11; acumulado 17:00)</w:t>
       </w:r>
     </w:p>
     <w:p>
       <w:r>
-        <w:t>Participarão doze profissionais da educação: seis professoras regentes de 1º e 2º anos, quatro integrantes da coordenação pedagógica, uma pessoa da direção e uma da Secretaria Municipal de Educação. A escolha de posições diferentes decorre do fato de que cada uma recebe a política com margens de decisão e responsabilidades próprias.</w:t>
+        <w:t>Serão ouvidos doze profissionais: seis professoras regentes, quatro da coordenação, uma pessoa da direção e uma da Secretaria.</w:t>
       </w:r>
     </w:p>
     <w:p>
@@ -2240,7 +2295,7 @@
         <w:pStyle w:val="Heading2"/>
       </w:pPr>
       <w:r>
-        <w:t>Slide 25 – Parte IV – Agenda internacional e PNED  (0:07; acumulado 12:59)</w:t>
+        <w:t>Slide 26 – Parte IV – Agenda internacional e PNED  (0:07; acumulado 17:07)</w:t>
       </w:r>
     </w:p>
     <w:p>
@@ -2253,12 +2308,12 @@
         <w:pStyle w:val="Heading2"/>
       </w:pPr>
       <w:r>
-        <w:t>Slide 26 – A agenda internacional: das presenças às condições  (0:41; acumulado 13:40)</w:t>
+        <w:t>Slide 27 – A agenda internacional: das presenças às condições  (0:13; acumulado 17:20)</w:t>
       </w:r>
     </w:p>
     <w:p>
       <w:r>
-        <w:t>A análise iniciou-se pelos organismos internacionais. A UNESCO registra que uma em cada quatro escolas primárias no mundo não dispõe de eletricidade. A OCDE considera, na melhor das hipóteses, misto o impacto dos computadores sobre o desempenho dos estudantes. O Banco Mundial, por sua vez, recomenda que se defina o problema educacional antes da escolha da tecnologia. Em comum, os três documentos deslocam o foco da presença dos recursos para as condições e as finalidades de seu uso.</w:t>
+        <w:t>UNESCO, OCDE e Banco Mundial convergem ao deslocar o foco da presença dos recursos para as condições e finalidades de seu uso.</w:t>
       </w:r>
     </w:p>
     <w:p>
@@ -2266,12 +2321,12 @@
         <w:pStyle w:val="Heading2"/>
       </w:pPr>
       <w:r>
-        <w:t>Slide 27 – Mapa das políticas de educação digital  (0:16; acumulado 13:56)</w:t>
+        <w:t>Slide 28 – Mapa das políticas de educação digital  (0:10; acumulado 17:30)</w:t>
       </w:r>
     </w:p>
     <w:p>
       <w:r>
-        <w:t>Em seguida, foram analisadas dezenove experiências na Europa e nas Américas. O propósito não foi identificar modelos a serem importados, mas construir lentes de leitura para o caso brasileiro.</w:t>
+        <w:t>Foram analisadas dezenove experiências na Europa e nas Américas, como lentes de leitura, e não como modelos.</w:t>
       </w:r>
     </w:p>
     <w:p>
@@ -2279,12 +2334,12 @@
         <w:pStyle w:val="Heading2"/>
       </w:pPr>
       <w:r>
-        <w:t>Slide 28 – O que essas experiências trazem para a tese  (0:24; acumulado 14:20)</w:t>
+        <w:t>Slide 29 – O que essas experiências trazem para a tese  (0:08; acumulado 17:38)</w:t>
       </w:r>
     </w:p>
     <w:p>
       <w:r>
-        <w:t>Dessa comparação resultaram cinco categorias sensibilizadoras: governança, formação, infraestrutura, continuidade institucional e cultura digital. O caso peruano, por exemplo, demonstra que a distribuição de computadores não produziu, por si só, ganhos de aprendizagem. Cada categoria converte-se em uma questão a ser examinada no campo.</w:t>
+        <w:t>Delas resultaram cinco categorias sensibilizadoras: governança, formação, infraestrutura, continuidade institucional e cultura digital.</w:t>
       </w:r>
     </w:p>
     <w:p>
@@ -2292,12 +2347,12 @@
         <w:pStyle w:val="Heading2"/>
       </w:pPr>
       <w:r>
-        <w:t>Slide 29 – Quatro décadas até a PNED  (0:19; acumulado 14:39)</w:t>
+        <w:t>Slide 30 – Quatro décadas até a PNED  (0:09; acumulado 17:47)</w:t>
       </w:r>
     </w:p>
     <w:p>
       <w:r>
-        <w:t>No Brasil, as políticas de tecnologia educacional percorreram quatro décadas, do EDUCOM, nos anos 1980, ao ProInfo, ao PROUCA e às iniciativas de conectividade. Repetem-se, nesse percurso, problemas de manutenção e reposição de equipamentos.</w:t>
+        <w:t>No Brasil, do EDUCOM à PNED, repetem-se problemas de manutenção e reposição de equipamentos.</w:t>
       </w:r>
     </w:p>
     <w:p>
@@ -2305,12 +2360,12 @@
         <w:pStyle w:val="Heading2"/>
       </w:pPr>
       <w:r>
-        <w:t>Slide 30 – Por que a PNED importa  (0:24; acumulado 15:03)</w:t>
+        <w:t>Slide 31 – Por que a PNED importa  (0:13; acumulado 18:00)</w:t>
       </w:r>
     </w:p>
     <w:p>
       <w:r>
-        <w:t>É necessário reconhecer os méritos da PNED: a lei articula ações antes dispersas, inscreve a educação digital entre os deveres do Estado e associa-a aos direitos das crianças, determinando que as tecnologias fortaleçam, e não substituam, o papel de quem ensina e de quem aprende.</w:t>
+        <w:t>A PNED tem méritos: articula ações dispersas e inscreve a educação digital entre os deveres do Estado e os direitos das crianças.</w:t>
       </w:r>
     </w:p>
     <w:p>
@@ -2318,12 +2373,12 @@
         <w:pStyle w:val="Heading2"/>
       </w:pPr>
       <w:r>
-        <w:t>Slide 31 – A PNED e o calendário da exigência  (0:31; acumulado 15:34)</w:t>
+        <w:t>Slide 32 – A PNED e o calendário da exigência  (0:12; acumulado 18:12)</w:t>
       </w:r>
     </w:p>
     <w:p>
       <w:r>
-        <w:t>O calendário normativo evidencia a urgência da exigência. Em janeiro de 2023, o dispositivo que tornava a educação digital obrigatória foi vetado; em dezembro, o veto foi derrubado pelo Congresso. Em 2025, o Conselho Nacional de Educação determinou a elaboração dos novos currículos, cuja implementação tornou-se obrigatória em 2026, precisamente o período em que se realiza esta pesquisa.</w:t>
+        <w:t>Vetada em janeiro de 2023 e restabelecida em dezembro, a obrigatoriedade curricular passou a valer em 2026, período desta pesquisa.</w:t>
       </w:r>
     </w:p>
     <w:p>
@@ -2331,12 +2386,12 @@
         <w:pStyle w:val="Heading2"/>
       </w:pPr>
       <w:r>
-        <w:t>Slide 32 – A promessa e o desenho  (0:38; acumulado 16:12)</w:t>
+        <w:t>Slide 33 – A promessa e o desenho  (0:20; acumulado 18:32)</w:t>
       </w:r>
     </w:p>
     <w:p>
       <w:r>
-        <w:t>Este é o principal achado da análise do texto legal. A PNED define-se como instância de articulação e não institui fundo próprio de financiamento. A conectividade das escolas está condicionada aos limites orçamentários de cada ente, e a formação de professores figura apenas como ação de promoção, sem definição de responsáveis, prazos ou custeio. Denomino esse desenho vazio material: a exigência curricular possui data definida, mas os meios para cumpri-la não.</w:t>
+        <w:t>O principal achado da análise legal é o vazio material: a lei não cria fundo próprio, condiciona a conectividade ao orçamento de cada ente e trata a formação como promoção. A exigência tem data; os meios, não.</w:t>
       </w:r>
     </w:p>
     <w:p>
@@ -2344,7 +2399,7 @@
         <w:pStyle w:val="Heading2"/>
       </w:pPr>
       <w:r>
-        <w:t>Slide 33 – Parte V – O território e a escola  (0:06; acumulado 16:18)</w:t>
+        <w:t>Slide 34 – Parte V – O território e a escola  (0:06; acumulado 18:38)</w:t>
       </w:r>
     </w:p>
     <w:p>
@@ -2357,12 +2412,12 @@
         <w:pStyle w:val="Heading2"/>
       </w:pPr>
       <w:r>
-        <w:t>Slide 34 – A antiga Pipa: trabalho, moradia e mar  (0:24; acumulado 16:42)</w:t>
+        <w:t>Slide 35 – A antiga Pipa: trabalho, moradia e mar  (0:12; acumulado 18:50)</w:t>
       </w:r>
     </w:p>
     <w:p>
       <w:r>
-        <w:t>As imagens do Museu Digital de Pipa registram uma organização territorial em que trabalho, moradia e atividade marítima estavam espacialmente próximos. Para interpretá-las, recorro a Milton Santos e à noção de território usado, que compreende o espaço a partir das práticas sociais nele desenvolvidas.</w:t>
+        <w:t>As imagens históricas mostram trabalho, moradia e mar próximos, lidos com a noção de território usado, de Milton Santos.</w:t>
       </w:r>
     </w:p>
     <w:p>
@@ -2370,12 +2425,12 @@
         <w:pStyle w:val="Heading2"/>
       </w:pPr>
       <w:r>
-        <w:t>Slide 35 – As transformações: de vila a polo turístico  (0:21; acumulado 17:03)</w:t>
+        <w:t>Slide 36 – As transformações: de vila a polo turístico  (0:10; acumulado 19:00)</w:t>
       </w:r>
     </w:p>
     <w:p>
       <w:r>
-        <w:t>A partir da década de 1990, com o turismo associado ao surfe, Pipa tornou-se um destino de projeção internacional, recebendo investimentos e trabalhadores de outras regiões. Essas transformações, contudo, não apagaram as formas anteriores de uso do território.</w:t>
+        <w:t>Com o turismo, a partir dos anos 1990, Pipa transformou-se, sem que as formas anteriores desaparecessem.</w:t>
       </w:r>
     </w:p>
     <w:p>
@@ -2383,12 +2438,12 @@
         <w:pStyle w:val="Heading2"/>
       </w:pPr>
       <w:r>
-        <w:t>Slide 36 – A Pipa de hoje: um território conectado  (0:47; acumulado 17:50)</w:t>
+        <w:t>Slide 37 – A Pipa de hoje: um território conectado  (0:26; acumulado 19:26)</w:t>
       </w:r>
     </w:p>
     <w:p>
       <w:r>
-        <w:t>O registro atual que apresento demonstra essa coexistência. Trata-se de um pescador descarregando o pescado na enseada, tendo ao fundo lanchas e escunas de passeio. A pesca não foi substituída pelo turismo; ambas as atividades compartilham o mesmo espaço marítimo. A própria embarcação expressa essa sobreposição, pois é de madeira e dispõe de motor de popa. Para a escola, isso significa atender crianças cujas famílias mantêm relações muito distintas com o mar, com o trabalho e com as tecnologias. Denomino habitar digital essa distribuição desigual das tecnologias no mesmo território.</w:t>
+        <w:t>O registro atual demonstra essa coexistência: um pescador descarrega o pescado na enseada, com lanchas e escunas ao fundo, em barco de madeira com motor de popa. Para a escola, isso significa crianças com relações distintas com o mar, o trabalho e as tecnologias, o que denomino habitar digital.</w:t>
       </w:r>
     </w:p>
     <w:p>
@@ -2396,12 +2451,12 @@
         <w:pStyle w:val="Heading2"/>
       </w:pPr>
       <w:r>
-        <w:t>Slide 37 – A escola não se resume ao que falta  (0:15; acumulado 18:05)</w:t>
+        <w:t>Slide 38 – A escola não se resume ao que falta  (0:10; acumulado 19:36)</w:t>
       </w:r>
     </w:p>
     <w:p>
       <w:r>
-        <w:t>Cabe registrar que a escola não se define apenas pela ausência: ela dispõe de recursos de acessibilidade e de um parque integrado à vegetação de restinga.</w:t>
+        <w:t>A escola não se define pela ausência: dispõe de acessibilidade e de um parque na restinga.</w:t>
       </w:r>
     </w:p>
     <w:p>
@@ -2409,12 +2464,12 @@
         <w:pStyle w:val="Heading2"/>
       </w:pPr>
       <w:r>
-        <w:t>Slide 38 – Na escola: o que existe e onde está  (0:34; acumulado 18:39)</w:t>
+        <w:t>Slide 39 – Na escola: o que existe e onde está  (0:16; acumulado 19:52)</w:t>
       </w:r>
     </w:p>
     <w:p>
       <w:r>
-        <w:t>Quanto aos recursos digitais, contudo, o quadro é distinto. O laboratório, que, segundo informações preliminares, foi montado pela Prefeitura em 2022, apresentava os computadores desligados no momento do registro; haveria um único kit multimídia para toda a escola; e as salas de 1º e 2º anos não dispunham de dispositivos digitais, predominando materiais impressos e artesanais. Essas informações serão verificadas na análise documental.</w:t>
+        <w:t>Quanto ao digital, porém, o laboratório estava desligado, haveria um só kit multimídia e as salas de 1º e 2º anos não tinham dispositivos, informações a verificar nos documentos.</w:t>
       </w:r>
     </w:p>
     <w:p>
@@ -2422,12 +2477,12 @@
         <w:pStyle w:val="Heading2"/>
       </w:pPr>
       <w:r>
-        <w:t>Slide 39 – Rugosidade tecnológica: perda ou ausência?  (0:36; acumulado 19:15)</w:t>
+        <w:t>Slide 40 – Rugosidade tecnológica: perda ou ausência?  (0:15; acumulado 20:07)</w:t>
       </w:r>
     </w:p>
     <w:p>
       <w:r>
-        <w:t>Para interpretar a situação do laboratório, recorro à noção de rugosidade, de Milton Santos, que designa as formas herdadas de períodos anteriores e que permanecem no espaço. A questão é saber se o laboratório perdeu sua função, por falta de manutenção, ou se essa função nunca chegou a constituir-se, por ausência de formação e de tempo de planejamento. Cada hipótese demanda uma resposta de política pública distinta.</w:t>
+        <w:t>Com a noção de rugosidade, pergunto se o laboratório perdeu sua função ou se ela nunca se constituiu; cada hipótese pede uma resposta de política distinta.</w:t>
       </w:r>
     </w:p>
     <w:p>
@@ -2435,12 +2490,12 @@
         <w:pStyle w:val="Heading2"/>
       </w:pPr>
       <w:r>
-        <w:t>Slide 40 – Contribuições analíticas do capítulo  (0:14; acumulado 19:29)</w:t>
+        <w:t>Slide 41 – Contribuições analíticas do capítulo  (0:10; acumulado 20:17)</w:t>
       </w:r>
     </w:p>
     <w:p>
       <w:r>
-        <w:t>Em síntese, o capítulo propõe compreender a escola como ponto de uma rede territorial e reconhecer a atuação dos profissionais sem romantizar o improviso.</w:t>
+        <w:t>O capítulo propõe ler a escola como ponto de uma rede territorial, sem romantizar o improviso.</w:t>
       </w:r>
     </w:p>
     <w:p>
@@ -2448,7 +2503,7 @@
         <w:pStyle w:val="Heading2"/>
       </w:pPr>
       <w:r>
-        <w:t>Slide 41 – Parte VI – O que ainda falta  (0:06; acumulado 19:35)</w:t>
+        <w:t>Slide 42 – Parte VI – O que ainda falta  (0:06; acumulado 20:23)</w:t>
       </w:r>
     </w:p>
     <w:p>
@@ -2461,12 +2516,12 @@
         <w:pStyle w:val="Heading2"/>
       </w:pPr>
       <w:r>
-        <w:t>Slide 42 – Onde estamos e o que falta  (0:26; acumulado 20:01)</w:t>
+        <w:t>Slide 43 – Onde estamos e o que falta  (0:11; acumulado 20:34)</w:t>
       </w:r>
     </w:p>
     <w:p>
       <w:r>
-        <w:t>Antes do trabalho de campo, restam a aprovação da emenda pelo Comitê de Ética, o registro formal dos critérios da categoria e a análise documental, que inclui a aquisição do laboratório, a conectividade, os cadernos de uso e a prestação de contas do programa federal de conectividade.</w:t>
+        <w:t>Restam a emenda ao Comitê de Ética, o registro dos critérios e a análise documental, antes do campo.</w:t>
       </w:r>
     </w:p>
     <w:p>
@@ -2474,12 +2529,12 @@
         <w:pStyle w:val="Heading2"/>
       </w:pPr>
       <w:r>
-        <w:t>Slide 43 – A questão aberta / Agradecimento  (0:39; acumulado 20:40)</w:t>
+        <w:t>Slide 44 – A questão aberta / Agradecimento  (0:24; acumulado 20:58)</w:t>
       </w:r>
     </w:p>
     <w:p>
       <w:r>
-        <w:t>Concluo com a questão que orienta a tese. A política fez da educação digital um direito e deixou a provisão dos meios a cargo de cada ente federado. Quando o equipamento e a formação não chegam à escola, quem arca, no cotidiano escolar, com o custo dessa ausência? E o que isso representa para os direitos que a lei assegurou às crianças? Agradeço a atenção e coloco-me à disposição da banca para as contribuições.</w:t>
+        <w:t>Concluo com a questão que orienta a tese: quando o equipamento e a formação não chegam à escola, quem arca com o custo dessa ausência, e o que isso representa para os direitos das crianças? Agradeço a atenção e coloco-me à disposição da banca.</w:t>
       </w:r>
     </w:p>
     <w:p>
@@ -2487,7 +2542,7 @@
         <w:pStyle w:val="Heading2"/>
       </w:pPr>
       <w:r>
-        <w:t>Slide 44 – Referências  (—; acumulado —)</w:t>
+        <w:t>Slide 45 – Referências  (—; acumulado —)</w:t>
       </w:r>
     </w:p>
     <w:p>

</xml_diff>